<commit_message>
edited Project Report File
</commit_message>
<xml_diff>
--- a/SE Project Report [V] [Group - 03].docx
+++ b/SE Project Report [V] [Group - 03].docx
@@ -1,6 +1,6 @@
 
 <file path=word/document.xml><?xml version="1.0" encoding="utf-8"?>
-<w:document xmlns:wpc="http://schemas.microsoft.com/office/word/2010/wordprocessingCanvas" xmlns:cx="http://schemas.microsoft.com/office/drawing/2014/chartex" xmlns:cx1="http://schemas.microsoft.com/office/drawing/2015/9/8/chartex" xmlns:cx2="http://schemas.microsoft.com/office/drawing/2015/10/21/chartex" xmlns:cx3="http://schemas.microsoft.com/office/drawing/2016/5/9/chartex" xmlns:cx4="http://schemas.microsoft.com/office/drawing/2016/5/10/chartex" xmlns:cx5="http://schemas.microsoft.com/office/drawing/2016/5/11/chartex" xmlns:cx6="http://schemas.microsoft.com/office/drawing/2016/5/12/chartex" xmlns:cx7="http://schemas.microsoft.com/office/drawing/2016/5/13/chartex" xmlns:cx8="http://schemas.microsoft.com/office/drawing/2016/5/14/chartex" xmlns:mc="http://schemas.openxmlformats.org/markup-compatibility/2006" xmlns:aink="http://schemas.microsoft.com/office/drawing/2016/ink" xmlns:am3d="http://schemas.microsoft.com/office/drawing/2017/model3d" xmlns:o="urn:schemas-microsoft-com:office:office" xmlns:oel="http://schemas.microsoft.com/office/2019/extlst" xmlns:r="http://schemas.openxmlformats.org/officeDocument/2006/relationships" xmlns:m="http://schemas.openxmlformats.org/officeDocument/2006/math" xmlns:v="urn:schemas-microsoft-com:vml" xmlns:wp14="http://schemas.microsoft.com/office/word/2010/wordprocessingDrawing" xmlns:wp="http://schemas.openxmlformats.org/drawingml/2006/wordprocessingDrawing" xmlns:w10="urn:schemas-microsoft-com:office:word" xmlns:w="http://schemas.openxmlformats.org/wordprocessingml/2006/main" xmlns:w14="http://schemas.microsoft.com/office/word/2010/wordml" xmlns:w15="http://schemas.microsoft.com/office/word/2012/wordml" xmlns:w16cex="http://schemas.microsoft.com/office/word/2018/wordml/cex" xmlns:w16cid="http://schemas.microsoft.com/office/word/2016/wordml/cid" xmlns:w16="http://schemas.microsoft.com/office/word/2018/wordml" xmlns:w16du="http://schemas.microsoft.com/office/word/2023/wordml/word16du" xmlns:w16sdtdh="http://schemas.microsoft.com/office/word/2020/wordml/sdtdatahash" xmlns:w16sdtfl="http://schemas.microsoft.com/office/word/2024/wordml/sdtformatlock" xmlns:w16se="http://schemas.microsoft.com/office/word/2015/wordml/symex" xmlns:wpg="http://schemas.microsoft.com/office/word/2010/wordprocessingGroup" xmlns:wpi="http://schemas.microsoft.com/office/word/2010/wordprocessingInk" xmlns:wne="http://schemas.microsoft.com/office/word/2006/wordml" xmlns:wps="http://schemas.microsoft.com/office/word/2010/wordprocessingShape" mc:Ignorable="w14 w15 w16se w16cid w16 w16cex w16sdtdh w16sdtfl w16du wp14">
+<w:document xmlns:wpc="http://schemas.microsoft.com/office/word/2010/wordprocessingCanvas" xmlns:cx="http://schemas.microsoft.com/office/drawing/2014/chartex" xmlns:cx1="http://schemas.microsoft.com/office/drawing/2015/9/8/chartex" xmlns:cx2="http://schemas.microsoft.com/office/drawing/2015/10/21/chartex" xmlns:cx3="http://schemas.microsoft.com/office/drawing/2016/5/9/chartex" xmlns:cx4="http://schemas.microsoft.com/office/drawing/2016/5/10/chartex" xmlns:cx5="http://schemas.microsoft.com/office/drawing/2016/5/11/chartex" xmlns:cx6="http://schemas.microsoft.com/office/drawing/2016/5/12/chartex" xmlns:cx7="http://schemas.microsoft.com/office/drawing/2016/5/13/chartex" xmlns:cx8="http://schemas.microsoft.com/office/drawing/2016/5/14/chartex" xmlns:mc="http://schemas.openxmlformats.org/markup-compatibility/2006" xmlns:aink="http://schemas.microsoft.com/office/drawing/2016/ink" xmlns:am3d="http://schemas.microsoft.com/office/drawing/2017/model3d" xmlns:o="urn:schemas-microsoft-com:office:office" xmlns:r="http://schemas.openxmlformats.org/officeDocument/2006/relationships" xmlns:m="http://schemas.openxmlformats.org/officeDocument/2006/math" xmlns:v="urn:schemas-microsoft-com:vml" xmlns:wp14="http://schemas.microsoft.com/office/word/2010/wordprocessingDrawing" xmlns:wp="http://schemas.openxmlformats.org/drawingml/2006/wordprocessingDrawing" xmlns:w10="urn:schemas-microsoft-com:office:word" xmlns:w="http://schemas.openxmlformats.org/wordprocessingml/2006/main" xmlns:w14="http://schemas.microsoft.com/office/word/2010/wordml" xmlns:w15="http://schemas.microsoft.com/office/word/2012/wordml" xmlns:w16cid="http://schemas.microsoft.com/office/word/2016/wordml/cid" xmlns:w16se="http://schemas.microsoft.com/office/word/2015/wordml/symex" xmlns:wpg="http://schemas.microsoft.com/office/word/2010/wordprocessingGroup" xmlns:wpi="http://schemas.microsoft.com/office/word/2010/wordprocessingInk" xmlns:wne="http://schemas.microsoft.com/office/word/2006/wordml" xmlns:wps="http://schemas.microsoft.com/office/word/2010/wordprocessingShape" mc:Ignorable="w14 w15 w16se w16cid wp14">
   <w:body>
     <w:p>
       <w:pPr>
@@ -519,23 +519,43 @@
         <w:tc>
           <w:tcPr>
             <w:tcW w:w="3378" w:type="dxa"/>
+            <w:tcBorders>
+              <w:top w:val="single" w:sz="4" w:space="0" w:color="auto"/>
+              <w:left w:val="single" w:sz="4" w:space="0" w:color="auto"/>
+              <w:bottom w:val="single" w:sz="4" w:space="0" w:color="auto"/>
+              <w:right w:val="single" w:sz="4" w:space="0" w:color="auto"/>
+            </w:tcBorders>
+            <w:vAlign w:val="center"/>
           </w:tcPr>
           <w:p>
             <w:pPr>
               <w:pStyle w:val="Default"/>
               <w:jc w:val="both"/>
             </w:pPr>
+            <w:r>
+              <w:t>SHANTUNU BARUA</w:t>
+            </w:r>
           </w:p>
         </w:tc>
         <w:tc>
           <w:tcPr>
             <w:tcW w:w="3060" w:type="dxa"/>
+            <w:tcBorders>
+              <w:top w:val="single" w:sz="4" w:space="0" w:color="auto"/>
+              <w:left w:val="single" w:sz="4" w:space="0" w:color="auto"/>
+              <w:bottom w:val="single" w:sz="4" w:space="0" w:color="auto"/>
+              <w:right w:val="single" w:sz="4" w:space="0" w:color="auto"/>
+            </w:tcBorders>
+            <w:vAlign w:val="center"/>
           </w:tcPr>
           <w:p>
             <w:pPr>
               <w:pStyle w:val="Default"/>
               <w:jc w:val="both"/>
             </w:pPr>
+            <w:r>
+              <w:t>23-53712-3</w:t>
+            </w:r>
           </w:p>
         </w:tc>
       </w:tr>
@@ -560,23 +580,43 @@
         <w:tc>
           <w:tcPr>
             <w:tcW w:w="3378" w:type="dxa"/>
+            <w:tcBorders>
+              <w:top w:val="single" w:sz="4" w:space="0" w:color="auto"/>
+              <w:left w:val="single" w:sz="4" w:space="0" w:color="auto"/>
+              <w:bottom w:val="single" w:sz="4" w:space="0" w:color="auto"/>
+              <w:right w:val="single" w:sz="4" w:space="0" w:color="auto"/>
+            </w:tcBorders>
+            <w:vAlign w:val="center"/>
           </w:tcPr>
           <w:p>
             <w:pPr>
               <w:pStyle w:val="Default"/>
               <w:jc w:val="both"/>
             </w:pPr>
+            <w:r>
+              <w:t>M.SAKIB SADMAN ARIAN</w:t>
+            </w:r>
           </w:p>
         </w:tc>
         <w:tc>
           <w:tcPr>
             <w:tcW w:w="3060" w:type="dxa"/>
+            <w:tcBorders>
+              <w:top w:val="single" w:sz="4" w:space="0" w:color="auto"/>
+              <w:left w:val="single" w:sz="4" w:space="0" w:color="auto"/>
+              <w:bottom w:val="single" w:sz="4" w:space="0" w:color="auto"/>
+              <w:right w:val="single" w:sz="4" w:space="0" w:color="auto"/>
+            </w:tcBorders>
+            <w:vAlign w:val="center"/>
           </w:tcPr>
           <w:p>
             <w:pPr>
               <w:pStyle w:val="Default"/>
               <w:jc w:val="both"/>
             </w:pPr>
+            <w:r>
+              <w:t>23-54986-3</w:t>
+            </w:r>
           </w:p>
         </w:tc>
       </w:tr>
@@ -601,23 +641,43 @@
         <w:tc>
           <w:tcPr>
             <w:tcW w:w="3378" w:type="dxa"/>
+            <w:tcBorders>
+              <w:top w:val="single" w:sz="4" w:space="0" w:color="auto"/>
+              <w:left w:val="single" w:sz="4" w:space="0" w:color="auto"/>
+              <w:bottom w:val="single" w:sz="4" w:space="0" w:color="auto"/>
+              <w:right w:val="single" w:sz="4" w:space="0" w:color="auto"/>
+            </w:tcBorders>
+            <w:vAlign w:val="center"/>
           </w:tcPr>
           <w:p>
             <w:pPr>
               <w:pStyle w:val="Default"/>
               <w:jc w:val="both"/>
             </w:pPr>
+            <w:r>
+              <w:t>MD. ARAFAT RAHMAN SAMIR</w:t>
+            </w:r>
           </w:p>
         </w:tc>
         <w:tc>
           <w:tcPr>
             <w:tcW w:w="3060" w:type="dxa"/>
+            <w:tcBorders>
+              <w:top w:val="single" w:sz="4" w:space="0" w:color="auto"/>
+              <w:left w:val="single" w:sz="4" w:space="0" w:color="auto"/>
+              <w:bottom w:val="single" w:sz="4" w:space="0" w:color="auto"/>
+              <w:right w:val="single" w:sz="4" w:space="0" w:color="auto"/>
+            </w:tcBorders>
+            <w:vAlign w:val="center"/>
           </w:tcPr>
           <w:p>
             <w:pPr>
               <w:pStyle w:val="Default"/>
               <w:jc w:val="both"/>
             </w:pPr>
+            <w:r>
+              <w:t>23-55488-3</w:t>
+            </w:r>
           </w:p>
         </w:tc>
       </w:tr>
@@ -642,23 +702,43 @@
         <w:tc>
           <w:tcPr>
             <w:tcW w:w="3378" w:type="dxa"/>
+            <w:tcBorders>
+              <w:top w:val="single" w:sz="4" w:space="0" w:color="auto"/>
+              <w:left w:val="single" w:sz="4" w:space="0" w:color="auto"/>
+              <w:bottom w:val="single" w:sz="4" w:space="0" w:color="auto"/>
+              <w:right w:val="single" w:sz="4" w:space="0" w:color="auto"/>
+            </w:tcBorders>
+            <w:vAlign w:val="center"/>
           </w:tcPr>
           <w:p>
             <w:pPr>
               <w:pStyle w:val="Default"/>
               <w:jc w:val="both"/>
             </w:pPr>
+            <w:r>
+              <w:t>RAYEAN SADIK</w:t>
+            </w:r>
           </w:p>
         </w:tc>
         <w:tc>
           <w:tcPr>
             <w:tcW w:w="3060" w:type="dxa"/>
+            <w:tcBorders>
+              <w:top w:val="single" w:sz="4" w:space="0" w:color="auto"/>
+              <w:left w:val="single" w:sz="4" w:space="0" w:color="auto"/>
+              <w:bottom w:val="single" w:sz="4" w:space="0" w:color="auto"/>
+              <w:right w:val="single" w:sz="4" w:space="0" w:color="auto"/>
+            </w:tcBorders>
+            <w:vAlign w:val="center"/>
           </w:tcPr>
           <w:p>
             <w:pPr>
               <w:pStyle w:val="Default"/>
               <w:jc w:val="both"/>
             </w:pPr>
+            <w:r>
+              <w:t>23-55508-3</w:t>
+            </w:r>
           </w:p>
         </w:tc>
       </w:tr>
@@ -2332,7 +2412,7 @@
               </wp:anchor>
             </w:drawing>
           </mc:Choice>
-          <mc:Fallback>
+          <mc:Fallback xmlns:w16sdtfl="http://schemas.microsoft.com/office/word/2024/wordml/sdtformatlock" xmlns:w16sdtdh="http://schemas.microsoft.com/office/word/2020/wordml/sdtdatahash" xmlns:w16du="http://schemas.microsoft.com/office/word/2023/wordml/word16du" xmlns:w16="http://schemas.microsoft.com/office/word/2018/wordml" xmlns:w16cex="http://schemas.microsoft.com/office/word/2018/wordml/cex" xmlns:oel="http://schemas.microsoft.com/office/2019/extlst">
             <w:pict>
               <v:shape w14:anchorId="3CFE7595" id="Ink 3" o:spid="_x0000_s1026" type="#_x0000_t75" style="position:absolute;margin-left:628.95pt;margin-top:-419pt;width:21.95pt;height:151.8pt;z-index:251662336;visibility:visible;mso-wrap-style:square;mso-wrap-distance-left:9pt;mso-wrap-distance-top:0;mso-wrap-distance-right:9pt;mso-wrap-distance-bottom:0;mso-position-horizontal:absolute;mso-position-horizontal-relative:text;mso-position-vertical:absolute;mso-position-vertical-relative:text" o:gfxdata="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">
                 <v:imagedata r:id="rId16" o:title=""/>
@@ -2386,6 +2466,1020 @@
         </w:rPr>
         <w:t>Background to the Problem</w:t>
       </w:r>
+    </w:p>
+    <w:p>
+      <w:pPr>
+        <w:pStyle w:val="ListParagraph"/>
+        <w:ind w:left="360"/>
+        <w:rPr>
+          <w:rFonts w:ascii="Times New Roman" w:hAnsi="Times New Roman" w:cs="Times New Roman"/>
+          <w:b/>
+          <w:bCs/>
+          <w:sz w:val="24"/>
+          <w:szCs w:val="24"/>
+        </w:rPr>
+      </w:pPr>
+    </w:p>
+    <w:p>
+      <w:pPr>
+        <w:pStyle w:val="ListParagraph"/>
+        <w:ind w:left="360"/>
+        <w:rPr>
+          <w:rFonts w:ascii="Times New Roman" w:hAnsi="Times New Roman" w:cs="Times New Roman"/>
+          <w:b/>
+          <w:bCs/>
+          <w:sz w:val="24"/>
+          <w:szCs w:val="24"/>
+        </w:rPr>
+      </w:pPr>
+    </w:p>
+    <w:p>
+      <w:pPr>
+        <w:pStyle w:val="ListParagraph"/>
+        <w:ind w:left="360"/>
+        <w:rPr>
+          <w:rFonts w:ascii="Times New Roman" w:hAnsi="Times New Roman" w:cs="Times New Roman"/>
+          <w:b/>
+          <w:bCs/>
+          <w:sz w:val="24"/>
+          <w:szCs w:val="24"/>
+        </w:rPr>
+      </w:pPr>
+    </w:p>
+    <w:p>
+      <w:pPr>
+        <w:pStyle w:val="ListParagraph"/>
+        <w:ind w:left="360"/>
+        <w:rPr>
+          <w:rFonts w:ascii="Times New Roman" w:hAnsi="Times New Roman" w:cs="Times New Roman"/>
+          <w:b/>
+          <w:bCs/>
+          <w:sz w:val="24"/>
+          <w:szCs w:val="24"/>
+        </w:rPr>
+      </w:pPr>
+    </w:p>
+    <w:p>
+      <w:pPr>
+        <w:pStyle w:val="ListParagraph"/>
+        <w:ind w:left="360"/>
+        <w:rPr>
+          <w:rFonts w:ascii="Times New Roman" w:hAnsi="Times New Roman" w:cs="Times New Roman"/>
+          <w:b/>
+          <w:bCs/>
+          <w:sz w:val="24"/>
+          <w:szCs w:val="24"/>
+        </w:rPr>
+      </w:pPr>
+    </w:p>
+    <w:p>
+      <w:pPr>
+        <w:pStyle w:val="ListParagraph"/>
+        <w:ind w:left="360"/>
+        <w:rPr>
+          <w:rFonts w:ascii="Times New Roman" w:hAnsi="Times New Roman" w:cs="Times New Roman"/>
+          <w:b/>
+          <w:bCs/>
+          <w:sz w:val="24"/>
+          <w:szCs w:val="24"/>
+        </w:rPr>
+      </w:pPr>
+    </w:p>
+    <w:p>
+      <w:pPr>
+        <w:pStyle w:val="ListParagraph"/>
+        <w:ind w:left="360"/>
+        <w:rPr>
+          <w:rFonts w:ascii="Times New Roman" w:hAnsi="Times New Roman" w:cs="Times New Roman"/>
+          <w:b/>
+          <w:bCs/>
+          <w:sz w:val="24"/>
+          <w:szCs w:val="24"/>
+        </w:rPr>
+      </w:pPr>
+    </w:p>
+    <w:p>
+      <w:pPr>
+        <w:pStyle w:val="ListParagraph"/>
+        <w:ind w:left="360"/>
+        <w:rPr>
+          <w:rFonts w:ascii="Times New Roman" w:hAnsi="Times New Roman" w:cs="Times New Roman"/>
+          <w:b/>
+          <w:bCs/>
+          <w:sz w:val="24"/>
+          <w:szCs w:val="24"/>
+        </w:rPr>
+      </w:pPr>
+    </w:p>
+    <w:p>
+      <w:pPr>
+        <w:pStyle w:val="ListParagraph"/>
+        <w:ind w:left="360"/>
+        <w:rPr>
+          <w:rFonts w:ascii="Times New Roman" w:hAnsi="Times New Roman" w:cs="Times New Roman"/>
+          <w:b/>
+          <w:bCs/>
+          <w:sz w:val="24"/>
+          <w:szCs w:val="24"/>
+        </w:rPr>
+      </w:pPr>
+    </w:p>
+    <w:p>
+      <w:pPr>
+        <w:pStyle w:val="ListParagraph"/>
+        <w:ind w:left="360"/>
+        <w:rPr>
+          <w:rFonts w:ascii="Times New Roman" w:hAnsi="Times New Roman" w:cs="Times New Roman"/>
+          <w:b/>
+          <w:bCs/>
+          <w:sz w:val="24"/>
+          <w:szCs w:val="24"/>
+        </w:rPr>
+      </w:pPr>
+    </w:p>
+    <w:p>
+      <w:pPr>
+        <w:pStyle w:val="ListParagraph"/>
+        <w:ind w:left="360"/>
+        <w:rPr>
+          <w:rFonts w:ascii="Times New Roman" w:hAnsi="Times New Roman" w:cs="Times New Roman"/>
+          <w:b/>
+          <w:bCs/>
+          <w:sz w:val="24"/>
+          <w:szCs w:val="24"/>
+        </w:rPr>
+      </w:pPr>
+    </w:p>
+    <w:p>
+      <w:pPr>
+        <w:pStyle w:val="ListParagraph"/>
+        <w:ind w:left="360"/>
+        <w:rPr>
+          <w:rFonts w:ascii="Times New Roman" w:hAnsi="Times New Roman" w:cs="Times New Roman"/>
+          <w:b/>
+          <w:bCs/>
+          <w:sz w:val="24"/>
+          <w:szCs w:val="24"/>
+        </w:rPr>
+      </w:pPr>
+    </w:p>
+    <w:p>
+      <w:pPr>
+        <w:pStyle w:val="ListParagraph"/>
+        <w:ind w:left="360"/>
+        <w:rPr>
+          <w:rFonts w:ascii="Times New Roman" w:hAnsi="Times New Roman" w:cs="Times New Roman"/>
+          <w:b/>
+          <w:bCs/>
+          <w:sz w:val="24"/>
+          <w:szCs w:val="24"/>
+        </w:rPr>
+      </w:pPr>
+    </w:p>
+    <w:p>
+      <w:pPr>
+        <w:pStyle w:val="ListParagraph"/>
+        <w:ind w:left="360"/>
+        <w:rPr>
+          <w:rFonts w:ascii="Times New Roman" w:hAnsi="Times New Roman" w:cs="Times New Roman"/>
+          <w:b/>
+          <w:bCs/>
+          <w:sz w:val="24"/>
+          <w:szCs w:val="24"/>
+        </w:rPr>
+      </w:pPr>
+    </w:p>
+    <w:p>
+      <w:pPr>
+        <w:pStyle w:val="ListParagraph"/>
+        <w:ind w:left="360"/>
+        <w:rPr>
+          <w:rFonts w:ascii="Times New Roman" w:hAnsi="Times New Roman" w:cs="Times New Roman"/>
+          <w:b/>
+          <w:bCs/>
+          <w:sz w:val="24"/>
+          <w:szCs w:val="24"/>
+        </w:rPr>
+      </w:pPr>
+    </w:p>
+    <w:p>
+      <w:pPr>
+        <w:pStyle w:val="ListParagraph"/>
+        <w:ind w:left="360"/>
+        <w:rPr>
+          <w:rFonts w:ascii="Times New Roman" w:hAnsi="Times New Roman" w:cs="Times New Roman"/>
+          <w:b/>
+          <w:bCs/>
+          <w:sz w:val="24"/>
+          <w:szCs w:val="24"/>
+        </w:rPr>
+      </w:pPr>
+    </w:p>
+    <w:p>
+      <w:pPr>
+        <w:pStyle w:val="ListParagraph"/>
+        <w:ind w:left="360"/>
+        <w:rPr>
+          <w:rFonts w:ascii="Times New Roman" w:hAnsi="Times New Roman" w:cs="Times New Roman"/>
+          <w:b/>
+          <w:bCs/>
+          <w:sz w:val="24"/>
+          <w:szCs w:val="24"/>
+        </w:rPr>
+      </w:pPr>
+    </w:p>
+    <w:p>
+      <w:pPr>
+        <w:pStyle w:val="ListParagraph"/>
+        <w:ind w:left="360"/>
+        <w:rPr>
+          <w:rFonts w:ascii="Times New Roman" w:hAnsi="Times New Roman" w:cs="Times New Roman"/>
+          <w:b/>
+          <w:bCs/>
+          <w:sz w:val="24"/>
+          <w:szCs w:val="24"/>
+        </w:rPr>
+      </w:pPr>
+    </w:p>
+    <w:p>
+      <w:pPr>
+        <w:pStyle w:val="ListParagraph"/>
+        <w:ind w:left="360"/>
+        <w:rPr>
+          <w:rFonts w:ascii="Times New Roman" w:hAnsi="Times New Roman" w:cs="Times New Roman"/>
+          <w:b/>
+          <w:bCs/>
+          <w:sz w:val="24"/>
+          <w:szCs w:val="24"/>
+        </w:rPr>
+      </w:pPr>
+    </w:p>
+    <w:p>
+      <w:pPr>
+        <w:pStyle w:val="ListParagraph"/>
+        <w:ind w:left="360"/>
+        <w:rPr>
+          <w:rFonts w:ascii="Times New Roman" w:hAnsi="Times New Roman" w:cs="Times New Roman"/>
+          <w:b/>
+          <w:bCs/>
+          <w:sz w:val="24"/>
+          <w:szCs w:val="24"/>
+        </w:rPr>
+      </w:pPr>
+    </w:p>
+    <w:p>
+      <w:pPr>
+        <w:pStyle w:val="ListParagraph"/>
+        <w:ind w:left="360"/>
+        <w:rPr>
+          <w:rFonts w:ascii="Times New Roman" w:hAnsi="Times New Roman" w:cs="Times New Roman"/>
+          <w:b/>
+          <w:bCs/>
+          <w:sz w:val="24"/>
+          <w:szCs w:val="24"/>
+        </w:rPr>
+      </w:pPr>
+    </w:p>
+    <w:p>
+      <w:pPr>
+        <w:pStyle w:val="ListParagraph"/>
+        <w:ind w:left="360"/>
+        <w:rPr>
+          <w:rFonts w:ascii="Times New Roman" w:hAnsi="Times New Roman" w:cs="Times New Roman"/>
+          <w:b/>
+          <w:bCs/>
+          <w:sz w:val="24"/>
+          <w:szCs w:val="24"/>
+        </w:rPr>
+      </w:pPr>
+    </w:p>
+    <w:p>
+      <w:pPr>
+        <w:pStyle w:val="ListParagraph"/>
+        <w:ind w:left="360"/>
+        <w:rPr>
+          <w:rFonts w:ascii="Times New Roman" w:hAnsi="Times New Roman" w:cs="Times New Roman"/>
+          <w:b/>
+          <w:bCs/>
+          <w:sz w:val="24"/>
+          <w:szCs w:val="24"/>
+        </w:rPr>
+      </w:pPr>
+    </w:p>
+    <w:p>
+      <w:pPr>
+        <w:pStyle w:val="ListParagraph"/>
+        <w:ind w:left="360"/>
+        <w:rPr>
+          <w:rFonts w:ascii="Times New Roman" w:hAnsi="Times New Roman" w:cs="Times New Roman"/>
+          <w:b/>
+          <w:bCs/>
+          <w:sz w:val="24"/>
+          <w:szCs w:val="24"/>
+        </w:rPr>
+      </w:pPr>
+    </w:p>
+    <w:p>
+      <w:pPr>
+        <w:pStyle w:val="ListParagraph"/>
+        <w:ind w:left="360"/>
+        <w:rPr>
+          <w:rFonts w:ascii="Times New Roman" w:hAnsi="Times New Roman" w:cs="Times New Roman"/>
+          <w:b/>
+          <w:bCs/>
+          <w:sz w:val="24"/>
+          <w:szCs w:val="24"/>
+        </w:rPr>
+      </w:pPr>
+    </w:p>
+    <w:p>
+      <w:pPr>
+        <w:pStyle w:val="ListParagraph"/>
+        <w:ind w:left="360"/>
+        <w:rPr>
+          <w:rFonts w:ascii="Times New Roman" w:hAnsi="Times New Roman" w:cs="Times New Roman"/>
+          <w:b/>
+          <w:bCs/>
+          <w:sz w:val="24"/>
+          <w:szCs w:val="24"/>
+        </w:rPr>
+      </w:pPr>
+    </w:p>
+    <w:p>
+      <w:pPr>
+        <w:pStyle w:val="ListParagraph"/>
+        <w:ind w:left="360"/>
+        <w:rPr>
+          <w:rFonts w:ascii="Times New Roman" w:hAnsi="Times New Roman" w:cs="Times New Roman"/>
+          <w:b/>
+          <w:bCs/>
+          <w:sz w:val="24"/>
+          <w:szCs w:val="24"/>
+        </w:rPr>
+      </w:pPr>
+    </w:p>
+    <w:p>
+      <w:pPr>
+        <w:pStyle w:val="ListParagraph"/>
+        <w:ind w:left="360"/>
+        <w:rPr>
+          <w:rFonts w:ascii="Times New Roman" w:hAnsi="Times New Roman" w:cs="Times New Roman"/>
+          <w:b/>
+          <w:bCs/>
+          <w:sz w:val="24"/>
+          <w:szCs w:val="24"/>
+        </w:rPr>
+      </w:pPr>
+    </w:p>
+    <w:p>
+      <w:pPr>
+        <w:pStyle w:val="ListParagraph"/>
+        <w:ind w:left="360"/>
+        <w:rPr>
+          <w:rFonts w:ascii="Times New Roman" w:hAnsi="Times New Roman" w:cs="Times New Roman"/>
+          <w:b/>
+          <w:bCs/>
+          <w:sz w:val="24"/>
+          <w:szCs w:val="24"/>
+        </w:rPr>
+      </w:pPr>
+    </w:p>
+    <w:p>
+      <w:pPr>
+        <w:pStyle w:val="ListParagraph"/>
+        <w:ind w:left="360"/>
+        <w:rPr>
+          <w:rFonts w:ascii="Times New Roman" w:hAnsi="Times New Roman" w:cs="Times New Roman"/>
+          <w:b/>
+          <w:bCs/>
+          <w:sz w:val="24"/>
+          <w:szCs w:val="24"/>
+        </w:rPr>
+      </w:pPr>
+    </w:p>
+    <w:p>
+      <w:pPr>
+        <w:pStyle w:val="ListParagraph"/>
+        <w:ind w:left="360"/>
+        <w:rPr>
+          <w:rFonts w:ascii="Times New Roman" w:hAnsi="Times New Roman" w:cs="Times New Roman"/>
+          <w:b/>
+          <w:bCs/>
+          <w:sz w:val="24"/>
+          <w:szCs w:val="24"/>
+        </w:rPr>
+      </w:pPr>
+    </w:p>
+    <w:p>
+      <w:pPr>
+        <w:pStyle w:val="ListParagraph"/>
+        <w:ind w:left="360"/>
+        <w:rPr>
+          <w:rFonts w:ascii="Times New Roman" w:hAnsi="Times New Roman" w:cs="Times New Roman"/>
+          <w:b/>
+          <w:bCs/>
+          <w:sz w:val="24"/>
+          <w:szCs w:val="24"/>
+        </w:rPr>
+      </w:pPr>
+    </w:p>
+    <w:p>
+      <w:pPr>
+        <w:pStyle w:val="ListParagraph"/>
+        <w:ind w:left="360"/>
+        <w:rPr>
+          <w:rFonts w:ascii="Times New Roman" w:hAnsi="Times New Roman" w:cs="Times New Roman"/>
+          <w:b/>
+          <w:bCs/>
+          <w:sz w:val="24"/>
+          <w:szCs w:val="24"/>
+        </w:rPr>
+      </w:pPr>
+    </w:p>
+    <w:p>
+      <w:pPr>
+        <w:pStyle w:val="ListParagraph"/>
+        <w:ind w:left="360"/>
+        <w:rPr>
+          <w:rFonts w:ascii="Times New Roman" w:hAnsi="Times New Roman" w:cs="Times New Roman"/>
+          <w:b/>
+          <w:bCs/>
+          <w:sz w:val="24"/>
+          <w:szCs w:val="24"/>
+        </w:rPr>
+      </w:pPr>
+    </w:p>
+    <w:p>
+      <w:pPr>
+        <w:pStyle w:val="ListParagraph"/>
+        <w:ind w:left="360"/>
+        <w:rPr>
+          <w:rFonts w:ascii="Times New Roman" w:hAnsi="Times New Roman" w:cs="Times New Roman"/>
+          <w:b/>
+          <w:bCs/>
+          <w:sz w:val="24"/>
+          <w:szCs w:val="24"/>
+        </w:rPr>
+      </w:pPr>
+    </w:p>
+    <w:p>
+      <w:pPr>
+        <w:pStyle w:val="ListParagraph"/>
+        <w:ind w:left="360"/>
+        <w:rPr>
+          <w:rFonts w:ascii="Times New Roman" w:hAnsi="Times New Roman" w:cs="Times New Roman"/>
+          <w:b/>
+          <w:bCs/>
+          <w:sz w:val="24"/>
+          <w:szCs w:val="24"/>
+        </w:rPr>
+      </w:pPr>
+    </w:p>
+    <w:p>
+      <w:pPr>
+        <w:pStyle w:val="ListParagraph"/>
+        <w:ind w:left="360"/>
+        <w:rPr>
+          <w:rFonts w:ascii="Times New Roman" w:hAnsi="Times New Roman" w:cs="Times New Roman"/>
+          <w:b/>
+          <w:bCs/>
+          <w:sz w:val="24"/>
+          <w:szCs w:val="24"/>
+        </w:rPr>
+      </w:pPr>
+    </w:p>
+    <w:p>
+      <w:pPr>
+        <w:pStyle w:val="ListParagraph"/>
+        <w:ind w:left="360"/>
+        <w:rPr>
+          <w:rFonts w:ascii="Times New Roman" w:hAnsi="Times New Roman" w:cs="Times New Roman"/>
+          <w:b/>
+          <w:bCs/>
+          <w:sz w:val="24"/>
+          <w:szCs w:val="24"/>
+        </w:rPr>
+      </w:pPr>
+    </w:p>
+    <w:p>
+      <w:pPr>
+        <w:pStyle w:val="ListParagraph"/>
+        <w:ind w:left="360"/>
+        <w:rPr>
+          <w:rFonts w:ascii="Times New Roman" w:hAnsi="Times New Roman" w:cs="Times New Roman"/>
+          <w:b/>
+          <w:bCs/>
+          <w:sz w:val="24"/>
+          <w:szCs w:val="24"/>
+        </w:rPr>
+      </w:pPr>
+    </w:p>
+    <w:p>
+      <w:pPr>
+        <w:pStyle w:val="ListParagraph"/>
+        <w:ind w:left="360"/>
+        <w:rPr>
+          <w:rFonts w:ascii="Times New Roman" w:hAnsi="Times New Roman" w:cs="Times New Roman"/>
+          <w:b/>
+          <w:bCs/>
+          <w:sz w:val="24"/>
+          <w:szCs w:val="24"/>
+        </w:rPr>
+      </w:pPr>
+    </w:p>
+    <w:p>
+      <w:pPr>
+        <w:pStyle w:val="ListParagraph"/>
+        <w:ind w:left="360"/>
+        <w:rPr>
+          <w:rFonts w:ascii="Times New Roman" w:hAnsi="Times New Roman" w:cs="Times New Roman"/>
+          <w:b/>
+          <w:bCs/>
+          <w:sz w:val="24"/>
+          <w:szCs w:val="24"/>
+        </w:rPr>
+      </w:pPr>
+    </w:p>
+    <w:p>
+      <w:pPr>
+        <w:pStyle w:val="ListParagraph"/>
+        <w:ind w:left="360"/>
+        <w:rPr>
+          <w:rFonts w:ascii="Times New Roman" w:hAnsi="Times New Roman" w:cs="Times New Roman"/>
+          <w:b/>
+          <w:bCs/>
+          <w:sz w:val="24"/>
+          <w:szCs w:val="24"/>
+        </w:rPr>
+      </w:pPr>
+    </w:p>
+    <w:p>
+      <w:pPr>
+        <w:pStyle w:val="ListParagraph"/>
+        <w:ind w:left="360"/>
+        <w:rPr>
+          <w:rFonts w:ascii="Times New Roman" w:hAnsi="Times New Roman" w:cs="Times New Roman"/>
+          <w:b/>
+          <w:bCs/>
+          <w:sz w:val="24"/>
+          <w:szCs w:val="24"/>
+        </w:rPr>
+      </w:pPr>
+    </w:p>
+    <w:p>
+      <w:pPr>
+        <w:pStyle w:val="ListParagraph"/>
+        <w:ind w:left="360"/>
+        <w:rPr>
+          <w:rFonts w:ascii="Times New Roman" w:hAnsi="Times New Roman" w:cs="Times New Roman"/>
+          <w:b/>
+          <w:bCs/>
+          <w:sz w:val="24"/>
+          <w:szCs w:val="24"/>
+        </w:rPr>
+      </w:pPr>
+    </w:p>
+    <w:p>
+      <w:pPr>
+        <w:pStyle w:val="ListParagraph"/>
+        <w:ind w:left="360"/>
+        <w:rPr>
+          <w:rFonts w:ascii="Times New Roman" w:hAnsi="Times New Roman" w:cs="Times New Roman"/>
+          <w:b/>
+          <w:bCs/>
+          <w:sz w:val="24"/>
+          <w:szCs w:val="24"/>
+        </w:rPr>
+      </w:pPr>
+    </w:p>
+    <w:p>
+      <w:pPr>
+        <w:pStyle w:val="ListParagraph"/>
+        <w:ind w:left="360"/>
+        <w:rPr>
+          <w:rFonts w:ascii="Times New Roman" w:hAnsi="Times New Roman" w:cs="Times New Roman"/>
+          <w:b/>
+          <w:bCs/>
+          <w:sz w:val="24"/>
+          <w:szCs w:val="24"/>
+        </w:rPr>
+      </w:pPr>
+    </w:p>
+    <w:p>
+      <w:pPr>
+        <w:pStyle w:val="ListParagraph"/>
+        <w:ind w:left="360"/>
+        <w:rPr>
+          <w:rFonts w:ascii="Times New Roman" w:hAnsi="Times New Roman" w:cs="Times New Roman"/>
+          <w:b/>
+          <w:bCs/>
+          <w:sz w:val="24"/>
+          <w:szCs w:val="24"/>
+        </w:rPr>
+      </w:pPr>
+    </w:p>
+    <w:p>
+      <w:pPr>
+        <w:pStyle w:val="ListParagraph"/>
+        <w:ind w:left="360"/>
+        <w:rPr>
+          <w:rFonts w:ascii="Times New Roman" w:hAnsi="Times New Roman" w:cs="Times New Roman"/>
+          <w:b/>
+          <w:bCs/>
+          <w:sz w:val="24"/>
+          <w:szCs w:val="24"/>
+        </w:rPr>
+      </w:pPr>
+    </w:p>
+    <w:p>
+      <w:pPr>
+        <w:pStyle w:val="ListParagraph"/>
+        <w:ind w:left="360"/>
+        <w:rPr>
+          <w:rFonts w:ascii="Times New Roman" w:hAnsi="Times New Roman" w:cs="Times New Roman"/>
+          <w:b/>
+          <w:bCs/>
+          <w:sz w:val="24"/>
+          <w:szCs w:val="24"/>
+        </w:rPr>
+      </w:pPr>
+    </w:p>
+    <w:p>
+      <w:pPr>
+        <w:pStyle w:val="ListParagraph"/>
+        <w:ind w:left="360"/>
+        <w:rPr>
+          <w:rFonts w:ascii="Times New Roman" w:hAnsi="Times New Roman" w:cs="Times New Roman"/>
+          <w:b/>
+          <w:bCs/>
+          <w:sz w:val="24"/>
+          <w:szCs w:val="24"/>
+        </w:rPr>
+      </w:pPr>
+    </w:p>
+    <w:p>
+      <w:pPr>
+        <w:pStyle w:val="ListParagraph"/>
+        <w:ind w:left="360"/>
+        <w:rPr>
+          <w:rFonts w:ascii="Times New Roman" w:hAnsi="Times New Roman" w:cs="Times New Roman"/>
+          <w:b/>
+          <w:bCs/>
+          <w:sz w:val="24"/>
+          <w:szCs w:val="24"/>
+        </w:rPr>
+      </w:pPr>
+    </w:p>
+    <w:p>
+      <w:pPr>
+        <w:pStyle w:val="ListParagraph"/>
+        <w:ind w:left="360"/>
+        <w:rPr>
+          <w:rFonts w:ascii="Times New Roman" w:hAnsi="Times New Roman" w:cs="Times New Roman"/>
+          <w:b/>
+          <w:bCs/>
+          <w:sz w:val="24"/>
+          <w:szCs w:val="24"/>
+        </w:rPr>
+      </w:pPr>
+    </w:p>
+    <w:p>
+      <w:pPr>
+        <w:pStyle w:val="ListParagraph"/>
+        <w:ind w:left="360"/>
+        <w:rPr>
+          <w:rFonts w:ascii="Times New Roman" w:hAnsi="Times New Roman" w:cs="Times New Roman"/>
+          <w:b/>
+          <w:bCs/>
+          <w:sz w:val="24"/>
+          <w:szCs w:val="24"/>
+        </w:rPr>
+      </w:pPr>
+    </w:p>
+    <w:p>
+      <w:pPr>
+        <w:pStyle w:val="ListParagraph"/>
+        <w:ind w:left="360"/>
+        <w:rPr>
+          <w:rFonts w:ascii="Times New Roman" w:hAnsi="Times New Roman" w:cs="Times New Roman"/>
+          <w:b/>
+          <w:bCs/>
+          <w:sz w:val="24"/>
+          <w:szCs w:val="24"/>
+        </w:rPr>
+      </w:pPr>
+    </w:p>
+    <w:p>
+      <w:pPr>
+        <w:pStyle w:val="ListParagraph"/>
+        <w:ind w:left="360"/>
+        <w:rPr>
+          <w:rFonts w:ascii="Times New Roman" w:hAnsi="Times New Roman" w:cs="Times New Roman"/>
+          <w:b/>
+          <w:bCs/>
+          <w:sz w:val="24"/>
+          <w:szCs w:val="24"/>
+        </w:rPr>
+      </w:pPr>
+    </w:p>
+    <w:p>
+      <w:pPr>
+        <w:pStyle w:val="ListParagraph"/>
+        <w:ind w:left="360"/>
+        <w:rPr>
+          <w:rFonts w:ascii="Times New Roman" w:hAnsi="Times New Roman" w:cs="Times New Roman"/>
+          <w:b/>
+          <w:bCs/>
+          <w:sz w:val="24"/>
+          <w:szCs w:val="24"/>
+        </w:rPr>
+      </w:pPr>
+    </w:p>
+    <w:p>
+      <w:pPr>
+        <w:pStyle w:val="ListParagraph"/>
+        <w:ind w:left="360"/>
+        <w:rPr>
+          <w:rFonts w:ascii="Times New Roman" w:hAnsi="Times New Roman" w:cs="Times New Roman"/>
+          <w:b/>
+          <w:bCs/>
+          <w:sz w:val="24"/>
+          <w:szCs w:val="24"/>
+        </w:rPr>
+      </w:pPr>
+    </w:p>
+    <w:p>
+      <w:pPr>
+        <w:pStyle w:val="ListParagraph"/>
+        <w:ind w:left="360"/>
+        <w:rPr>
+          <w:rFonts w:ascii="Times New Roman" w:hAnsi="Times New Roman" w:cs="Times New Roman"/>
+          <w:b/>
+          <w:bCs/>
+          <w:sz w:val="24"/>
+          <w:szCs w:val="24"/>
+        </w:rPr>
+      </w:pPr>
+    </w:p>
+    <w:p>
+      <w:pPr>
+        <w:pStyle w:val="ListParagraph"/>
+        <w:ind w:left="360"/>
+        <w:rPr>
+          <w:rFonts w:ascii="Times New Roman" w:hAnsi="Times New Roman" w:cs="Times New Roman"/>
+          <w:b/>
+          <w:bCs/>
+          <w:sz w:val="24"/>
+          <w:szCs w:val="24"/>
+        </w:rPr>
+      </w:pPr>
+    </w:p>
+    <w:p>
+      <w:pPr>
+        <w:pStyle w:val="ListParagraph"/>
+        <w:ind w:left="360"/>
+        <w:rPr>
+          <w:rFonts w:ascii="Times New Roman" w:hAnsi="Times New Roman" w:cs="Times New Roman"/>
+          <w:b/>
+          <w:bCs/>
+          <w:sz w:val="24"/>
+          <w:szCs w:val="24"/>
+        </w:rPr>
+      </w:pPr>
+    </w:p>
+    <w:p>
+      <w:pPr>
+        <w:pStyle w:val="ListParagraph"/>
+        <w:ind w:left="360"/>
+        <w:rPr>
+          <w:rFonts w:ascii="Times New Roman" w:hAnsi="Times New Roman" w:cs="Times New Roman"/>
+          <w:b/>
+          <w:bCs/>
+          <w:sz w:val="24"/>
+          <w:szCs w:val="24"/>
+        </w:rPr>
+      </w:pPr>
+    </w:p>
+    <w:p>
+      <w:pPr>
+        <w:pStyle w:val="ListParagraph"/>
+        <w:ind w:left="360"/>
+        <w:rPr>
+          <w:rFonts w:ascii="Times New Roman" w:hAnsi="Times New Roman" w:cs="Times New Roman"/>
+          <w:b/>
+          <w:bCs/>
+          <w:sz w:val="24"/>
+          <w:szCs w:val="24"/>
+        </w:rPr>
+      </w:pPr>
+    </w:p>
+    <w:p>
+      <w:pPr>
+        <w:pStyle w:val="ListParagraph"/>
+        <w:ind w:left="360"/>
+        <w:rPr>
+          <w:rFonts w:ascii="Times New Roman" w:hAnsi="Times New Roman" w:cs="Times New Roman"/>
+          <w:b/>
+          <w:bCs/>
+          <w:sz w:val="24"/>
+          <w:szCs w:val="24"/>
+        </w:rPr>
+      </w:pPr>
+    </w:p>
+    <w:p>
+      <w:pPr>
+        <w:pStyle w:val="ListParagraph"/>
+        <w:ind w:left="360"/>
+        <w:rPr>
+          <w:rFonts w:ascii="Times New Roman" w:hAnsi="Times New Roman" w:cs="Times New Roman"/>
+          <w:b/>
+          <w:bCs/>
+          <w:sz w:val="24"/>
+          <w:szCs w:val="24"/>
+        </w:rPr>
+      </w:pPr>
+    </w:p>
+    <w:p>
+      <w:pPr>
+        <w:pStyle w:val="ListParagraph"/>
+        <w:ind w:left="360"/>
+        <w:rPr>
+          <w:rFonts w:ascii="Times New Roman" w:hAnsi="Times New Roman" w:cs="Times New Roman"/>
+          <w:b/>
+          <w:bCs/>
+          <w:sz w:val="24"/>
+          <w:szCs w:val="24"/>
+        </w:rPr>
+      </w:pPr>
+    </w:p>
+    <w:p>
+      <w:pPr>
+        <w:pStyle w:val="ListParagraph"/>
+        <w:ind w:left="360"/>
+        <w:rPr>
+          <w:rFonts w:ascii="Times New Roman" w:hAnsi="Times New Roman" w:cs="Times New Roman"/>
+          <w:b/>
+          <w:bCs/>
+          <w:sz w:val="24"/>
+          <w:szCs w:val="24"/>
+        </w:rPr>
+      </w:pPr>
+    </w:p>
+    <w:p>
+      <w:pPr>
+        <w:pStyle w:val="ListParagraph"/>
+        <w:ind w:left="360"/>
+        <w:rPr>
+          <w:rFonts w:ascii="Times New Roman" w:hAnsi="Times New Roman" w:cs="Times New Roman"/>
+          <w:b/>
+          <w:bCs/>
+          <w:sz w:val="24"/>
+          <w:szCs w:val="24"/>
+        </w:rPr>
+      </w:pPr>
+    </w:p>
+    <w:p>
+      <w:pPr>
+        <w:pStyle w:val="ListParagraph"/>
+        <w:ind w:left="360"/>
+        <w:rPr>
+          <w:rFonts w:ascii="Times New Roman" w:hAnsi="Times New Roman" w:cs="Times New Roman"/>
+          <w:b/>
+          <w:bCs/>
+          <w:sz w:val="24"/>
+          <w:szCs w:val="24"/>
+        </w:rPr>
+      </w:pPr>
+    </w:p>
+    <w:p>
+      <w:pPr>
+        <w:pStyle w:val="ListParagraph"/>
+        <w:ind w:left="360"/>
+        <w:rPr>
+          <w:rFonts w:ascii="Times New Roman" w:hAnsi="Times New Roman" w:cs="Times New Roman"/>
+          <w:b/>
+          <w:bCs/>
+          <w:sz w:val="24"/>
+          <w:szCs w:val="24"/>
+        </w:rPr>
+      </w:pPr>
+    </w:p>
+    <w:p>
+      <w:pPr>
+        <w:pStyle w:val="ListParagraph"/>
+        <w:ind w:left="360"/>
+        <w:rPr>
+          <w:rFonts w:ascii="Times New Roman" w:hAnsi="Times New Roman" w:cs="Times New Roman"/>
+          <w:b/>
+          <w:bCs/>
+          <w:sz w:val="24"/>
+          <w:szCs w:val="24"/>
+        </w:rPr>
+      </w:pPr>
+    </w:p>
+    <w:p>
+      <w:pPr>
+        <w:pStyle w:val="ListParagraph"/>
+        <w:ind w:left="360"/>
+        <w:rPr>
+          <w:rFonts w:ascii="Times New Roman" w:hAnsi="Times New Roman" w:cs="Times New Roman"/>
+          <w:b/>
+          <w:bCs/>
+          <w:sz w:val="24"/>
+          <w:szCs w:val="24"/>
+        </w:rPr>
+      </w:pPr>
+    </w:p>
+    <w:p>
+      <w:pPr>
+        <w:pStyle w:val="ListParagraph"/>
+        <w:ind w:left="360"/>
+        <w:rPr>
+          <w:rFonts w:ascii="Times New Roman" w:hAnsi="Times New Roman" w:cs="Times New Roman"/>
+          <w:b/>
+          <w:bCs/>
+          <w:sz w:val="24"/>
+          <w:szCs w:val="24"/>
+        </w:rPr>
+      </w:pPr>
+    </w:p>
+    <w:p>
+      <w:pPr>
+        <w:pStyle w:val="ListParagraph"/>
+        <w:ind w:left="360"/>
+        <w:rPr>
+          <w:rFonts w:ascii="Times New Roman" w:hAnsi="Times New Roman" w:cs="Times New Roman"/>
+          <w:b/>
+          <w:bCs/>
+          <w:sz w:val="24"/>
+          <w:szCs w:val="24"/>
+        </w:rPr>
+      </w:pPr>
+    </w:p>
+    <w:p>
+      <w:pPr>
+        <w:pStyle w:val="ListParagraph"/>
+        <w:ind w:left="360"/>
+        <w:rPr>
+          <w:rFonts w:ascii="Times New Roman" w:hAnsi="Times New Roman" w:cs="Times New Roman"/>
+          <w:b/>
+          <w:bCs/>
+          <w:sz w:val="24"/>
+          <w:szCs w:val="24"/>
+        </w:rPr>
+      </w:pPr>
+    </w:p>
+    <w:p>
+      <w:pPr>
+        <w:pStyle w:val="ListParagraph"/>
+        <w:ind w:left="360"/>
+        <w:rPr>
+          <w:rFonts w:ascii="Times New Roman" w:hAnsi="Times New Roman" w:cs="Times New Roman"/>
+          <w:b/>
+          <w:bCs/>
+          <w:sz w:val="24"/>
+          <w:szCs w:val="24"/>
+        </w:rPr>
+      </w:pPr>
+    </w:p>
+    <w:p>
+      <w:pPr>
+        <w:pStyle w:val="ListParagraph"/>
+        <w:ind w:left="360"/>
+        <w:rPr>
+          <w:rFonts w:ascii="Times New Roman" w:hAnsi="Times New Roman" w:cs="Times New Roman"/>
+          <w:b/>
+          <w:bCs/>
+          <w:sz w:val="24"/>
+          <w:szCs w:val="24"/>
+        </w:rPr>
+      </w:pPr>
+    </w:p>
+    <w:p>
+      <w:pPr>
+        <w:pStyle w:val="ListParagraph"/>
+        <w:ind w:left="360"/>
+        <w:rPr>
+          <w:rFonts w:ascii="Times New Roman" w:hAnsi="Times New Roman" w:cs="Times New Roman"/>
+          <w:b/>
+          <w:bCs/>
+          <w:sz w:val="24"/>
+          <w:szCs w:val="24"/>
+        </w:rPr>
+      </w:pPr>
+    </w:p>
+    <w:p>
+      <w:pPr>
+        <w:pStyle w:val="ListParagraph"/>
+        <w:ind w:left="360"/>
+        <w:rPr>
+          <w:rFonts w:ascii="Times New Roman" w:hAnsi="Times New Roman" w:cs="Times New Roman"/>
+          <w:b/>
+          <w:bCs/>
+          <w:sz w:val="24"/>
+          <w:szCs w:val="24"/>
+        </w:rPr>
+      </w:pPr>
     </w:p>
     <w:p>
       <w:pPr>
@@ -2475,6 +3569,36 @@
     <w:p/>
     <w:p/>
     <w:p/>
+    <w:p/>
+    <w:p/>
+    <w:p/>
+    <w:p/>
+    <w:p/>
+    <w:p/>
+    <w:p/>
+    <w:p/>
+    <w:p/>
+    <w:p/>
+    <w:p/>
+    <w:p/>
+    <w:p/>
+    <w:p/>
+    <w:p/>
+    <w:p/>
+    <w:p/>
+    <w:p/>
+    <w:p/>
+    <w:p/>
+    <w:p/>
+    <w:p/>
+    <w:p/>
+    <w:p/>
+    <w:p/>
+    <w:p/>
+    <w:p/>
+    <w:p/>
+    <w:p/>
+    <w:p/>
     <w:p>
       <w:pPr>
         <w:pStyle w:val="Heading2"/>
@@ -2497,7 +3621,6 @@
           <w:sz w:val="26"/>
           <w:szCs w:val="26"/>
         </w:rPr>
-        <w:lastRenderedPageBreak/>
         <w:t>2.</w:t>
       </w:r>
       <w:r>
@@ -2577,16 +3700,245 @@
       <w:pPr>
         <w:pStyle w:val="NormalWeb"/>
         <w:jc w:val="both"/>
-        <w:rPr>
-          <w:b/>
-          <w:bCs/>
-        </w:rPr>
-      </w:pPr>
-      <w:r>
-        <w:rPr>
-          <w:b/>
-          <w:bCs/>
-        </w:rPr>
+      </w:pPr>
+    </w:p>
+    <w:p>
+      <w:pPr>
+        <w:pStyle w:val="NormalWeb"/>
+        <w:jc w:val="both"/>
+      </w:pPr>
+    </w:p>
+    <w:p>
+      <w:pPr>
+        <w:pStyle w:val="NormalWeb"/>
+        <w:jc w:val="both"/>
+      </w:pPr>
+    </w:p>
+    <w:p>
+      <w:pPr>
+        <w:pStyle w:val="NormalWeb"/>
+        <w:jc w:val="both"/>
+      </w:pPr>
+    </w:p>
+    <w:p>
+      <w:pPr>
+        <w:pStyle w:val="NormalWeb"/>
+        <w:jc w:val="both"/>
+      </w:pPr>
+    </w:p>
+    <w:p>
+      <w:pPr>
+        <w:pStyle w:val="NormalWeb"/>
+        <w:jc w:val="both"/>
+      </w:pPr>
+    </w:p>
+    <w:p>
+      <w:pPr>
+        <w:pStyle w:val="NormalWeb"/>
+        <w:jc w:val="both"/>
+      </w:pPr>
+    </w:p>
+    <w:p>
+      <w:pPr>
+        <w:pStyle w:val="NormalWeb"/>
+        <w:jc w:val="both"/>
+      </w:pPr>
+    </w:p>
+    <w:p>
+      <w:pPr>
+        <w:pStyle w:val="NormalWeb"/>
+        <w:jc w:val="both"/>
+      </w:pPr>
+    </w:p>
+    <w:p>
+      <w:pPr>
+        <w:pStyle w:val="NormalWeb"/>
+        <w:jc w:val="both"/>
+      </w:pPr>
+    </w:p>
+    <w:p>
+      <w:pPr>
+        <w:pStyle w:val="NormalWeb"/>
+        <w:jc w:val="both"/>
+      </w:pPr>
+    </w:p>
+    <w:p>
+      <w:pPr>
+        <w:pStyle w:val="NormalWeb"/>
+        <w:jc w:val="both"/>
+      </w:pPr>
+    </w:p>
+    <w:p>
+      <w:pPr>
+        <w:pStyle w:val="NormalWeb"/>
+        <w:jc w:val="both"/>
+      </w:pPr>
+    </w:p>
+    <w:p>
+      <w:pPr>
+        <w:pStyle w:val="NormalWeb"/>
+        <w:jc w:val="both"/>
+      </w:pPr>
+    </w:p>
+    <w:p>
+      <w:pPr>
+        <w:pStyle w:val="NormalWeb"/>
+        <w:jc w:val="both"/>
+      </w:pPr>
+    </w:p>
+    <w:p>
+      <w:pPr>
+        <w:pStyle w:val="NormalWeb"/>
+        <w:jc w:val="both"/>
+      </w:pPr>
+    </w:p>
+    <w:p>
+      <w:pPr>
+        <w:pStyle w:val="NormalWeb"/>
+        <w:jc w:val="both"/>
+      </w:pPr>
+    </w:p>
+    <w:p>
+      <w:pPr>
+        <w:pStyle w:val="NormalWeb"/>
+        <w:jc w:val="both"/>
+      </w:pPr>
+    </w:p>
+    <w:p>
+      <w:pPr>
+        <w:pStyle w:val="NormalWeb"/>
+        <w:jc w:val="both"/>
+      </w:pPr>
+    </w:p>
+    <w:p>
+      <w:pPr>
+        <w:pStyle w:val="NormalWeb"/>
+        <w:jc w:val="both"/>
+      </w:pPr>
+    </w:p>
+    <w:p>
+      <w:pPr>
+        <w:pStyle w:val="NormalWeb"/>
+        <w:jc w:val="both"/>
+      </w:pPr>
+    </w:p>
+    <w:p>
+      <w:pPr>
+        <w:pStyle w:val="NormalWeb"/>
+        <w:jc w:val="both"/>
+      </w:pPr>
+    </w:p>
+    <w:p>
+      <w:pPr>
+        <w:pStyle w:val="NormalWeb"/>
+        <w:jc w:val="both"/>
+      </w:pPr>
+    </w:p>
+    <w:p>
+      <w:pPr>
+        <w:pStyle w:val="NormalWeb"/>
+        <w:jc w:val="both"/>
+      </w:pPr>
+    </w:p>
+    <w:p>
+      <w:pPr>
+        <w:pStyle w:val="NormalWeb"/>
+        <w:jc w:val="both"/>
+      </w:pPr>
+    </w:p>
+    <w:p>
+      <w:pPr>
+        <w:pStyle w:val="NormalWeb"/>
+        <w:jc w:val="both"/>
+      </w:pPr>
+    </w:p>
+    <w:p>
+      <w:pPr>
+        <w:pStyle w:val="NormalWeb"/>
+        <w:jc w:val="both"/>
+      </w:pPr>
+    </w:p>
+    <w:p>
+      <w:pPr>
+        <w:pStyle w:val="NormalWeb"/>
+        <w:jc w:val="both"/>
+      </w:pPr>
+    </w:p>
+    <w:p>
+      <w:pPr>
+        <w:pStyle w:val="NormalWeb"/>
+        <w:jc w:val="both"/>
+      </w:pPr>
+    </w:p>
+    <w:p>
+      <w:pPr>
+        <w:pStyle w:val="NormalWeb"/>
+        <w:jc w:val="both"/>
+      </w:pPr>
+    </w:p>
+    <w:p>
+      <w:pPr>
+        <w:pStyle w:val="NormalWeb"/>
+        <w:jc w:val="both"/>
+      </w:pPr>
+    </w:p>
+    <w:p>
+      <w:pPr>
+        <w:pStyle w:val="NormalWeb"/>
+        <w:jc w:val="both"/>
+      </w:pPr>
+    </w:p>
+    <w:p>
+      <w:pPr>
+        <w:pStyle w:val="NormalWeb"/>
+        <w:jc w:val="both"/>
+      </w:pPr>
+    </w:p>
+    <w:p>
+      <w:pPr>
+        <w:pStyle w:val="NormalWeb"/>
+        <w:jc w:val="both"/>
+      </w:pPr>
+    </w:p>
+    <w:p>
+      <w:pPr>
+        <w:pStyle w:val="NormalWeb"/>
+        <w:jc w:val="both"/>
+      </w:pPr>
+    </w:p>
+    <w:p>
+      <w:pPr>
+        <w:pStyle w:val="NormalWeb"/>
+        <w:jc w:val="both"/>
+      </w:pPr>
+    </w:p>
+    <w:p>
+      <w:pPr>
+        <w:pStyle w:val="NormalWeb"/>
+        <w:jc w:val="both"/>
+      </w:pPr>
+    </w:p>
+    <w:p>
+      <w:pPr>
+        <w:pStyle w:val="NormalWeb"/>
+        <w:jc w:val="both"/>
+      </w:pPr>
+    </w:p>
+    <w:p>
+      <w:pPr>
+        <w:pStyle w:val="NormalWeb"/>
+        <w:jc w:val="both"/>
+        <w:rPr>
+          <w:b/>
+          <w:bCs/>
+        </w:rPr>
+      </w:pPr>
+      <w:r>
+        <w:rPr>
+          <w:b/>
+          <w:bCs/>
+        </w:rPr>
+        <w:lastRenderedPageBreak/>
         <w:t>2.2 User Story Table</w:t>
       </w:r>
       <w:r>
@@ -2646,6 +3998,456 @@
           <w:bCs/>
         </w:rPr>
       </w:pPr>
+    </w:p>
+    <w:p>
+      <w:pPr>
+        <w:pStyle w:val="NormalWeb"/>
+        <w:jc w:val="both"/>
+        <w:rPr>
+          <w:b/>
+          <w:bCs/>
+        </w:rPr>
+      </w:pPr>
+    </w:p>
+    <w:p>
+      <w:pPr>
+        <w:pStyle w:val="NormalWeb"/>
+        <w:jc w:val="both"/>
+        <w:rPr>
+          <w:b/>
+          <w:bCs/>
+        </w:rPr>
+      </w:pPr>
+    </w:p>
+    <w:p>
+      <w:pPr>
+        <w:pStyle w:val="NormalWeb"/>
+        <w:jc w:val="both"/>
+        <w:rPr>
+          <w:b/>
+          <w:bCs/>
+        </w:rPr>
+      </w:pPr>
+    </w:p>
+    <w:p>
+      <w:pPr>
+        <w:pStyle w:val="NormalWeb"/>
+        <w:jc w:val="both"/>
+        <w:rPr>
+          <w:b/>
+          <w:bCs/>
+        </w:rPr>
+      </w:pPr>
+    </w:p>
+    <w:p>
+      <w:pPr>
+        <w:pStyle w:val="NormalWeb"/>
+        <w:jc w:val="both"/>
+        <w:rPr>
+          <w:b/>
+          <w:bCs/>
+        </w:rPr>
+      </w:pPr>
+    </w:p>
+    <w:p>
+      <w:pPr>
+        <w:pStyle w:val="NormalWeb"/>
+        <w:jc w:val="both"/>
+        <w:rPr>
+          <w:b/>
+          <w:bCs/>
+        </w:rPr>
+      </w:pPr>
+    </w:p>
+    <w:p>
+      <w:pPr>
+        <w:pStyle w:val="NormalWeb"/>
+        <w:jc w:val="both"/>
+        <w:rPr>
+          <w:b/>
+          <w:bCs/>
+        </w:rPr>
+      </w:pPr>
+    </w:p>
+    <w:p>
+      <w:pPr>
+        <w:pStyle w:val="NormalWeb"/>
+        <w:jc w:val="both"/>
+        <w:rPr>
+          <w:b/>
+          <w:bCs/>
+        </w:rPr>
+      </w:pPr>
+    </w:p>
+    <w:p>
+      <w:pPr>
+        <w:pStyle w:val="NormalWeb"/>
+        <w:jc w:val="both"/>
+        <w:rPr>
+          <w:b/>
+          <w:bCs/>
+        </w:rPr>
+      </w:pPr>
+    </w:p>
+    <w:p>
+      <w:pPr>
+        <w:pStyle w:val="NormalWeb"/>
+        <w:jc w:val="both"/>
+        <w:rPr>
+          <w:b/>
+          <w:bCs/>
+        </w:rPr>
+      </w:pPr>
+    </w:p>
+    <w:p>
+      <w:pPr>
+        <w:pStyle w:val="NormalWeb"/>
+        <w:jc w:val="both"/>
+        <w:rPr>
+          <w:b/>
+          <w:bCs/>
+        </w:rPr>
+      </w:pPr>
+    </w:p>
+    <w:p>
+      <w:pPr>
+        <w:pStyle w:val="NormalWeb"/>
+        <w:jc w:val="both"/>
+        <w:rPr>
+          <w:b/>
+          <w:bCs/>
+        </w:rPr>
+      </w:pPr>
+    </w:p>
+    <w:p>
+      <w:pPr>
+        <w:pStyle w:val="NormalWeb"/>
+        <w:jc w:val="both"/>
+        <w:rPr>
+          <w:b/>
+          <w:bCs/>
+        </w:rPr>
+      </w:pPr>
+    </w:p>
+    <w:p>
+      <w:pPr>
+        <w:pStyle w:val="NormalWeb"/>
+        <w:jc w:val="both"/>
+        <w:rPr>
+          <w:b/>
+          <w:bCs/>
+        </w:rPr>
+      </w:pPr>
+    </w:p>
+    <w:p>
+      <w:pPr>
+        <w:pStyle w:val="NormalWeb"/>
+        <w:jc w:val="both"/>
+        <w:rPr>
+          <w:b/>
+          <w:bCs/>
+        </w:rPr>
+      </w:pPr>
+    </w:p>
+    <w:p>
+      <w:pPr>
+        <w:pStyle w:val="NormalWeb"/>
+        <w:jc w:val="both"/>
+        <w:rPr>
+          <w:b/>
+          <w:bCs/>
+        </w:rPr>
+      </w:pPr>
+    </w:p>
+    <w:p>
+      <w:pPr>
+        <w:pStyle w:val="NormalWeb"/>
+        <w:jc w:val="both"/>
+        <w:rPr>
+          <w:b/>
+          <w:bCs/>
+        </w:rPr>
+      </w:pPr>
+    </w:p>
+    <w:p>
+      <w:pPr>
+        <w:pStyle w:val="NormalWeb"/>
+        <w:jc w:val="both"/>
+        <w:rPr>
+          <w:b/>
+          <w:bCs/>
+        </w:rPr>
+      </w:pPr>
+    </w:p>
+    <w:p>
+      <w:pPr>
+        <w:pStyle w:val="NormalWeb"/>
+        <w:jc w:val="both"/>
+        <w:rPr>
+          <w:b/>
+          <w:bCs/>
+        </w:rPr>
+      </w:pPr>
+    </w:p>
+    <w:p>
+      <w:pPr>
+        <w:pStyle w:val="NormalWeb"/>
+        <w:jc w:val="both"/>
+        <w:rPr>
+          <w:b/>
+          <w:bCs/>
+        </w:rPr>
+      </w:pPr>
+    </w:p>
+    <w:p>
+      <w:pPr>
+        <w:pStyle w:val="NormalWeb"/>
+        <w:jc w:val="both"/>
+        <w:rPr>
+          <w:b/>
+          <w:bCs/>
+        </w:rPr>
+      </w:pPr>
+    </w:p>
+    <w:p>
+      <w:pPr>
+        <w:pStyle w:val="NormalWeb"/>
+        <w:jc w:val="both"/>
+        <w:rPr>
+          <w:b/>
+          <w:bCs/>
+        </w:rPr>
+      </w:pPr>
+    </w:p>
+    <w:p>
+      <w:pPr>
+        <w:pStyle w:val="NormalWeb"/>
+        <w:jc w:val="both"/>
+        <w:rPr>
+          <w:b/>
+          <w:bCs/>
+        </w:rPr>
+      </w:pPr>
+    </w:p>
+    <w:p>
+      <w:pPr>
+        <w:pStyle w:val="NormalWeb"/>
+        <w:jc w:val="both"/>
+        <w:rPr>
+          <w:b/>
+          <w:bCs/>
+        </w:rPr>
+      </w:pPr>
+    </w:p>
+    <w:p>
+      <w:pPr>
+        <w:pStyle w:val="NormalWeb"/>
+        <w:jc w:val="both"/>
+        <w:rPr>
+          <w:b/>
+          <w:bCs/>
+        </w:rPr>
+      </w:pPr>
+    </w:p>
+    <w:p>
+      <w:pPr>
+        <w:pStyle w:val="NormalWeb"/>
+        <w:jc w:val="both"/>
+        <w:rPr>
+          <w:b/>
+          <w:bCs/>
+        </w:rPr>
+      </w:pPr>
+    </w:p>
+    <w:p>
+      <w:pPr>
+        <w:pStyle w:val="NormalWeb"/>
+        <w:jc w:val="both"/>
+        <w:rPr>
+          <w:b/>
+          <w:bCs/>
+        </w:rPr>
+      </w:pPr>
+    </w:p>
+    <w:p>
+      <w:pPr>
+        <w:pStyle w:val="NormalWeb"/>
+        <w:jc w:val="both"/>
+        <w:rPr>
+          <w:b/>
+          <w:bCs/>
+        </w:rPr>
+      </w:pPr>
+    </w:p>
+    <w:p>
+      <w:pPr>
+        <w:pStyle w:val="NormalWeb"/>
+        <w:jc w:val="both"/>
+        <w:rPr>
+          <w:b/>
+          <w:bCs/>
+        </w:rPr>
+      </w:pPr>
+    </w:p>
+    <w:p>
+      <w:pPr>
+        <w:pStyle w:val="NormalWeb"/>
+        <w:jc w:val="both"/>
+        <w:rPr>
+          <w:b/>
+          <w:bCs/>
+        </w:rPr>
+      </w:pPr>
+    </w:p>
+    <w:p>
+      <w:pPr>
+        <w:pStyle w:val="NormalWeb"/>
+        <w:jc w:val="both"/>
+        <w:rPr>
+          <w:b/>
+          <w:bCs/>
+        </w:rPr>
+      </w:pPr>
+    </w:p>
+    <w:p>
+      <w:pPr>
+        <w:pStyle w:val="NormalWeb"/>
+        <w:jc w:val="both"/>
+        <w:rPr>
+          <w:b/>
+          <w:bCs/>
+        </w:rPr>
+      </w:pPr>
+    </w:p>
+    <w:p>
+      <w:pPr>
+        <w:pStyle w:val="NormalWeb"/>
+        <w:jc w:val="both"/>
+        <w:rPr>
+          <w:b/>
+          <w:bCs/>
+        </w:rPr>
+      </w:pPr>
+    </w:p>
+    <w:p>
+      <w:pPr>
+        <w:pStyle w:val="NormalWeb"/>
+        <w:jc w:val="both"/>
+        <w:rPr>
+          <w:b/>
+          <w:bCs/>
+        </w:rPr>
+      </w:pPr>
+    </w:p>
+    <w:p>
+      <w:pPr>
+        <w:pStyle w:val="NormalWeb"/>
+        <w:jc w:val="both"/>
+        <w:rPr>
+          <w:b/>
+          <w:bCs/>
+        </w:rPr>
+      </w:pPr>
+    </w:p>
+    <w:p>
+      <w:pPr>
+        <w:pStyle w:val="NormalWeb"/>
+        <w:jc w:val="both"/>
+        <w:rPr>
+          <w:b/>
+          <w:bCs/>
+        </w:rPr>
+      </w:pPr>
+    </w:p>
+    <w:p>
+      <w:pPr>
+        <w:pStyle w:val="NormalWeb"/>
+        <w:jc w:val="both"/>
+        <w:rPr>
+          <w:b/>
+          <w:bCs/>
+        </w:rPr>
+      </w:pPr>
+    </w:p>
+    <w:p>
+      <w:pPr>
+        <w:pStyle w:val="NormalWeb"/>
+        <w:jc w:val="both"/>
+        <w:rPr>
+          <w:b/>
+          <w:bCs/>
+        </w:rPr>
+      </w:pPr>
+    </w:p>
+    <w:p>
+      <w:pPr>
+        <w:pStyle w:val="NormalWeb"/>
+        <w:jc w:val="both"/>
+        <w:rPr>
+          <w:b/>
+          <w:bCs/>
+        </w:rPr>
+      </w:pPr>
+    </w:p>
+    <w:p>
+      <w:pPr>
+        <w:pStyle w:val="NormalWeb"/>
+        <w:jc w:val="both"/>
+        <w:rPr>
+          <w:b/>
+          <w:bCs/>
+        </w:rPr>
+      </w:pPr>
+    </w:p>
+    <w:p>
+      <w:pPr>
+        <w:pStyle w:val="NormalWeb"/>
+        <w:jc w:val="both"/>
+        <w:rPr>
+          <w:b/>
+          <w:bCs/>
+        </w:rPr>
+      </w:pPr>
+    </w:p>
+    <w:p>
+      <w:pPr>
+        <w:pStyle w:val="NormalWeb"/>
+        <w:jc w:val="both"/>
+        <w:rPr>
+          <w:b/>
+          <w:bCs/>
+        </w:rPr>
+      </w:pPr>
+    </w:p>
+    <w:p>
+      <w:pPr>
+        <w:pStyle w:val="NormalWeb"/>
+        <w:jc w:val="both"/>
+        <w:rPr>
+          <w:b/>
+          <w:bCs/>
+        </w:rPr>
+      </w:pPr>
+    </w:p>
+    <w:p>
+      <w:pPr>
+        <w:pStyle w:val="NormalWeb"/>
+        <w:jc w:val="both"/>
+        <w:rPr>
+          <w:b/>
+          <w:bCs/>
+        </w:rPr>
+      </w:pPr>
+    </w:p>
+    <w:p>
+      <w:pPr>
+        <w:pStyle w:val="NormalWeb"/>
+        <w:jc w:val="both"/>
+        <w:rPr>
+          <w:b/>
+          <w:bCs/>
+        </w:rPr>
+      </w:pPr>
       <w:r>
         <w:rPr>
           <w:b/>
@@ -2710,6 +4512,324 @@
       <w:r>
         <w:tab/>
       </w:r>
+    </w:p>
+    <w:p>
+      <w:pPr>
+        <w:pStyle w:val="NormalWeb"/>
+        <w:jc w:val="both"/>
+      </w:pPr>
+    </w:p>
+    <w:p>
+      <w:pPr>
+        <w:pStyle w:val="NormalWeb"/>
+        <w:jc w:val="both"/>
+      </w:pPr>
+    </w:p>
+    <w:p>
+      <w:pPr>
+        <w:pStyle w:val="NormalWeb"/>
+        <w:jc w:val="both"/>
+      </w:pPr>
+    </w:p>
+    <w:p>
+      <w:pPr>
+        <w:pStyle w:val="NormalWeb"/>
+        <w:jc w:val="both"/>
+      </w:pPr>
+    </w:p>
+    <w:p>
+      <w:pPr>
+        <w:pStyle w:val="NormalWeb"/>
+        <w:jc w:val="both"/>
+      </w:pPr>
+    </w:p>
+    <w:p>
+      <w:pPr>
+        <w:pStyle w:val="NormalWeb"/>
+        <w:jc w:val="both"/>
+      </w:pPr>
+    </w:p>
+    <w:p>
+      <w:pPr>
+        <w:pStyle w:val="NormalWeb"/>
+        <w:jc w:val="both"/>
+      </w:pPr>
+    </w:p>
+    <w:p>
+      <w:pPr>
+        <w:pStyle w:val="NormalWeb"/>
+        <w:jc w:val="both"/>
+      </w:pPr>
+    </w:p>
+    <w:p>
+      <w:pPr>
+        <w:pStyle w:val="NormalWeb"/>
+        <w:jc w:val="both"/>
+      </w:pPr>
+    </w:p>
+    <w:p>
+      <w:pPr>
+        <w:pStyle w:val="NormalWeb"/>
+        <w:jc w:val="both"/>
+      </w:pPr>
+    </w:p>
+    <w:p>
+      <w:pPr>
+        <w:pStyle w:val="NormalWeb"/>
+        <w:jc w:val="both"/>
+      </w:pPr>
+    </w:p>
+    <w:p>
+      <w:pPr>
+        <w:pStyle w:val="NormalWeb"/>
+        <w:jc w:val="both"/>
+      </w:pPr>
+    </w:p>
+    <w:p>
+      <w:pPr>
+        <w:pStyle w:val="NormalWeb"/>
+        <w:jc w:val="both"/>
+      </w:pPr>
+    </w:p>
+    <w:p>
+      <w:pPr>
+        <w:pStyle w:val="NormalWeb"/>
+        <w:jc w:val="both"/>
+      </w:pPr>
+    </w:p>
+    <w:p>
+      <w:pPr>
+        <w:pStyle w:val="NormalWeb"/>
+        <w:jc w:val="both"/>
+      </w:pPr>
+    </w:p>
+    <w:p>
+      <w:pPr>
+        <w:pStyle w:val="NormalWeb"/>
+        <w:jc w:val="both"/>
+      </w:pPr>
+    </w:p>
+    <w:p>
+      <w:pPr>
+        <w:pStyle w:val="NormalWeb"/>
+        <w:jc w:val="both"/>
+      </w:pPr>
+    </w:p>
+    <w:p>
+      <w:pPr>
+        <w:pStyle w:val="NormalWeb"/>
+        <w:jc w:val="both"/>
+      </w:pPr>
+    </w:p>
+    <w:p>
+      <w:pPr>
+        <w:pStyle w:val="NormalWeb"/>
+        <w:jc w:val="both"/>
+      </w:pPr>
+    </w:p>
+    <w:p>
+      <w:pPr>
+        <w:pStyle w:val="NormalWeb"/>
+        <w:jc w:val="both"/>
+      </w:pPr>
+    </w:p>
+    <w:p>
+      <w:pPr>
+        <w:pStyle w:val="NormalWeb"/>
+        <w:jc w:val="both"/>
+      </w:pPr>
+    </w:p>
+    <w:p>
+      <w:pPr>
+        <w:pStyle w:val="NormalWeb"/>
+        <w:jc w:val="both"/>
+      </w:pPr>
+    </w:p>
+    <w:p>
+      <w:pPr>
+        <w:pStyle w:val="NormalWeb"/>
+        <w:jc w:val="both"/>
+      </w:pPr>
+    </w:p>
+    <w:p>
+      <w:pPr>
+        <w:pStyle w:val="NormalWeb"/>
+        <w:jc w:val="both"/>
+      </w:pPr>
+    </w:p>
+    <w:p>
+      <w:pPr>
+        <w:pStyle w:val="NormalWeb"/>
+        <w:jc w:val="both"/>
+      </w:pPr>
+    </w:p>
+    <w:p>
+      <w:pPr>
+        <w:pStyle w:val="NormalWeb"/>
+        <w:jc w:val="both"/>
+      </w:pPr>
+    </w:p>
+    <w:p>
+      <w:pPr>
+        <w:pStyle w:val="NormalWeb"/>
+        <w:jc w:val="both"/>
+      </w:pPr>
+    </w:p>
+    <w:p>
+      <w:pPr>
+        <w:pStyle w:val="NormalWeb"/>
+        <w:jc w:val="both"/>
+      </w:pPr>
+    </w:p>
+    <w:p>
+      <w:pPr>
+        <w:pStyle w:val="NormalWeb"/>
+        <w:jc w:val="both"/>
+      </w:pPr>
+    </w:p>
+    <w:p>
+      <w:pPr>
+        <w:pStyle w:val="NormalWeb"/>
+        <w:jc w:val="both"/>
+      </w:pPr>
+    </w:p>
+    <w:p>
+      <w:pPr>
+        <w:pStyle w:val="NormalWeb"/>
+        <w:jc w:val="both"/>
+      </w:pPr>
+    </w:p>
+    <w:p>
+      <w:pPr>
+        <w:pStyle w:val="NormalWeb"/>
+        <w:jc w:val="both"/>
+      </w:pPr>
+    </w:p>
+    <w:p>
+      <w:pPr>
+        <w:pStyle w:val="NormalWeb"/>
+        <w:jc w:val="both"/>
+      </w:pPr>
+    </w:p>
+    <w:p>
+      <w:pPr>
+        <w:pStyle w:val="NormalWeb"/>
+        <w:jc w:val="both"/>
+      </w:pPr>
+    </w:p>
+    <w:p>
+      <w:pPr>
+        <w:pStyle w:val="NormalWeb"/>
+        <w:jc w:val="both"/>
+      </w:pPr>
+    </w:p>
+    <w:p>
+      <w:pPr>
+        <w:pStyle w:val="NormalWeb"/>
+        <w:jc w:val="both"/>
+      </w:pPr>
+    </w:p>
+    <w:p>
+      <w:pPr>
+        <w:pStyle w:val="NormalWeb"/>
+        <w:jc w:val="both"/>
+      </w:pPr>
+    </w:p>
+    <w:p>
+      <w:pPr>
+        <w:pStyle w:val="NormalWeb"/>
+        <w:jc w:val="both"/>
+      </w:pPr>
+    </w:p>
+    <w:p>
+      <w:pPr>
+        <w:pStyle w:val="NormalWeb"/>
+        <w:jc w:val="both"/>
+      </w:pPr>
+    </w:p>
+    <w:p>
+      <w:pPr>
+        <w:pStyle w:val="NormalWeb"/>
+        <w:jc w:val="both"/>
+      </w:pPr>
+    </w:p>
+    <w:p>
+      <w:pPr>
+        <w:pStyle w:val="NormalWeb"/>
+        <w:jc w:val="both"/>
+      </w:pPr>
+    </w:p>
+    <w:p>
+      <w:pPr>
+        <w:pStyle w:val="NormalWeb"/>
+        <w:jc w:val="both"/>
+      </w:pPr>
+    </w:p>
+    <w:p>
+      <w:pPr>
+        <w:pStyle w:val="NormalWeb"/>
+        <w:jc w:val="both"/>
+      </w:pPr>
+    </w:p>
+    <w:p>
+      <w:pPr>
+        <w:pStyle w:val="NormalWeb"/>
+        <w:jc w:val="both"/>
+      </w:pPr>
+    </w:p>
+    <w:p>
+      <w:pPr>
+        <w:pStyle w:val="NormalWeb"/>
+        <w:jc w:val="both"/>
+      </w:pPr>
+    </w:p>
+    <w:p>
+      <w:pPr>
+        <w:pStyle w:val="NormalWeb"/>
+        <w:jc w:val="both"/>
+      </w:pPr>
+    </w:p>
+    <w:p>
+      <w:pPr>
+        <w:pStyle w:val="NormalWeb"/>
+        <w:jc w:val="both"/>
+      </w:pPr>
+    </w:p>
+    <w:p>
+      <w:pPr>
+        <w:pStyle w:val="NormalWeb"/>
+        <w:jc w:val="both"/>
+      </w:pPr>
+    </w:p>
+    <w:p>
+      <w:pPr>
+        <w:pStyle w:val="NormalWeb"/>
+        <w:jc w:val="both"/>
+      </w:pPr>
+    </w:p>
+    <w:p>
+      <w:pPr>
+        <w:pStyle w:val="NormalWeb"/>
+        <w:jc w:val="both"/>
+      </w:pPr>
+    </w:p>
+    <w:p>
+      <w:pPr>
+        <w:pStyle w:val="NormalWeb"/>
+        <w:jc w:val="both"/>
+      </w:pPr>
+    </w:p>
+    <w:p>
+      <w:pPr>
+        <w:pStyle w:val="NormalWeb"/>
+        <w:jc w:val="both"/>
+      </w:pPr>
+    </w:p>
+    <w:p>
+      <w:pPr>
+        <w:pStyle w:val="NormalWeb"/>
+        <w:jc w:val="both"/>
+      </w:pPr>
     </w:p>
     <w:p>
       <w:pPr>
@@ -2807,12 +4927,14 @@
       <w:r>
         <w:t xml:space="preserve"> or </w:t>
       </w:r>
+      <w:proofErr w:type="spellStart"/>
       <w:r>
         <w:rPr>
           <w:rStyle w:val="Strong"/>
         </w:rPr>
         <w:t>LucidChart</w:t>
       </w:r>
+      <w:proofErr w:type="spellEnd"/>
       <w:r>
         <w:t>.</w:t>
       </w:r>
@@ -2901,6 +5023,102 @@
       <w:r>
         <w:t xml:space="preserve"> that visually represents the workflow of a system or process.</w:t>
       </w:r>
+    </w:p>
+    <w:p>
+      <w:pPr>
+        <w:pStyle w:val="NormalWeb"/>
+        <w:jc w:val="both"/>
+      </w:pPr>
+    </w:p>
+    <w:p>
+      <w:pPr>
+        <w:pStyle w:val="NormalWeb"/>
+        <w:jc w:val="both"/>
+      </w:pPr>
+    </w:p>
+    <w:p>
+      <w:pPr>
+        <w:pStyle w:val="NormalWeb"/>
+        <w:jc w:val="both"/>
+      </w:pPr>
+    </w:p>
+    <w:p>
+      <w:pPr>
+        <w:pStyle w:val="NormalWeb"/>
+        <w:jc w:val="both"/>
+      </w:pPr>
+    </w:p>
+    <w:p>
+      <w:pPr>
+        <w:pStyle w:val="NormalWeb"/>
+        <w:jc w:val="both"/>
+      </w:pPr>
+    </w:p>
+    <w:p>
+      <w:pPr>
+        <w:pStyle w:val="NormalWeb"/>
+        <w:jc w:val="both"/>
+      </w:pPr>
+    </w:p>
+    <w:p>
+      <w:pPr>
+        <w:pStyle w:val="NormalWeb"/>
+        <w:jc w:val="both"/>
+      </w:pPr>
+    </w:p>
+    <w:p>
+      <w:pPr>
+        <w:pStyle w:val="NormalWeb"/>
+        <w:jc w:val="both"/>
+      </w:pPr>
+    </w:p>
+    <w:p>
+      <w:pPr>
+        <w:pStyle w:val="NormalWeb"/>
+        <w:jc w:val="both"/>
+      </w:pPr>
+    </w:p>
+    <w:p>
+      <w:pPr>
+        <w:pStyle w:val="NormalWeb"/>
+        <w:jc w:val="both"/>
+      </w:pPr>
+    </w:p>
+    <w:p>
+      <w:pPr>
+        <w:pStyle w:val="NormalWeb"/>
+        <w:jc w:val="both"/>
+      </w:pPr>
+    </w:p>
+    <w:p>
+      <w:pPr>
+        <w:pStyle w:val="NormalWeb"/>
+        <w:jc w:val="both"/>
+      </w:pPr>
+    </w:p>
+    <w:p>
+      <w:pPr>
+        <w:pStyle w:val="NormalWeb"/>
+        <w:jc w:val="both"/>
+      </w:pPr>
+    </w:p>
+    <w:p>
+      <w:pPr>
+        <w:pStyle w:val="NormalWeb"/>
+        <w:jc w:val="both"/>
+      </w:pPr>
+    </w:p>
+    <w:p>
+      <w:pPr>
+        <w:pStyle w:val="NormalWeb"/>
+        <w:jc w:val="both"/>
+      </w:pPr>
+    </w:p>
+    <w:p>
+      <w:pPr>
+        <w:pStyle w:val="NormalWeb"/>
+        <w:jc w:val="both"/>
+      </w:pPr>
     </w:p>
     <w:p>
       <w:pPr>
@@ -2922,6 +5140,7 @@
           <w:sz w:val="24"/>
           <w:szCs w:val="24"/>
         </w:rPr>
+        <w:lastRenderedPageBreak/>
         <w:t>UI / W</w:t>
       </w:r>
       <w:r>
@@ -2954,8 +5173,18 @@
           <w:sz w:val="24"/>
           <w:szCs w:val="24"/>
         </w:rPr>
-        <w:t xml:space="preserve"> using Figma</w:t>
-      </w:r>
+        <w:t xml:space="preserve"> using </w:t>
+      </w:r>
+      <w:proofErr w:type="spellStart"/>
+      <w:r>
+        <w:rPr>
+          <w:rFonts w:ascii="Times New Roman" w:hAnsi="Times New Roman"/>
+          <w:sz w:val="24"/>
+          <w:szCs w:val="24"/>
+        </w:rPr>
+        <w:t>Figma</w:t>
+      </w:r>
+      <w:proofErr w:type="spellEnd"/>
     </w:p>
     <w:p>
       <w:pPr>
@@ -3067,6 +5296,234 @@
       <w:r>
         <w:t xml:space="preserve"> link to your design as part of the report submission.</w:t>
       </w:r>
+    </w:p>
+    <w:p>
+      <w:pPr>
+        <w:pStyle w:val="NormalWeb"/>
+        <w:jc w:val="both"/>
+      </w:pPr>
+    </w:p>
+    <w:p>
+      <w:pPr>
+        <w:pStyle w:val="NormalWeb"/>
+        <w:jc w:val="both"/>
+      </w:pPr>
+    </w:p>
+    <w:p>
+      <w:pPr>
+        <w:pStyle w:val="NormalWeb"/>
+        <w:jc w:val="both"/>
+      </w:pPr>
+    </w:p>
+    <w:p>
+      <w:pPr>
+        <w:pStyle w:val="NormalWeb"/>
+        <w:jc w:val="both"/>
+      </w:pPr>
+    </w:p>
+    <w:p>
+      <w:pPr>
+        <w:pStyle w:val="NormalWeb"/>
+        <w:jc w:val="both"/>
+      </w:pPr>
+    </w:p>
+    <w:p>
+      <w:pPr>
+        <w:pStyle w:val="NormalWeb"/>
+        <w:jc w:val="both"/>
+      </w:pPr>
+    </w:p>
+    <w:p>
+      <w:pPr>
+        <w:pStyle w:val="NormalWeb"/>
+        <w:jc w:val="both"/>
+      </w:pPr>
+    </w:p>
+    <w:p>
+      <w:pPr>
+        <w:pStyle w:val="NormalWeb"/>
+        <w:jc w:val="both"/>
+      </w:pPr>
+    </w:p>
+    <w:p>
+      <w:pPr>
+        <w:pStyle w:val="NormalWeb"/>
+        <w:jc w:val="both"/>
+      </w:pPr>
+    </w:p>
+    <w:p>
+      <w:pPr>
+        <w:pStyle w:val="NormalWeb"/>
+        <w:jc w:val="both"/>
+      </w:pPr>
+    </w:p>
+    <w:p>
+      <w:pPr>
+        <w:pStyle w:val="NormalWeb"/>
+        <w:jc w:val="both"/>
+      </w:pPr>
+    </w:p>
+    <w:p>
+      <w:pPr>
+        <w:pStyle w:val="NormalWeb"/>
+        <w:jc w:val="both"/>
+      </w:pPr>
+    </w:p>
+    <w:p>
+      <w:pPr>
+        <w:pStyle w:val="NormalWeb"/>
+        <w:jc w:val="both"/>
+      </w:pPr>
+    </w:p>
+    <w:p>
+      <w:pPr>
+        <w:pStyle w:val="NormalWeb"/>
+        <w:jc w:val="both"/>
+      </w:pPr>
+    </w:p>
+    <w:p>
+      <w:pPr>
+        <w:pStyle w:val="NormalWeb"/>
+        <w:jc w:val="both"/>
+      </w:pPr>
+    </w:p>
+    <w:p>
+      <w:pPr>
+        <w:pStyle w:val="NormalWeb"/>
+        <w:jc w:val="both"/>
+      </w:pPr>
+    </w:p>
+    <w:p>
+      <w:pPr>
+        <w:pStyle w:val="NormalWeb"/>
+        <w:jc w:val="both"/>
+      </w:pPr>
+    </w:p>
+    <w:p>
+      <w:pPr>
+        <w:pStyle w:val="NormalWeb"/>
+        <w:jc w:val="both"/>
+      </w:pPr>
+    </w:p>
+    <w:p>
+      <w:pPr>
+        <w:pStyle w:val="NormalWeb"/>
+        <w:jc w:val="both"/>
+      </w:pPr>
+    </w:p>
+    <w:p>
+      <w:pPr>
+        <w:pStyle w:val="NormalWeb"/>
+        <w:jc w:val="both"/>
+      </w:pPr>
+    </w:p>
+    <w:p>
+      <w:pPr>
+        <w:pStyle w:val="NormalWeb"/>
+        <w:jc w:val="both"/>
+      </w:pPr>
+    </w:p>
+    <w:p>
+      <w:pPr>
+        <w:pStyle w:val="NormalWeb"/>
+        <w:jc w:val="both"/>
+      </w:pPr>
+    </w:p>
+    <w:p>
+      <w:pPr>
+        <w:pStyle w:val="NormalWeb"/>
+        <w:jc w:val="both"/>
+      </w:pPr>
+    </w:p>
+    <w:p>
+      <w:pPr>
+        <w:pStyle w:val="NormalWeb"/>
+        <w:jc w:val="both"/>
+      </w:pPr>
+    </w:p>
+    <w:p>
+      <w:pPr>
+        <w:pStyle w:val="NormalWeb"/>
+        <w:jc w:val="both"/>
+      </w:pPr>
+    </w:p>
+    <w:p>
+      <w:pPr>
+        <w:pStyle w:val="NormalWeb"/>
+        <w:jc w:val="both"/>
+      </w:pPr>
+    </w:p>
+    <w:p>
+      <w:pPr>
+        <w:pStyle w:val="NormalWeb"/>
+        <w:jc w:val="both"/>
+      </w:pPr>
+    </w:p>
+    <w:p>
+      <w:pPr>
+        <w:pStyle w:val="NormalWeb"/>
+        <w:jc w:val="both"/>
+      </w:pPr>
+    </w:p>
+    <w:p>
+      <w:pPr>
+        <w:pStyle w:val="NormalWeb"/>
+        <w:jc w:val="both"/>
+      </w:pPr>
+    </w:p>
+    <w:p>
+      <w:pPr>
+        <w:pStyle w:val="NormalWeb"/>
+        <w:jc w:val="both"/>
+      </w:pPr>
+    </w:p>
+    <w:p>
+      <w:pPr>
+        <w:pStyle w:val="NormalWeb"/>
+        <w:jc w:val="both"/>
+      </w:pPr>
+    </w:p>
+    <w:p>
+      <w:pPr>
+        <w:pStyle w:val="NormalWeb"/>
+        <w:jc w:val="both"/>
+      </w:pPr>
+    </w:p>
+    <w:p>
+      <w:pPr>
+        <w:pStyle w:val="NormalWeb"/>
+        <w:jc w:val="both"/>
+      </w:pPr>
+    </w:p>
+    <w:p>
+      <w:pPr>
+        <w:pStyle w:val="NormalWeb"/>
+        <w:jc w:val="both"/>
+      </w:pPr>
+    </w:p>
+    <w:p>
+      <w:pPr>
+        <w:pStyle w:val="NormalWeb"/>
+        <w:jc w:val="both"/>
+      </w:pPr>
+    </w:p>
+    <w:p>
+      <w:pPr>
+        <w:pStyle w:val="NormalWeb"/>
+        <w:jc w:val="both"/>
+      </w:pPr>
+    </w:p>
+    <w:p>
+      <w:pPr>
+        <w:pStyle w:val="NormalWeb"/>
+        <w:jc w:val="both"/>
+      </w:pPr>
+    </w:p>
+    <w:p>
+      <w:pPr>
+        <w:pStyle w:val="NormalWeb"/>
+        <w:jc w:val="both"/>
+      </w:pPr>
     </w:p>
     <w:p>
       <w:pPr>
@@ -3142,7 +5599,6 @@
           <w:sz w:val="26"/>
           <w:szCs w:val="26"/>
         </w:rPr>
-        <w:lastRenderedPageBreak/>
         <w:t xml:space="preserve">4. </w:t>
       </w:r>
       <w:r>
@@ -3394,7 +5850,6 @@
           <w:sz w:val="26"/>
           <w:szCs w:val="26"/>
         </w:rPr>
-        <w:lastRenderedPageBreak/>
         <w:t xml:space="preserve">5. SOFTWARE </w:t>
       </w:r>
       <w:r>
@@ -3744,6 +6199,7 @@
           <w:highlight w:val="cyan"/>
           <w:u w:val="single"/>
         </w:rPr>
+        <w:lastRenderedPageBreak/>
         <w:t>Instructions:</w:t>
       </w:r>
     </w:p>
@@ -3754,7 +6210,7 @@
           <w:ilvl w:val="0"/>
           <w:numId w:val="46"/>
         </w:numPr>
-        <w:jc w:val="both"/>
+        <w:spacing w:before="240" w:line="360" w:lineRule="auto"/>
         <w:rPr>
           <w:rFonts w:ascii="Times New Roman" w:hAnsi="Times New Roman" w:cs="Times New Roman"/>
           <w:bCs/>
@@ -3783,7 +6239,7 @@
           <w:ilvl w:val="0"/>
           <w:numId w:val="46"/>
         </w:numPr>
-        <w:jc w:val="both"/>
+        <w:spacing w:before="240" w:line="360" w:lineRule="auto"/>
         <w:rPr>
           <w:rFonts w:ascii="Times New Roman" w:hAnsi="Times New Roman" w:cs="Times New Roman"/>
           <w:bCs/>
@@ -3802,7 +6258,31 @@
           <w:szCs w:val="24"/>
           <w:highlight w:val="cyan"/>
         </w:rPr>
-        <w:t xml:space="preserve">Font: Times New Roman ; Size: 12; Justify the para [Ctrl + J]. </w:t>
+        <w:t xml:space="preserve">Font: Times New </w:t>
+      </w:r>
+      <w:proofErr w:type="gramStart"/>
+      <w:r>
+        <w:rPr>
+          <w:rFonts w:ascii="Times New Roman" w:hAnsi="Times New Roman" w:cs="Times New Roman"/>
+          <w:bCs/>
+          <w:color w:val="0D0D0D" w:themeColor="text1" w:themeTint="F2"/>
+          <w:sz w:val="24"/>
+          <w:szCs w:val="24"/>
+          <w:highlight w:val="cyan"/>
+        </w:rPr>
+        <w:t>Roman ;</w:t>
+      </w:r>
+      <w:proofErr w:type="gramEnd"/>
+      <w:r>
+        <w:rPr>
+          <w:rFonts w:ascii="Times New Roman" w:hAnsi="Times New Roman" w:cs="Times New Roman"/>
+          <w:bCs/>
+          <w:color w:val="0D0D0D" w:themeColor="text1" w:themeTint="F2"/>
+          <w:sz w:val="24"/>
+          <w:szCs w:val="24"/>
+          <w:highlight w:val="cyan"/>
+        </w:rPr>
+        <w:t xml:space="preserve"> Size: 12; Justify the para [Ctrl + J]. </w:t>
       </w:r>
     </w:p>
     <w:p>
@@ -3812,6 +6292,7 @@
           <w:ilvl w:val="0"/>
           <w:numId w:val="46"/>
         </w:numPr>
+        <w:spacing w:before="240" w:line="360" w:lineRule="auto"/>
         <w:rPr>
           <w:rFonts w:ascii="Times New Roman" w:hAnsi="Times New Roman" w:cs="Times New Roman"/>
           <w:bCs/>
@@ -3884,6 +6365,7 @@
           <w:ilvl w:val="0"/>
           <w:numId w:val="46"/>
         </w:numPr>
+        <w:spacing w:before="240" w:line="360" w:lineRule="auto"/>
         <w:rPr>
           <w:rFonts w:ascii="Times New Roman" w:hAnsi="Times New Roman" w:cs="Times New Roman"/>
           <w:bCs/>
@@ -3915,6 +6397,8 @@
         </w:rPr>
         <w:t>.</w:t>
       </w:r>
+      <w:bookmarkStart w:id="0" w:name="_GoBack"/>
+      <w:bookmarkEnd w:id="0"/>
     </w:p>
     <w:p>
       <w:pPr>
@@ -4069,7 +6553,7 @@
 </file>
 
 <file path=word/endnotes.xml><?xml version="1.0" encoding="utf-8"?>
-<w:endnotes xmlns:wpc="http://schemas.microsoft.com/office/word/2010/wordprocessingCanvas" xmlns:cx="http://schemas.microsoft.com/office/drawing/2014/chartex" xmlns:cx1="http://schemas.microsoft.com/office/drawing/2015/9/8/chartex" xmlns:cx2="http://schemas.microsoft.com/office/drawing/2015/10/21/chartex" xmlns:cx3="http://schemas.microsoft.com/office/drawing/2016/5/9/chartex" xmlns:cx4="http://schemas.microsoft.com/office/drawing/2016/5/10/chartex" xmlns:cx5="http://schemas.microsoft.com/office/drawing/2016/5/11/chartex" xmlns:cx6="http://schemas.microsoft.com/office/drawing/2016/5/12/chartex" xmlns:cx7="http://schemas.microsoft.com/office/drawing/2016/5/13/chartex" xmlns:cx8="http://schemas.microsoft.com/office/drawing/2016/5/14/chartex" xmlns:mc="http://schemas.openxmlformats.org/markup-compatibility/2006" xmlns:aink="http://schemas.microsoft.com/office/drawing/2016/ink" xmlns:am3d="http://schemas.microsoft.com/office/drawing/2017/model3d" xmlns:o="urn:schemas-microsoft-com:office:office" xmlns:oel="http://schemas.microsoft.com/office/2019/extlst" xmlns:r="http://schemas.openxmlformats.org/officeDocument/2006/relationships" xmlns:m="http://schemas.openxmlformats.org/officeDocument/2006/math" xmlns:v="urn:schemas-microsoft-com:vml" xmlns:wp14="http://schemas.microsoft.com/office/word/2010/wordprocessingDrawing" xmlns:wp="http://schemas.openxmlformats.org/drawingml/2006/wordprocessingDrawing" xmlns:w10="urn:schemas-microsoft-com:office:word" xmlns:w="http://schemas.openxmlformats.org/wordprocessingml/2006/main" xmlns:w14="http://schemas.microsoft.com/office/word/2010/wordml" xmlns:w15="http://schemas.microsoft.com/office/word/2012/wordml" xmlns:w16cex="http://schemas.microsoft.com/office/word/2018/wordml/cex" xmlns:w16cid="http://schemas.microsoft.com/office/word/2016/wordml/cid" xmlns:w16="http://schemas.microsoft.com/office/word/2018/wordml" xmlns:w16du="http://schemas.microsoft.com/office/word/2023/wordml/word16du" xmlns:w16sdtdh="http://schemas.microsoft.com/office/word/2020/wordml/sdtdatahash" xmlns:w16sdtfl="http://schemas.microsoft.com/office/word/2024/wordml/sdtformatlock" xmlns:w16se="http://schemas.microsoft.com/office/word/2015/wordml/symex" xmlns:wpg="http://schemas.microsoft.com/office/word/2010/wordprocessingGroup" xmlns:wpi="http://schemas.microsoft.com/office/word/2010/wordprocessingInk" xmlns:wne="http://schemas.microsoft.com/office/word/2006/wordml" xmlns:wps="http://schemas.microsoft.com/office/word/2010/wordprocessingShape" mc:Ignorable="w14 w15 w16se w16cid w16 w16cex w16sdtdh w16sdtfl w16du wp14">
+<w:endnotes xmlns:wpc="http://schemas.microsoft.com/office/word/2010/wordprocessingCanvas" xmlns:cx="http://schemas.microsoft.com/office/drawing/2014/chartex" xmlns:cx1="http://schemas.microsoft.com/office/drawing/2015/9/8/chartex" xmlns:cx2="http://schemas.microsoft.com/office/drawing/2015/10/21/chartex" xmlns:cx3="http://schemas.microsoft.com/office/drawing/2016/5/9/chartex" xmlns:cx4="http://schemas.microsoft.com/office/drawing/2016/5/10/chartex" xmlns:cx5="http://schemas.microsoft.com/office/drawing/2016/5/11/chartex" xmlns:cx6="http://schemas.microsoft.com/office/drawing/2016/5/12/chartex" xmlns:cx7="http://schemas.microsoft.com/office/drawing/2016/5/13/chartex" xmlns:cx8="http://schemas.microsoft.com/office/drawing/2016/5/14/chartex" xmlns:mc="http://schemas.openxmlformats.org/markup-compatibility/2006" xmlns:aink="http://schemas.microsoft.com/office/drawing/2016/ink" xmlns:am3d="http://schemas.microsoft.com/office/drawing/2017/model3d" xmlns:o="urn:schemas-microsoft-com:office:office" xmlns:r="http://schemas.openxmlformats.org/officeDocument/2006/relationships" xmlns:m="http://schemas.openxmlformats.org/officeDocument/2006/math" xmlns:v="urn:schemas-microsoft-com:vml" xmlns:wp14="http://schemas.microsoft.com/office/word/2010/wordprocessingDrawing" xmlns:wp="http://schemas.openxmlformats.org/drawingml/2006/wordprocessingDrawing" xmlns:w10="urn:schemas-microsoft-com:office:word" xmlns:w="http://schemas.openxmlformats.org/wordprocessingml/2006/main" xmlns:w14="http://schemas.microsoft.com/office/word/2010/wordml" xmlns:w15="http://schemas.microsoft.com/office/word/2012/wordml" xmlns:w16cid="http://schemas.microsoft.com/office/word/2016/wordml/cid" xmlns:w16se="http://schemas.microsoft.com/office/word/2015/wordml/symex" xmlns:wpg="http://schemas.microsoft.com/office/word/2010/wordprocessingGroup" xmlns:wpi="http://schemas.microsoft.com/office/word/2010/wordprocessingInk" xmlns:wne="http://schemas.microsoft.com/office/word/2006/wordml" xmlns:wps="http://schemas.microsoft.com/office/word/2010/wordprocessingShape" mc:Ignorable="w14 w15 w16se w16cid wp14">
   <w:endnote w:type="separator" w:id="-1">
     <w:p>
       <w:pPr>
@@ -4094,7 +6578,7 @@
 </file>
 
 <file path=word/footer1.xml><?xml version="1.0" encoding="utf-8"?>
-<w:ftr xmlns:wpc="http://schemas.microsoft.com/office/word/2010/wordprocessingCanvas" xmlns:cx="http://schemas.microsoft.com/office/drawing/2014/chartex" xmlns:cx1="http://schemas.microsoft.com/office/drawing/2015/9/8/chartex" xmlns:cx2="http://schemas.microsoft.com/office/drawing/2015/10/21/chartex" xmlns:cx3="http://schemas.microsoft.com/office/drawing/2016/5/9/chartex" xmlns:cx4="http://schemas.microsoft.com/office/drawing/2016/5/10/chartex" xmlns:cx5="http://schemas.microsoft.com/office/drawing/2016/5/11/chartex" xmlns:cx6="http://schemas.microsoft.com/office/drawing/2016/5/12/chartex" xmlns:cx7="http://schemas.microsoft.com/office/drawing/2016/5/13/chartex" xmlns:cx8="http://schemas.microsoft.com/office/drawing/2016/5/14/chartex" xmlns:mc="http://schemas.openxmlformats.org/markup-compatibility/2006" xmlns:aink="http://schemas.microsoft.com/office/drawing/2016/ink" xmlns:am3d="http://schemas.microsoft.com/office/drawing/2017/model3d" xmlns:o="urn:schemas-microsoft-com:office:office" xmlns:oel="http://schemas.microsoft.com/office/2019/extlst" xmlns:r="http://schemas.openxmlformats.org/officeDocument/2006/relationships" xmlns:m="http://schemas.openxmlformats.org/officeDocument/2006/math" xmlns:v="urn:schemas-microsoft-com:vml" xmlns:wp14="http://schemas.microsoft.com/office/word/2010/wordprocessingDrawing" xmlns:wp="http://schemas.openxmlformats.org/drawingml/2006/wordprocessingDrawing" xmlns:w10="urn:schemas-microsoft-com:office:word" xmlns:w="http://schemas.openxmlformats.org/wordprocessingml/2006/main" xmlns:w14="http://schemas.microsoft.com/office/word/2010/wordml" xmlns:w15="http://schemas.microsoft.com/office/word/2012/wordml" xmlns:w16cex="http://schemas.microsoft.com/office/word/2018/wordml/cex" xmlns:w16cid="http://schemas.microsoft.com/office/word/2016/wordml/cid" xmlns:w16="http://schemas.microsoft.com/office/word/2018/wordml" xmlns:w16du="http://schemas.microsoft.com/office/word/2023/wordml/word16du" xmlns:w16sdtdh="http://schemas.microsoft.com/office/word/2020/wordml/sdtdatahash" xmlns:w16sdtfl="http://schemas.microsoft.com/office/word/2024/wordml/sdtformatlock" xmlns:w16se="http://schemas.microsoft.com/office/word/2015/wordml/symex" xmlns:wpg="http://schemas.microsoft.com/office/word/2010/wordprocessingGroup" xmlns:wpi="http://schemas.microsoft.com/office/word/2010/wordprocessingInk" xmlns:wne="http://schemas.microsoft.com/office/word/2006/wordml" xmlns:wps="http://schemas.microsoft.com/office/word/2010/wordprocessingShape" mc:Ignorable="w14 w15 w16se w16cid w16 w16cex w16sdtdh w16sdtfl w16du wp14">
+<w:ftr xmlns:wpc="http://schemas.microsoft.com/office/word/2010/wordprocessingCanvas" xmlns:cx="http://schemas.microsoft.com/office/drawing/2014/chartex" xmlns:cx1="http://schemas.microsoft.com/office/drawing/2015/9/8/chartex" xmlns:cx2="http://schemas.microsoft.com/office/drawing/2015/10/21/chartex" xmlns:cx3="http://schemas.microsoft.com/office/drawing/2016/5/9/chartex" xmlns:cx4="http://schemas.microsoft.com/office/drawing/2016/5/10/chartex" xmlns:cx5="http://schemas.microsoft.com/office/drawing/2016/5/11/chartex" xmlns:cx6="http://schemas.microsoft.com/office/drawing/2016/5/12/chartex" xmlns:cx7="http://schemas.microsoft.com/office/drawing/2016/5/13/chartex" xmlns:cx8="http://schemas.microsoft.com/office/drawing/2016/5/14/chartex" xmlns:mc="http://schemas.openxmlformats.org/markup-compatibility/2006" xmlns:aink="http://schemas.microsoft.com/office/drawing/2016/ink" xmlns:am3d="http://schemas.microsoft.com/office/drawing/2017/model3d" xmlns:o="urn:schemas-microsoft-com:office:office" xmlns:r="http://schemas.openxmlformats.org/officeDocument/2006/relationships" xmlns:m="http://schemas.openxmlformats.org/officeDocument/2006/math" xmlns:v="urn:schemas-microsoft-com:vml" xmlns:wp14="http://schemas.microsoft.com/office/word/2010/wordprocessingDrawing" xmlns:wp="http://schemas.openxmlformats.org/drawingml/2006/wordprocessingDrawing" xmlns:w10="urn:schemas-microsoft-com:office:word" xmlns:w="http://schemas.openxmlformats.org/wordprocessingml/2006/main" xmlns:w14="http://schemas.microsoft.com/office/word/2010/wordml" xmlns:w15="http://schemas.microsoft.com/office/word/2012/wordml" xmlns:w16cid="http://schemas.microsoft.com/office/word/2016/wordml/cid" xmlns:w16se="http://schemas.microsoft.com/office/word/2015/wordml/symex" xmlns:wpg="http://schemas.microsoft.com/office/word/2010/wordprocessingGroup" xmlns:wpi="http://schemas.microsoft.com/office/word/2010/wordprocessingInk" xmlns:wne="http://schemas.microsoft.com/office/word/2006/wordml" xmlns:wps="http://schemas.microsoft.com/office/word/2010/wordprocessingShape" mc:Ignorable="w14 w15 w16se w16cid wp14">
   <w:sdt>
     <w:sdtPr>
       <w:id w:val="-667026031"/>
@@ -4103,6 +6587,7 @@
         <w:docPartUnique/>
       </w:docPartObj>
     </w:sdtPr>
+    <w:sdtEndPr/>
     <w:sdtContent>
       <w:sdt>
         <w:sdtPr>
@@ -4112,6 +6597,7 @@
             <w:docPartUnique/>
           </w:docPartObj>
         </w:sdtPr>
+        <w:sdtEndPr/>
         <w:sdtContent>
           <w:p>
             <w:pPr>
@@ -4222,7 +6708,7 @@
 </file>
 
 <file path=word/footnotes.xml><?xml version="1.0" encoding="utf-8"?>
-<w:footnotes xmlns:wpc="http://schemas.microsoft.com/office/word/2010/wordprocessingCanvas" xmlns:cx="http://schemas.microsoft.com/office/drawing/2014/chartex" xmlns:cx1="http://schemas.microsoft.com/office/drawing/2015/9/8/chartex" xmlns:cx2="http://schemas.microsoft.com/office/drawing/2015/10/21/chartex" xmlns:cx3="http://schemas.microsoft.com/office/drawing/2016/5/9/chartex" xmlns:cx4="http://schemas.microsoft.com/office/drawing/2016/5/10/chartex" xmlns:cx5="http://schemas.microsoft.com/office/drawing/2016/5/11/chartex" xmlns:cx6="http://schemas.microsoft.com/office/drawing/2016/5/12/chartex" xmlns:cx7="http://schemas.microsoft.com/office/drawing/2016/5/13/chartex" xmlns:cx8="http://schemas.microsoft.com/office/drawing/2016/5/14/chartex" xmlns:mc="http://schemas.openxmlformats.org/markup-compatibility/2006" xmlns:aink="http://schemas.microsoft.com/office/drawing/2016/ink" xmlns:am3d="http://schemas.microsoft.com/office/drawing/2017/model3d" xmlns:o="urn:schemas-microsoft-com:office:office" xmlns:oel="http://schemas.microsoft.com/office/2019/extlst" xmlns:r="http://schemas.openxmlformats.org/officeDocument/2006/relationships" xmlns:m="http://schemas.openxmlformats.org/officeDocument/2006/math" xmlns:v="urn:schemas-microsoft-com:vml" xmlns:wp14="http://schemas.microsoft.com/office/word/2010/wordprocessingDrawing" xmlns:wp="http://schemas.openxmlformats.org/drawingml/2006/wordprocessingDrawing" xmlns:w10="urn:schemas-microsoft-com:office:word" xmlns:w="http://schemas.openxmlformats.org/wordprocessingml/2006/main" xmlns:w14="http://schemas.microsoft.com/office/word/2010/wordml" xmlns:w15="http://schemas.microsoft.com/office/word/2012/wordml" xmlns:w16cex="http://schemas.microsoft.com/office/word/2018/wordml/cex" xmlns:w16cid="http://schemas.microsoft.com/office/word/2016/wordml/cid" xmlns:w16="http://schemas.microsoft.com/office/word/2018/wordml" xmlns:w16du="http://schemas.microsoft.com/office/word/2023/wordml/word16du" xmlns:w16sdtdh="http://schemas.microsoft.com/office/word/2020/wordml/sdtdatahash" xmlns:w16sdtfl="http://schemas.microsoft.com/office/word/2024/wordml/sdtformatlock" xmlns:w16se="http://schemas.microsoft.com/office/word/2015/wordml/symex" xmlns:wpg="http://schemas.microsoft.com/office/word/2010/wordprocessingGroup" xmlns:wpi="http://schemas.microsoft.com/office/word/2010/wordprocessingInk" xmlns:wne="http://schemas.microsoft.com/office/word/2006/wordml" xmlns:wps="http://schemas.microsoft.com/office/word/2010/wordprocessingShape" mc:Ignorable="w14 w15 w16se w16cid w16 w16cex w16sdtdh w16sdtfl w16du wp14">
+<w:footnotes xmlns:wpc="http://schemas.microsoft.com/office/word/2010/wordprocessingCanvas" xmlns:cx="http://schemas.microsoft.com/office/drawing/2014/chartex" xmlns:cx1="http://schemas.microsoft.com/office/drawing/2015/9/8/chartex" xmlns:cx2="http://schemas.microsoft.com/office/drawing/2015/10/21/chartex" xmlns:cx3="http://schemas.microsoft.com/office/drawing/2016/5/9/chartex" xmlns:cx4="http://schemas.microsoft.com/office/drawing/2016/5/10/chartex" xmlns:cx5="http://schemas.microsoft.com/office/drawing/2016/5/11/chartex" xmlns:cx6="http://schemas.microsoft.com/office/drawing/2016/5/12/chartex" xmlns:cx7="http://schemas.microsoft.com/office/drawing/2016/5/13/chartex" xmlns:cx8="http://schemas.microsoft.com/office/drawing/2016/5/14/chartex" xmlns:mc="http://schemas.openxmlformats.org/markup-compatibility/2006" xmlns:aink="http://schemas.microsoft.com/office/drawing/2016/ink" xmlns:am3d="http://schemas.microsoft.com/office/drawing/2017/model3d" xmlns:o="urn:schemas-microsoft-com:office:office" xmlns:r="http://schemas.openxmlformats.org/officeDocument/2006/relationships" xmlns:m="http://schemas.openxmlformats.org/officeDocument/2006/math" xmlns:v="urn:schemas-microsoft-com:vml" xmlns:wp14="http://schemas.microsoft.com/office/word/2010/wordprocessingDrawing" xmlns:wp="http://schemas.openxmlformats.org/drawingml/2006/wordprocessingDrawing" xmlns:w10="urn:schemas-microsoft-com:office:word" xmlns:w="http://schemas.openxmlformats.org/wordprocessingml/2006/main" xmlns:w14="http://schemas.microsoft.com/office/word/2010/wordml" xmlns:w15="http://schemas.microsoft.com/office/word/2012/wordml" xmlns:w16cid="http://schemas.microsoft.com/office/word/2016/wordml/cid" xmlns:w16se="http://schemas.microsoft.com/office/word/2015/wordml/symex" xmlns:wpg="http://schemas.microsoft.com/office/word/2010/wordprocessingGroup" xmlns:wpi="http://schemas.microsoft.com/office/word/2010/wordprocessingInk" xmlns:wne="http://schemas.microsoft.com/office/word/2006/wordml" xmlns:wps="http://schemas.microsoft.com/office/word/2010/wordprocessingShape" mc:Ignorable="w14 w15 w16se w16cid wp14">
   <w:footnote w:type="separator" w:id="-1">
     <w:p>
       <w:pPr>
@@ -4247,7 +6733,7 @@
 </file>
 
 <file path=word/header1.xml><?xml version="1.0" encoding="utf-8"?>
-<w:hdr xmlns:wpc="http://schemas.microsoft.com/office/word/2010/wordprocessingCanvas" xmlns:cx="http://schemas.microsoft.com/office/drawing/2014/chartex" xmlns:cx1="http://schemas.microsoft.com/office/drawing/2015/9/8/chartex" xmlns:cx2="http://schemas.microsoft.com/office/drawing/2015/10/21/chartex" xmlns:cx3="http://schemas.microsoft.com/office/drawing/2016/5/9/chartex" xmlns:cx4="http://schemas.microsoft.com/office/drawing/2016/5/10/chartex" xmlns:cx5="http://schemas.microsoft.com/office/drawing/2016/5/11/chartex" xmlns:cx6="http://schemas.microsoft.com/office/drawing/2016/5/12/chartex" xmlns:cx7="http://schemas.microsoft.com/office/drawing/2016/5/13/chartex" xmlns:cx8="http://schemas.microsoft.com/office/drawing/2016/5/14/chartex" xmlns:mc="http://schemas.openxmlformats.org/markup-compatibility/2006" xmlns:aink="http://schemas.microsoft.com/office/drawing/2016/ink" xmlns:am3d="http://schemas.microsoft.com/office/drawing/2017/model3d" xmlns:o="urn:schemas-microsoft-com:office:office" xmlns:oel="http://schemas.microsoft.com/office/2019/extlst" xmlns:r="http://schemas.openxmlformats.org/officeDocument/2006/relationships" xmlns:m="http://schemas.openxmlformats.org/officeDocument/2006/math" xmlns:v="urn:schemas-microsoft-com:vml" xmlns:wp14="http://schemas.microsoft.com/office/word/2010/wordprocessingDrawing" xmlns:wp="http://schemas.openxmlformats.org/drawingml/2006/wordprocessingDrawing" xmlns:w10="urn:schemas-microsoft-com:office:word" xmlns:w="http://schemas.openxmlformats.org/wordprocessingml/2006/main" xmlns:w14="http://schemas.microsoft.com/office/word/2010/wordml" xmlns:w15="http://schemas.microsoft.com/office/word/2012/wordml" xmlns:w16cex="http://schemas.microsoft.com/office/word/2018/wordml/cex" xmlns:w16cid="http://schemas.microsoft.com/office/word/2016/wordml/cid" xmlns:w16="http://schemas.microsoft.com/office/word/2018/wordml" xmlns:w16du="http://schemas.microsoft.com/office/word/2023/wordml/word16du" xmlns:w16sdtdh="http://schemas.microsoft.com/office/word/2020/wordml/sdtdatahash" xmlns:w16sdtfl="http://schemas.microsoft.com/office/word/2024/wordml/sdtformatlock" xmlns:w16se="http://schemas.microsoft.com/office/word/2015/wordml/symex" xmlns:wpg="http://schemas.microsoft.com/office/word/2010/wordprocessingGroup" xmlns:wpi="http://schemas.microsoft.com/office/word/2010/wordprocessingInk" xmlns:wne="http://schemas.microsoft.com/office/word/2006/wordml" xmlns:wps="http://schemas.microsoft.com/office/word/2010/wordprocessingShape" mc:Ignorable="w14 w15 w16se w16cid w16 w16cex w16sdtdh w16sdtfl w16du wp14">
+<w:hdr xmlns:wpc="http://schemas.microsoft.com/office/word/2010/wordprocessingCanvas" xmlns:cx="http://schemas.microsoft.com/office/drawing/2014/chartex" xmlns:cx1="http://schemas.microsoft.com/office/drawing/2015/9/8/chartex" xmlns:cx2="http://schemas.microsoft.com/office/drawing/2015/10/21/chartex" xmlns:cx3="http://schemas.microsoft.com/office/drawing/2016/5/9/chartex" xmlns:cx4="http://schemas.microsoft.com/office/drawing/2016/5/10/chartex" xmlns:cx5="http://schemas.microsoft.com/office/drawing/2016/5/11/chartex" xmlns:cx6="http://schemas.microsoft.com/office/drawing/2016/5/12/chartex" xmlns:cx7="http://schemas.microsoft.com/office/drawing/2016/5/13/chartex" xmlns:cx8="http://schemas.microsoft.com/office/drawing/2016/5/14/chartex" xmlns:mc="http://schemas.openxmlformats.org/markup-compatibility/2006" xmlns:aink="http://schemas.microsoft.com/office/drawing/2016/ink" xmlns:am3d="http://schemas.microsoft.com/office/drawing/2017/model3d" xmlns:o="urn:schemas-microsoft-com:office:office" xmlns:r="http://schemas.openxmlformats.org/officeDocument/2006/relationships" xmlns:m="http://schemas.openxmlformats.org/officeDocument/2006/math" xmlns:v="urn:schemas-microsoft-com:vml" xmlns:wp14="http://schemas.microsoft.com/office/word/2010/wordprocessingDrawing" xmlns:wp="http://schemas.openxmlformats.org/drawingml/2006/wordprocessingDrawing" xmlns:w10="urn:schemas-microsoft-com:office:word" xmlns:w="http://schemas.openxmlformats.org/wordprocessingml/2006/main" xmlns:w14="http://schemas.microsoft.com/office/word/2010/wordml" xmlns:w15="http://schemas.microsoft.com/office/word/2012/wordml" xmlns:w16cid="http://schemas.microsoft.com/office/word/2016/wordml/cid" xmlns:w16se="http://schemas.microsoft.com/office/word/2015/wordml/symex" xmlns:wpg="http://schemas.microsoft.com/office/word/2010/wordprocessingGroup" xmlns:wpi="http://schemas.microsoft.com/office/word/2010/wordprocessingInk" xmlns:wne="http://schemas.microsoft.com/office/word/2006/wordml" xmlns:wps="http://schemas.microsoft.com/office/word/2010/wordprocessingShape" mc:Ignorable="w14 w15 w16se w16cid wp14">
   <w:p>
     <w:pPr>
       <w:pStyle w:val="Header"/>
@@ -4263,7 +6749,7 @@
 </file>
 
 <file path=word/numbering.xml><?xml version="1.0" encoding="utf-8"?>
-<w:numbering xmlns:wpc="http://schemas.microsoft.com/office/word/2010/wordprocessingCanvas" xmlns:cx="http://schemas.microsoft.com/office/drawing/2014/chartex" xmlns:cx1="http://schemas.microsoft.com/office/drawing/2015/9/8/chartex" xmlns:cx2="http://schemas.microsoft.com/office/drawing/2015/10/21/chartex" xmlns:cx3="http://schemas.microsoft.com/office/drawing/2016/5/9/chartex" xmlns:cx4="http://schemas.microsoft.com/office/drawing/2016/5/10/chartex" xmlns:cx5="http://schemas.microsoft.com/office/drawing/2016/5/11/chartex" xmlns:cx6="http://schemas.microsoft.com/office/drawing/2016/5/12/chartex" xmlns:cx7="http://schemas.microsoft.com/office/drawing/2016/5/13/chartex" xmlns:cx8="http://schemas.microsoft.com/office/drawing/2016/5/14/chartex" xmlns:mc="http://schemas.openxmlformats.org/markup-compatibility/2006" xmlns:aink="http://schemas.microsoft.com/office/drawing/2016/ink" xmlns:am3d="http://schemas.microsoft.com/office/drawing/2017/model3d" xmlns:o="urn:schemas-microsoft-com:office:office" xmlns:oel="http://schemas.microsoft.com/office/2019/extlst" xmlns:r="http://schemas.openxmlformats.org/officeDocument/2006/relationships" xmlns:m="http://schemas.openxmlformats.org/officeDocument/2006/math" xmlns:v="urn:schemas-microsoft-com:vml" xmlns:wp14="http://schemas.microsoft.com/office/word/2010/wordprocessingDrawing" xmlns:wp="http://schemas.openxmlformats.org/drawingml/2006/wordprocessingDrawing" xmlns:w10="urn:schemas-microsoft-com:office:word" xmlns:w="http://schemas.openxmlformats.org/wordprocessingml/2006/main" xmlns:w14="http://schemas.microsoft.com/office/word/2010/wordml" xmlns:w15="http://schemas.microsoft.com/office/word/2012/wordml" xmlns:w16cex="http://schemas.microsoft.com/office/word/2018/wordml/cex" xmlns:w16cid="http://schemas.microsoft.com/office/word/2016/wordml/cid" xmlns:w16="http://schemas.microsoft.com/office/word/2018/wordml" xmlns:w16du="http://schemas.microsoft.com/office/word/2023/wordml/word16du" xmlns:w16sdtdh="http://schemas.microsoft.com/office/word/2020/wordml/sdtdatahash" xmlns:w16sdtfl="http://schemas.microsoft.com/office/word/2024/wordml/sdtformatlock" xmlns:w16se="http://schemas.microsoft.com/office/word/2015/wordml/symex" xmlns:wpg="http://schemas.microsoft.com/office/word/2010/wordprocessingGroup" xmlns:wpi="http://schemas.microsoft.com/office/word/2010/wordprocessingInk" xmlns:wne="http://schemas.microsoft.com/office/word/2006/wordml" xmlns:wps="http://schemas.microsoft.com/office/word/2010/wordprocessingShape" mc:Ignorable="w14 w15 w16se w16cid w16 w16cex w16sdtdh w16sdtfl w16du wp14">
+<w:numbering xmlns:wpc="http://schemas.microsoft.com/office/word/2010/wordprocessingCanvas" xmlns:cx="http://schemas.microsoft.com/office/drawing/2014/chartex" xmlns:cx1="http://schemas.microsoft.com/office/drawing/2015/9/8/chartex" xmlns:cx2="http://schemas.microsoft.com/office/drawing/2015/10/21/chartex" xmlns:cx3="http://schemas.microsoft.com/office/drawing/2016/5/9/chartex" xmlns:cx4="http://schemas.microsoft.com/office/drawing/2016/5/10/chartex" xmlns:cx5="http://schemas.microsoft.com/office/drawing/2016/5/11/chartex" xmlns:cx6="http://schemas.microsoft.com/office/drawing/2016/5/12/chartex" xmlns:cx7="http://schemas.microsoft.com/office/drawing/2016/5/13/chartex" xmlns:cx8="http://schemas.microsoft.com/office/drawing/2016/5/14/chartex" xmlns:mc="http://schemas.openxmlformats.org/markup-compatibility/2006" xmlns:aink="http://schemas.microsoft.com/office/drawing/2016/ink" xmlns:am3d="http://schemas.microsoft.com/office/drawing/2017/model3d" xmlns:o="urn:schemas-microsoft-com:office:office" xmlns:r="http://schemas.openxmlformats.org/officeDocument/2006/relationships" xmlns:m="http://schemas.openxmlformats.org/officeDocument/2006/math" xmlns:v="urn:schemas-microsoft-com:vml" xmlns:wp14="http://schemas.microsoft.com/office/word/2010/wordprocessingDrawing" xmlns:wp="http://schemas.openxmlformats.org/drawingml/2006/wordprocessingDrawing" xmlns:w10="urn:schemas-microsoft-com:office:word" xmlns:w="http://schemas.openxmlformats.org/wordprocessingml/2006/main" xmlns:w14="http://schemas.microsoft.com/office/word/2010/wordml" xmlns:w15="http://schemas.microsoft.com/office/word/2012/wordml" xmlns:w16cid="http://schemas.microsoft.com/office/word/2016/wordml/cid" xmlns:w16se="http://schemas.microsoft.com/office/word/2015/wordml/symex" xmlns:wpg="http://schemas.microsoft.com/office/word/2010/wordprocessingGroup" xmlns:wpi="http://schemas.microsoft.com/office/word/2010/wordprocessingInk" xmlns:wne="http://schemas.microsoft.com/office/word/2006/wordml" xmlns:wps="http://schemas.microsoft.com/office/word/2010/wordprocessingShape" mc:Ignorable="w14 w15 w16se w16cid wp14">
   <w:abstractNum w:abstractNumId="0" w15:restartNumberingAfterBreak="0">
     <w:nsid w:val="FFFFFFFB"/>
     <w:multiLevelType w:val="multilevel"/>
@@ -8667,76 +11153,76 @@
       </w:rPr>
     </w:lvl>
   </w:abstractNum>
-  <w:num w:numId="1" w16cid:durableId="123818404">
+  <w:num w:numId="1">
     <w:abstractNumId w:val="16"/>
   </w:num>
-  <w:num w:numId="2" w16cid:durableId="2026395059">
+  <w:num w:numId="2">
     <w:abstractNumId w:val="13"/>
   </w:num>
-  <w:num w:numId="3" w16cid:durableId="461928971">
+  <w:num w:numId="3">
     <w:abstractNumId w:val="22"/>
   </w:num>
-  <w:num w:numId="4" w16cid:durableId="1438603903">
+  <w:num w:numId="4">
     <w:abstractNumId w:val="32"/>
   </w:num>
-  <w:num w:numId="5" w16cid:durableId="1498153812">
+  <w:num w:numId="5">
     <w:abstractNumId w:val="7"/>
   </w:num>
-  <w:num w:numId="6" w16cid:durableId="1923416670">
+  <w:num w:numId="6">
     <w:abstractNumId w:val="4"/>
   </w:num>
-  <w:num w:numId="7" w16cid:durableId="835848290">
+  <w:num w:numId="7">
     <w:abstractNumId w:val="36"/>
   </w:num>
-  <w:num w:numId="8" w16cid:durableId="1897353885">
+  <w:num w:numId="8">
     <w:abstractNumId w:val="14"/>
   </w:num>
-  <w:num w:numId="9" w16cid:durableId="2141847671">
+  <w:num w:numId="9">
     <w:abstractNumId w:val="33"/>
   </w:num>
-  <w:num w:numId="10" w16cid:durableId="78334875">
+  <w:num w:numId="10">
     <w:abstractNumId w:val="35"/>
   </w:num>
-  <w:num w:numId="11" w16cid:durableId="249315167">
+  <w:num w:numId="11">
     <w:abstractNumId w:val="23"/>
   </w:num>
-  <w:num w:numId="12" w16cid:durableId="1120345103">
+  <w:num w:numId="12">
     <w:abstractNumId w:val="18"/>
   </w:num>
-  <w:num w:numId="13" w16cid:durableId="632448935">
+  <w:num w:numId="13">
     <w:abstractNumId w:val="0"/>
   </w:num>
-  <w:num w:numId="14" w16cid:durableId="1995834479">
+  <w:num w:numId="14">
     <w:abstractNumId w:val="2"/>
   </w:num>
-  <w:num w:numId="15" w16cid:durableId="160244399">
+  <w:num w:numId="15">
     <w:abstractNumId w:val="0"/>
     <w:lvlOverride w:ilvl="0">
       <w:startOverride w:val="1"/>
     </w:lvlOverride>
   </w:num>
-  <w:num w:numId="16" w16cid:durableId="1816146282">
+  <w:num w:numId="16">
     <w:abstractNumId w:val="5"/>
   </w:num>
-  <w:num w:numId="17" w16cid:durableId="1679890135">
+  <w:num w:numId="17">
     <w:abstractNumId w:val="12"/>
   </w:num>
-  <w:num w:numId="18" w16cid:durableId="694889856">
+  <w:num w:numId="18">
     <w:abstractNumId w:val="24"/>
   </w:num>
-  <w:num w:numId="19" w16cid:durableId="2136873940">
+  <w:num w:numId="19">
     <w:abstractNumId w:val="10"/>
   </w:num>
-  <w:num w:numId="20" w16cid:durableId="457721239">
+  <w:num w:numId="20">
     <w:abstractNumId w:val="27"/>
   </w:num>
-  <w:num w:numId="21" w16cid:durableId="1577591134">
+  <w:num w:numId="21">
     <w:abstractNumId w:val="1"/>
   </w:num>
-  <w:num w:numId="22" w16cid:durableId="463350183">
+  <w:num w:numId="22">
     <w:abstractNumId w:val="11"/>
   </w:num>
-  <w:num w:numId="23" w16cid:durableId="1097948147">
+  <w:num w:numId="23">
     <w:abstractNumId w:val="0"/>
     <w:lvlOverride w:ilvl="0">
       <w:startOverride w:val="3"/>
@@ -8745,40 +11231,40 @@
       <w:startOverride w:val="2"/>
     </w:lvlOverride>
   </w:num>
-  <w:num w:numId="24" w16cid:durableId="1230850533">
+  <w:num w:numId="24">
     <w:abstractNumId w:val="9"/>
   </w:num>
-  <w:num w:numId="25" w16cid:durableId="525096677">
+  <w:num w:numId="25">
     <w:abstractNumId w:val="28"/>
   </w:num>
-  <w:num w:numId="26" w16cid:durableId="2095973347">
+  <w:num w:numId="26">
     <w:abstractNumId w:val="15"/>
   </w:num>
-  <w:num w:numId="27" w16cid:durableId="1616979745">
+  <w:num w:numId="27">
     <w:abstractNumId w:val="19"/>
   </w:num>
-  <w:num w:numId="28" w16cid:durableId="1959021983">
+  <w:num w:numId="28">
     <w:abstractNumId w:val="6"/>
   </w:num>
-  <w:num w:numId="29" w16cid:durableId="463352643">
+  <w:num w:numId="29">
     <w:abstractNumId w:val="29"/>
   </w:num>
-  <w:num w:numId="30" w16cid:durableId="161315004">
+  <w:num w:numId="30">
     <w:abstractNumId w:val="3"/>
   </w:num>
-  <w:num w:numId="31" w16cid:durableId="2076312971">
+  <w:num w:numId="31">
     <w:abstractNumId w:val="20"/>
   </w:num>
-  <w:num w:numId="32" w16cid:durableId="1288464594">
+  <w:num w:numId="32">
     <w:abstractNumId w:val="37"/>
   </w:num>
-  <w:num w:numId="33" w16cid:durableId="728577473">
+  <w:num w:numId="33">
     <w:abstractNumId w:val="31"/>
   </w:num>
-  <w:num w:numId="34" w16cid:durableId="807549219">
+  <w:num w:numId="34">
     <w:abstractNumId w:val="17"/>
   </w:num>
-  <w:num w:numId="35" w16cid:durableId="1226797261">
+  <w:num w:numId="35">
     <w:abstractNumId w:val="0"/>
     <w:lvlOverride w:ilvl="0">
       <w:startOverride w:val="3"/>
@@ -8787,19 +11273,19 @@
       <w:startOverride w:val="2"/>
     </w:lvlOverride>
   </w:num>
-  <w:num w:numId="36" w16cid:durableId="805977240">
+  <w:num w:numId="36">
     <w:abstractNumId w:val="0"/>
     <w:lvlOverride w:ilvl="0">
       <w:startOverride w:val="4"/>
     </w:lvlOverride>
   </w:num>
-  <w:num w:numId="37" w16cid:durableId="990209303">
+  <w:num w:numId="37">
     <w:abstractNumId w:val="0"/>
     <w:lvlOverride w:ilvl="0">
       <w:startOverride w:val="4"/>
     </w:lvlOverride>
   </w:num>
-  <w:num w:numId="38" w16cid:durableId="166215421">
+  <w:num w:numId="38">
     <w:abstractNumId w:val="0"/>
     <w:lvlOverride w:ilvl="0">
       <w:startOverride w:val="5"/>
@@ -8808,38 +11294,38 @@
       <w:startOverride w:val="2"/>
     </w:lvlOverride>
   </w:num>
-  <w:num w:numId="39" w16cid:durableId="2045935557">
+  <w:num w:numId="39">
     <w:abstractNumId w:val="0"/>
     <w:lvlOverride w:ilvl="0">
       <w:startOverride w:val="4"/>
     </w:lvlOverride>
   </w:num>
-  <w:num w:numId="40" w16cid:durableId="2014919334">
+  <w:num w:numId="40">
     <w:abstractNumId w:val="34"/>
   </w:num>
-  <w:num w:numId="41" w16cid:durableId="838693803">
+  <w:num w:numId="41">
     <w:abstractNumId w:val="25"/>
   </w:num>
-  <w:num w:numId="42" w16cid:durableId="1150828687">
+  <w:num w:numId="42">
     <w:abstractNumId w:val="38"/>
   </w:num>
-  <w:num w:numId="43" w16cid:durableId="509442871">
+  <w:num w:numId="43">
     <w:abstractNumId w:val="30"/>
   </w:num>
-  <w:num w:numId="44" w16cid:durableId="1693872871">
+  <w:num w:numId="44">
     <w:abstractNumId w:val="26"/>
   </w:num>
-  <w:num w:numId="45" w16cid:durableId="1003164100">
+  <w:num w:numId="45">
     <w:abstractNumId w:val="21"/>
   </w:num>
-  <w:num w:numId="46" w16cid:durableId="1629899330">
+  <w:num w:numId="46">
     <w:abstractNumId w:val="8"/>
   </w:num>
 </w:numbering>
 </file>
 
 <file path=word/styles.xml><?xml version="1.0" encoding="utf-8"?>
-<w:styles xmlns:mc="http://schemas.openxmlformats.org/markup-compatibility/2006" xmlns:r="http://schemas.openxmlformats.org/officeDocument/2006/relationships" xmlns:w="http://schemas.openxmlformats.org/wordprocessingml/2006/main" xmlns:w14="http://schemas.microsoft.com/office/word/2010/wordml" xmlns:w15="http://schemas.microsoft.com/office/word/2012/wordml" xmlns:w16cex="http://schemas.microsoft.com/office/word/2018/wordml/cex" xmlns:w16cid="http://schemas.microsoft.com/office/word/2016/wordml/cid" xmlns:w16="http://schemas.microsoft.com/office/word/2018/wordml" xmlns:w16du="http://schemas.microsoft.com/office/word/2023/wordml/word16du" xmlns:w16sdtdh="http://schemas.microsoft.com/office/word/2020/wordml/sdtdatahash" xmlns:w16sdtfl="http://schemas.microsoft.com/office/word/2024/wordml/sdtformatlock" xmlns:w16se="http://schemas.microsoft.com/office/word/2015/wordml/symex" mc:Ignorable="w14 w15 w16se w16cid w16 w16cex w16sdtdh w16sdtfl w16du">
+<w:styles xmlns:mc="http://schemas.openxmlformats.org/markup-compatibility/2006" xmlns:r="http://schemas.openxmlformats.org/officeDocument/2006/relationships" xmlns:w="http://schemas.openxmlformats.org/wordprocessingml/2006/main" xmlns:w14="http://schemas.microsoft.com/office/word/2010/wordml" xmlns:w15="http://schemas.microsoft.com/office/word/2012/wordml" xmlns:w16cid="http://schemas.microsoft.com/office/word/2016/wordml/cid" xmlns:w16se="http://schemas.microsoft.com/office/word/2015/wordml/symex" mc:Ignorable="w14 w15 w16se w16cid">
   <w:docDefaults>
     <w:rPrDefault>
       <w:rPr>
@@ -8855,7 +11341,7 @@
       </w:pPr>
     </w:pPrDefault>
   </w:docDefaults>
-  <w:latentStyles w:defLockedState="0" w:defUIPriority="99" w:defSemiHidden="0" w:defUnhideWhenUsed="0" w:defQFormat="0" w:count="376">
+  <w:latentStyles w:defLockedState="0" w:defUIPriority="99" w:defSemiHidden="0" w:defUnhideWhenUsed="0" w:defQFormat="0" w:count="375">
     <w:lsdException w:name="Normal" w:uiPriority="0" w:qFormat="1"/>
     <w:lsdException w:name="heading 1" w:uiPriority="0" w:qFormat="1"/>
     <w:lsdException w:name="heading 2" w:semiHidden="1" w:uiPriority="0" w:unhideWhenUsed="1" w:qFormat="1"/>
@@ -9231,7 +11717,6 @@
     <w:lsdException w:name="Smart Hyperlink" w:semiHidden="1" w:unhideWhenUsed="1"/>
     <w:lsdException w:name="Hashtag" w:semiHidden="1" w:unhideWhenUsed="1"/>
     <w:lsdException w:name="Unresolved Mention" w:semiHidden="1" w:unhideWhenUsed="1"/>
-    <w:lsdException w:name="Smart Link" w:semiHidden="1" w:unhideWhenUsed="1"/>
   </w:latentStyles>
   <w:style w:type="paragraph" w:default="1" w:styleId="Normal">
     <w:name w:val="Normal"/>
@@ -10235,21 +12720,6 @@
 </file>
 
 <file path=customXml/item1.xml><?xml version="1.0" encoding="utf-8"?>
-<p:properties xmlns:p="http://schemas.microsoft.com/office/2006/metadata/properties" xmlns:xsi="http://www.w3.org/2001/XMLSchema-instance" xmlns:pc="http://schemas.microsoft.com/office/infopath/2007/PartnerControls">
-  <documentManagement/>
-</p:properties>
-</file>
-
-<file path=customXml/item2.xml><?xml version="1.0" encoding="utf-8"?>
-<?mso-contentType ?>
-<FormTemplates xmlns="http://schemas.microsoft.com/sharepoint/v3/contenttype/forms">
-  <Display>DocumentLibraryForm</Display>
-  <Edit>DocumentLibraryForm</Edit>
-  <New>DocumentLibraryForm</New>
-</FormTemplates>
-</file>
-
-<file path=customXml/item3.xml><?xml version="1.0" encoding="utf-8"?>
 <ct:contentTypeSchema xmlns:ct="http://schemas.microsoft.com/office/2006/metadata/contentType" xmlns:ma="http://schemas.microsoft.com/office/2006/metadata/properties/metaAttributes" ct:_="" ma:_="" ma:contentTypeName="Document" ma:contentTypeID="0x0101000130A8883D509741AAD9698FAF47E5F3" ma:contentTypeVersion="3" ma:contentTypeDescription="Create a new document." ma:contentTypeScope="" ma:versionID="ff89cdacd3a61eed31ca6cf071b8b226">
   <xsd:schema xmlns:xsd="http://www.w3.org/2001/XMLSchema" xmlns:xs="http://www.w3.org/2001/XMLSchema" xmlns:p="http://schemas.microsoft.com/office/2006/metadata/properties" xmlns:ns2="9c9eb58d-2f4c-499b-ab9c-47c1d5de8bf8" targetNamespace="http://schemas.microsoft.com/office/2006/metadata/properties" ma:root="true" ma:fieldsID="c7d838d636f2945413649be92e4efa58" ns2:_="">
     <xsd:import namespace="9c9eb58d-2f4c-499b-ab9c-47c1d5de8bf8"/>
@@ -10387,11 +12857,35 @@
 </ct:contentTypeSchema>
 </file>
 
+<file path=customXml/item2.xml><?xml version="1.0" encoding="utf-8"?>
+<?mso-contentType ?>
+<FormTemplates xmlns="http://schemas.microsoft.com/sharepoint/v3/contenttype/forms">
+  <Display>DocumentLibraryForm</Display>
+  <Edit>DocumentLibraryForm</Edit>
+  <New>DocumentLibraryForm</New>
+</FormTemplates>
+</file>
+
+<file path=customXml/item3.xml><?xml version="1.0" encoding="utf-8"?>
+<p:properties xmlns:p="http://schemas.microsoft.com/office/2006/metadata/properties" xmlns:xsi="http://www.w3.org/2001/XMLSchema-instance" xmlns:pc="http://schemas.microsoft.com/office/infopath/2007/PartnerControls">
+  <documentManagement/>
+</p:properties>
+</file>
+
 <file path=customXml/itemProps1.xml><?xml version="1.0" encoding="utf-8"?>
-<ds:datastoreItem xmlns:ds="http://schemas.openxmlformats.org/officeDocument/2006/customXml" ds:itemID="{5A8653E7-73B2-4237-9113-6302E7D224CB}">
+<ds:datastoreItem xmlns:ds="http://schemas.openxmlformats.org/officeDocument/2006/customXml" ds:itemID="{0434414E-15C3-4A9C-92D7-BEEEE9D04DCA}">
   <ds:schemaRefs>
+    <ds:schemaRef ds:uri="http://schemas.microsoft.com/office/2006/metadata/contentType"/>
+    <ds:schemaRef ds:uri="http://schemas.microsoft.com/office/2006/metadata/properties/metaAttributes"/>
+    <ds:schemaRef ds:uri="http://www.w3.org/2001/XMLSchema"/>
     <ds:schemaRef ds:uri="http://schemas.microsoft.com/office/2006/metadata/properties"/>
+    <ds:schemaRef ds:uri="9c9eb58d-2f4c-499b-ab9c-47c1d5de8bf8"/>
+    <ds:schemaRef ds:uri="http://schemas.microsoft.com/office/2006/documentManagement/types"/>
     <ds:schemaRef ds:uri="http://schemas.microsoft.com/office/infopath/2007/PartnerControls"/>
+    <ds:schemaRef ds:uri="http://schemas.openxmlformats.org/package/2006/metadata/core-properties"/>
+    <ds:schemaRef ds:uri="http://purl.org/dc/elements/1.1/"/>
+    <ds:schemaRef ds:uri="http://purl.org/dc/terms/"/>
+    <ds:schemaRef ds:uri="http://schemas.microsoft.com/internal/obd"/>
   </ds:schemaRefs>
 </ds:datastoreItem>
 </file>
@@ -10405,5 +12899,10 @@
 </file>
 
 <file path=customXml/itemProps3.xml><?xml version="1.0" encoding="utf-8"?>
-<ds:datastoreItem xmlns:ds="http://schemas.openxmlformats.org/officeDocument/2006/customXml" ds:itemID="{0434414E-15C3-4A9C-92D7-BEEEE9D04DCA}"/>
+<ds:datastoreItem xmlns:ds="http://schemas.openxmlformats.org/officeDocument/2006/customXml" ds:itemID="{5A8653E7-73B2-4237-9113-6302E7D224CB}">
+  <ds:schemaRefs>
+    <ds:schemaRef ds:uri="http://schemas.microsoft.com/office/2006/metadata/properties"/>
+    <ds:schemaRef ds:uri="http://schemas.microsoft.com/office/infopath/2007/PartnerControls"/>
+  </ds:schemaRefs>
+</ds:datastoreItem>
 </file>
</xml_diff>

<commit_message>
added fun and non fun req from srs document
</commit_message>
<xml_diff>
--- a/SE Project Report [V] [Group - 03].docx
+++ b/SE Project Report [V] [Group - 03].docx
@@ -1,6 +1,6 @@
 
 <file path=word/document.xml><?xml version="1.0" encoding="utf-8"?>
-<w:document xmlns:wpc="http://schemas.microsoft.com/office/word/2010/wordprocessingCanvas" xmlns:cx="http://schemas.microsoft.com/office/drawing/2014/chartex" xmlns:cx1="http://schemas.microsoft.com/office/drawing/2015/9/8/chartex" xmlns:cx2="http://schemas.microsoft.com/office/drawing/2015/10/21/chartex" xmlns:cx3="http://schemas.microsoft.com/office/drawing/2016/5/9/chartex" xmlns:cx4="http://schemas.microsoft.com/office/drawing/2016/5/10/chartex" xmlns:cx5="http://schemas.microsoft.com/office/drawing/2016/5/11/chartex" xmlns:cx6="http://schemas.microsoft.com/office/drawing/2016/5/12/chartex" xmlns:cx7="http://schemas.microsoft.com/office/drawing/2016/5/13/chartex" xmlns:cx8="http://schemas.microsoft.com/office/drawing/2016/5/14/chartex" xmlns:mc="http://schemas.openxmlformats.org/markup-compatibility/2006" xmlns:aink="http://schemas.microsoft.com/office/drawing/2016/ink" xmlns:am3d="http://schemas.microsoft.com/office/drawing/2017/model3d" xmlns:o="urn:schemas-microsoft-com:office:office" xmlns:r="http://schemas.openxmlformats.org/officeDocument/2006/relationships" xmlns:m="http://schemas.openxmlformats.org/officeDocument/2006/math" xmlns:v="urn:schemas-microsoft-com:vml" xmlns:wp14="http://schemas.microsoft.com/office/word/2010/wordprocessingDrawing" xmlns:wp="http://schemas.openxmlformats.org/drawingml/2006/wordprocessingDrawing" xmlns:w10="urn:schemas-microsoft-com:office:word" xmlns:w="http://schemas.openxmlformats.org/wordprocessingml/2006/main" xmlns:w14="http://schemas.microsoft.com/office/word/2010/wordml" xmlns:w15="http://schemas.microsoft.com/office/word/2012/wordml" xmlns:w16cid="http://schemas.microsoft.com/office/word/2016/wordml/cid" xmlns:w16se="http://schemas.microsoft.com/office/word/2015/wordml/symex" xmlns:wpg="http://schemas.microsoft.com/office/word/2010/wordprocessingGroup" xmlns:wpi="http://schemas.microsoft.com/office/word/2010/wordprocessingInk" xmlns:wne="http://schemas.microsoft.com/office/word/2006/wordml" xmlns:wps="http://schemas.microsoft.com/office/word/2010/wordprocessingShape" mc:Ignorable="w14 w15 w16se w16cid wp14">
+<w:document xmlns:wpc="http://schemas.microsoft.com/office/word/2010/wordprocessingCanvas" xmlns:cx="http://schemas.microsoft.com/office/drawing/2014/chartex" xmlns:cx1="http://schemas.microsoft.com/office/drawing/2015/9/8/chartex" xmlns:cx2="http://schemas.microsoft.com/office/drawing/2015/10/21/chartex" xmlns:cx3="http://schemas.microsoft.com/office/drawing/2016/5/9/chartex" xmlns:cx4="http://schemas.microsoft.com/office/drawing/2016/5/10/chartex" xmlns:cx5="http://schemas.microsoft.com/office/drawing/2016/5/11/chartex" xmlns:cx6="http://schemas.microsoft.com/office/drawing/2016/5/12/chartex" xmlns:cx7="http://schemas.microsoft.com/office/drawing/2016/5/13/chartex" xmlns:cx8="http://schemas.microsoft.com/office/drawing/2016/5/14/chartex" xmlns:mc="http://schemas.openxmlformats.org/markup-compatibility/2006" xmlns:aink="http://schemas.microsoft.com/office/drawing/2016/ink" xmlns:am3d="http://schemas.microsoft.com/office/drawing/2017/model3d" xmlns:o="urn:schemas-microsoft-com:office:office" xmlns:oel="http://schemas.microsoft.com/office/2019/extlst" xmlns:r="http://schemas.openxmlformats.org/officeDocument/2006/relationships" xmlns:m="http://schemas.openxmlformats.org/officeDocument/2006/math" xmlns:v="urn:schemas-microsoft-com:vml" xmlns:wp14="http://schemas.microsoft.com/office/word/2010/wordprocessingDrawing" xmlns:wp="http://schemas.openxmlformats.org/drawingml/2006/wordprocessingDrawing" xmlns:w10="urn:schemas-microsoft-com:office:word" xmlns:w="http://schemas.openxmlformats.org/wordprocessingml/2006/main" xmlns:w14="http://schemas.microsoft.com/office/word/2010/wordml" xmlns:w15="http://schemas.microsoft.com/office/word/2012/wordml" xmlns:w16cex="http://schemas.microsoft.com/office/word/2018/wordml/cex" xmlns:w16cid="http://schemas.microsoft.com/office/word/2016/wordml/cid" xmlns:w16="http://schemas.microsoft.com/office/word/2018/wordml" xmlns:w16du="http://schemas.microsoft.com/office/word/2023/wordml/word16du" xmlns:w16sdtdh="http://schemas.microsoft.com/office/word/2020/wordml/sdtdatahash" xmlns:w16sdtfl="http://schemas.microsoft.com/office/word/2024/wordml/sdtformatlock" xmlns:w16se="http://schemas.microsoft.com/office/word/2015/wordml/symex" xmlns:wpg="http://schemas.microsoft.com/office/word/2010/wordprocessingGroup" xmlns:wpi="http://schemas.microsoft.com/office/word/2010/wordprocessingInk" xmlns:wne="http://schemas.microsoft.com/office/word/2006/wordml" xmlns:wps="http://schemas.microsoft.com/office/word/2010/wordprocessingShape" mc:Ignorable="w14 w15 w16se w16cid w16 w16cex w16sdtdh w16sdtfl w16du wp14">
   <w:body>
     <w:p>
       <w:pPr>
@@ -718,8 +718,6 @@
             <w:r>
               <w:t>RAYEAN SADIK</w:t>
             </w:r>
-            <w:bookmarkStart w:id="0" w:name="_GoBack"/>
-            <w:bookmarkEnd w:id="0"/>
           </w:p>
         </w:tc>
         <w:tc>
@@ -2414,7 +2412,7 @@
               </wp:anchor>
             </w:drawing>
           </mc:Choice>
-          <mc:Fallback xmlns:w16sdtfl="http://schemas.microsoft.com/office/word/2024/wordml/sdtformatlock" xmlns:w16sdtdh="http://schemas.microsoft.com/office/word/2020/wordml/sdtdatahash" xmlns:w16du="http://schemas.microsoft.com/office/word/2023/wordml/word16du" xmlns:w16="http://schemas.microsoft.com/office/word/2018/wordml" xmlns:w16cex="http://schemas.microsoft.com/office/word/2018/wordml/cex" xmlns:oel="http://schemas.microsoft.com/office/2019/extlst">
+          <mc:Fallback>
             <w:pict>
               <v:shape w14:anchorId="3CFE7595" id="Ink 3" o:spid="_x0000_s1026" type="#_x0000_t75" style="position:absolute;margin-left:628.95pt;margin-top:-419pt;width:21.95pt;height:151.8pt;z-index:251662336;visibility:visible;mso-wrap-style:square;mso-wrap-distance-left:9pt;mso-wrap-distance-top:0;mso-wrap-distance-right:9pt;mso-wrap-distance-bottom:0;mso-position-horizontal:absolute;mso-position-horizontal-relative:text;mso-position-vertical:absolute;mso-position-vertical-relative:text" o:gfxdata="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">
                 <v:imagedata r:id="rId16" o:title=""/>
@@ -2765,6 +2763,402 @@
     </w:p>
     <w:p>
       <w:pPr>
+        <w:pStyle w:val="font-claude-response-body"/>
+        <w:numPr>
+          <w:ilvl w:val="1"/>
+          <w:numId w:val="47"/>
+        </w:numPr>
+        <w:spacing w:before="0" w:beforeAutospacing="0" w:after="240" w:afterAutospacing="0" w:line="276" w:lineRule="auto"/>
+        <w:ind w:left="360"/>
+      </w:pPr>
+      <w:r>
+        <w:rPr>
+          <w:rStyle w:val="Strong"/>
+        </w:rPr>
+        <w:t>User Registration &amp; Login</w:t>
+      </w:r>
+    </w:p>
+    <w:p>
+      <w:pPr>
+        <w:pStyle w:val="font-claude-response-body"/>
+        <w:spacing w:before="0" w:beforeAutospacing="0" w:after="240" w:afterAutospacing="0" w:line="276" w:lineRule="auto"/>
+        <w:ind w:left="360"/>
+        <w:jc w:val="both"/>
+      </w:pPr>
+      <w:r>
+        <w:t>The system shall allow tourists, service providers and authorities to register and log in      securely.</w:t>
+      </w:r>
+    </w:p>
+    <w:p>
+      <w:pPr>
+        <w:pStyle w:val="font-claude-response-body"/>
+        <w:numPr>
+          <w:ilvl w:val="1"/>
+          <w:numId w:val="47"/>
+        </w:numPr>
+        <w:spacing w:before="0" w:beforeAutospacing="0" w:after="240" w:afterAutospacing="0" w:line="360" w:lineRule="auto"/>
+        <w:ind w:left="360"/>
+        <w:rPr>
+          <w:rStyle w:val="Strong"/>
+          <w:b w:val="0"/>
+          <w:bCs w:val="0"/>
+        </w:rPr>
+      </w:pPr>
+      <w:r>
+        <w:rPr>
+          <w:rStyle w:val="Strong"/>
+        </w:rPr>
+        <w:t>Trip Planning</w:t>
+      </w:r>
+      <w:r>
+        <w:br/>
+        <w:t>The system shall generate personalized itineraries based on location, time, and budget.</w:t>
+      </w:r>
+    </w:p>
+    <w:p>
+      <w:pPr>
+        <w:pStyle w:val="font-claude-response-body"/>
+        <w:numPr>
+          <w:ilvl w:val="1"/>
+          <w:numId w:val="47"/>
+        </w:numPr>
+        <w:spacing w:before="0" w:beforeAutospacing="0" w:after="240" w:afterAutospacing="0" w:line="360" w:lineRule="auto"/>
+        <w:ind w:left="360"/>
+      </w:pPr>
+      <w:r>
+        <w:rPr>
+          <w:rStyle w:val="Strong"/>
+        </w:rPr>
+        <w:t>Search &amp; Filter</w:t>
+      </w:r>
+      <w:r>
+        <w:br/>
+        <w:t>The system shall allow searching attractions, hotels, restaurants, and transport with filters by budget, rating or safety.</w:t>
+      </w:r>
+    </w:p>
+    <w:p>
+      <w:pPr>
+        <w:pStyle w:val="font-claude-response-body"/>
+        <w:numPr>
+          <w:ilvl w:val="1"/>
+          <w:numId w:val="47"/>
+        </w:numPr>
+        <w:spacing w:before="0" w:beforeAutospacing="0" w:after="240" w:afterAutospacing="0" w:line="360" w:lineRule="auto"/>
+        <w:ind w:left="360"/>
+      </w:pPr>
+      <w:r>
+        <w:rPr>
+          <w:rStyle w:val="Strong"/>
+        </w:rPr>
+        <w:lastRenderedPageBreak/>
+        <w:t>Nearby Recommendations</w:t>
+      </w:r>
+      <w:r>
+        <w:br/>
+        <w:t>The system shall show nearby places using GPS location.</w:t>
+      </w:r>
+    </w:p>
+    <w:p>
+      <w:pPr>
+        <w:pStyle w:val="font-claude-response-body"/>
+        <w:numPr>
+          <w:ilvl w:val="1"/>
+          <w:numId w:val="47"/>
+        </w:numPr>
+        <w:spacing w:before="0" w:beforeAutospacing="0" w:after="240" w:afterAutospacing="0" w:line="360" w:lineRule="auto"/>
+        <w:ind w:left="360"/>
+      </w:pPr>
+      <w:r>
+        <w:rPr>
+          <w:rStyle w:val="Strong"/>
+        </w:rPr>
+        <w:t>Language Support</w:t>
+      </w:r>
+      <w:r>
+        <w:br/>
+        <w:t>The system shall support English and Bangla language switching.</w:t>
+      </w:r>
+    </w:p>
+    <w:p>
+      <w:pPr>
+        <w:pStyle w:val="font-claude-response-body"/>
+        <w:numPr>
+          <w:ilvl w:val="1"/>
+          <w:numId w:val="47"/>
+        </w:numPr>
+        <w:spacing w:before="0" w:beforeAutospacing="0" w:after="240" w:afterAutospacing="0" w:line="360" w:lineRule="auto"/>
+        <w:ind w:left="360"/>
+      </w:pPr>
+      <w:r>
+        <w:rPr>
+          <w:rStyle w:val="Strong"/>
+        </w:rPr>
+        <w:t>Provider Registration</w:t>
+      </w:r>
+      <w:r>
+        <w:br/>
+        <w:t>The system shall allow service providers to submit business details for verification.</w:t>
+      </w:r>
+    </w:p>
+    <w:p>
+      <w:pPr>
+        <w:pStyle w:val="font-claude-response-body"/>
+        <w:numPr>
+          <w:ilvl w:val="1"/>
+          <w:numId w:val="47"/>
+        </w:numPr>
+        <w:spacing w:before="0" w:beforeAutospacing="0" w:after="240" w:afterAutospacing="0" w:line="360" w:lineRule="auto"/>
+        <w:ind w:left="360"/>
+      </w:pPr>
+      <w:r>
+        <w:rPr>
+          <w:rStyle w:val="Strong"/>
+        </w:rPr>
+        <w:t>Authority Alerts</w:t>
+      </w:r>
+      <w:r>
+        <w:br/>
+        <w:t>Authorities shall publish, edit, and remove safety alerts.</w:t>
+      </w:r>
+    </w:p>
+    <w:p>
+      <w:pPr>
+        <w:pStyle w:val="font-claude-response-body"/>
+        <w:numPr>
+          <w:ilvl w:val="1"/>
+          <w:numId w:val="47"/>
+        </w:numPr>
+        <w:spacing w:before="0" w:beforeAutospacing="0" w:after="240" w:afterAutospacing="0" w:line="360" w:lineRule="auto"/>
+        <w:ind w:left="360"/>
+      </w:pPr>
+      <w:r>
+        <w:rPr>
+          <w:rStyle w:val="Strong"/>
+        </w:rPr>
+        <w:t>Admin Management</w:t>
+      </w:r>
+      <w:r>
+        <w:br/>
+        <w:t>Admins shall verify providers and manage user accounts.</w:t>
+      </w:r>
+    </w:p>
+    <w:p>
+      <w:pPr>
+        <w:suppressAutoHyphens/>
+        <w:rPr>
+          <w:b/>
+        </w:rPr>
+      </w:pPr>
+    </w:p>
+    <w:p>
+      <w:pPr>
+        <w:pStyle w:val="Heading2"/>
+        <w:rPr>
+          <w:szCs w:val="24"/>
+        </w:rPr>
+      </w:pPr>
+      <w:bookmarkStart w:id="0" w:name="_Toc216162417"/>
+      <w:r>
+        <w:rPr>
+          <w:szCs w:val="24"/>
+        </w:rPr>
+        <w:t>Non-Functional Requirements</w:t>
+      </w:r>
+      <w:bookmarkEnd w:id="0"/>
+    </w:p>
+    <w:p>
+      <w:pPr>
+        <w:pStyle w:val="font-claude-response-body"/>
+        <w:numPr>
+          <w:ilvl w:val="0"/>
+          <w:numId w:val="48"/>
+        </w:numPr>
+        <w:spacing w:before="240" w:beforeAutospacing="0" w:after="240" w:afterAutospacing="0" w:line="360" w:lineRule="auto"/>
+        <w:ind w:left="360"/>
+        <w:jc w:val="both"/>
+      </w:pPr>
+      <w:r>
+        <w:rPr>
+          <w:rStyle w:val="Strong"/>
+        </w:rPr>
+        <w:t>Performance</w:t>
+      </w:r>
+      <w:r>
+        <w:br/>
+        <w:t>Search and trips plan results shall load within 3 seconds.</w:t>
+      </w:r>
+    </w:p>
+    <w:p>
+      <w:pPr>
+        <w:pStyle w:val="font-claude-response-body"/>
+        <w:numPr>
+          <w:ilvl w:val="0"/>
+          <w:numId w:val="48"/>
+        </w:numPr>
+        <w:spacing w:before="240" w:beforeAutospacing="0" w:after="240" w:afterAutospacing="0" w:line="360" w:lineRule="auto"/>
+        <w:ind w:left="360"/>
+        <w:jc w:val="both"/>
+        <w:rPr>
+          <w:rStyle w:val="Strong"/>
+          <w:b w:val="0"/>
+          <w:bCs w:val="0"/>
+        </w:rPr>
+      </w:pPr>
+      <w:r>
+        <w:rPr>
+          <w:rStyle w:val="Strong"/>
+        </w:rPr>
+        <w:t>Availability</w:t>
+      </w:r>
+      <w:r>
+        <w:br/>
+        <w:t>The system shall maintain 99% uptime.</w:t>
+      </w:r>
+    </w:p>
+    <w:p>
+      <w:pPr>
+        <w:pStyle w:val="font-claude-response-body"/>
+        <w:numPr>
+          <w:ilvl w:val="0"/>
+          <w:numId w:val="48"/>
+        </w:numPr>
+        <w:spacing w:before="240" w:beforeAutospacing="0" w:after="240" w:afterAutospacing="0" w:line="360" w:lineRule="auto"/>
+        <w:ind w:left="360"/>
+        <w:jc w:val="both"/>
+      </w:pPr>
+      <w:r>
+        <w:rPr>
+          <w:rStyle w:val="Strong"/>
+        </w:rPr>
+        <w:t>Usability</w:t>
+      </w:r>
+      <w:r>
+        <w:br/>
+        <w:t>Core tasks shall be completed in under 5 steps.</w:t>
+      </w:r>
+    </w:p>
+    <w:p>
+      <w:pPr>
+        <w:pStyle w:val="font-claude-response-body"/>
+        <w:numPr>
+          <w:ilvl w:val="0"/>
+          <w:numId w:val="48"/>
+        </w:numPr>
+        <w:spacing w:before="240" w:beforeAutospacing="0" w:after="240" w:afterAutospacing="0" w:line="360" w:lineRule="auto"/>
+        <w:ind w:left="360"/>
+        <w:jc w:val="both"/>
+      </w:pPr>
+      <w:r>
+        <w:rPr>
+          <w:rStyle w:val="Strong"/>
+        </w:rPr>
+        <w:t>Security</w:t>
+      </w:r>
+      <w:r>
+        <w:br/>
+        <w:t>All data shall be encrypted.</w:t>
+      </w:r>
+    </w:p>
+    <w:p>
+      <w:pPr>
+        <w:pStyle w:val="font-claude-response-body"/>
+        <w:numPr>
+          <w:ilvl w:val="0"/>
+          <w:numId w:val="48"/>
+        </w:numPr>
+        <w:spacing w:before="240" w:beforeAutospacing="0" w:after="240" w:afterAutospacing="0" w:line="360" w:lineRule="auto"/>
+        <w:ind w:left="360"/>
+        <w:jc w:val="both"/>
+      </w:pPr>
+      <w:r>
+        <w:rPr>
+          <w:rStyle w:val="Strong"/>
+        </w:rPr>
+        <w:t>Compatibility</w:t>
+      </w:r>
+      <w:r>
+        <w:br/>
+        <w:t>The system shall work on Android, iOS and web browsers.</w:t>
+      </w:r>
+    </w:p>
+    <w:p>
+      <w:pPr>
+        <w:pStyle w:val="font-claude-response-body"/>
+        <w:numPr>
+          <w:ilvl w:val="0"/>
+          <w:numId w:val="48"/>
+        </w:numPr>
+        <w:spacing w:before="240" w:beforeAutospacing="0" w:after="240" w:afterAutospacing="0" w:line="360" w:lineRule="auto"/>
+        <w:ind w:left="360"/>
+        <w:jc w:val="both"/>
+      </w:pPr>
+      <w:r>
+        <w:rPr>
+          <w:rStyle w:val="Strong"/>
+        </w:rPr>
+        <w:t>Localization</w:t>
+      </w:r>
+      <w:r>
+        <w:br/>
+        <w:t>UI shall be available in English and Bangla.</w:t>
+      </w:r>
+    </w:p>
+    <w:p>
+      <w:pPr>
+        <w:pStyle w:val="font-claude-response-body"/>
+        <w:numPr>
+          <w:ilvl w:val="0"/>
+          <w:numId w:val="48"/>
+        </w:numPr>
+        <w:spacing w:before="240" w:beforeAutospacing="0" w:after="240" w:afterAutospacing="0" w:line="360" w:lineRule="auto"/>
+        <w:ind w:left="360"/>
+        <w:jc w:val="both"/>
+      </w:pPr>
+      <w:r>
+        <w:rPr>
+          <w:rStyle w:val="Strong"/>
+        </w:rPr>
+        <w:lastRenderedPageBreak/>
+        <w:t>Reliability</w:t>
+      </w:r>
+      <w:r>
+        <w:br/>
+        <w:t>The system shall not lose saved data.</w:t>
+      </w:r>
+    </w:p>
+    <w:p>
+      <w:pPr>
+        <w:pStyle w:val="font-claude-response-body"/>
+        <w:numPr>
+          <w:ilvl w:val="0"/>
+          <w:numId w:val="48"/>
+        </w:numPr>
+        <w:spacing w:before="240" w:beforeAutospacing="0" w:after="240" w:afterAutospacing="0" w:line="360" w:lineRule="auto"/>
+        <w:ind w:left="360"/>
+        <w:jc w:val="both"/>
+      </w:pPr>
+      <w:r>
+        <w:rPr>
+          <w:rStyle w:val="Strong"/>
+        </w:rPr>
+        <w:t>Privacy</w:t>
+      </w:r>
+      <w:r>
+        <w:br/>
+        <w:t>User data shall not be shared without consent.</w:t>
+      </w:r>
+    </w:p>
+    <w:p>
+      <w:pPr>
+        <w:rPr>
+          <w:bCs/>
+          <w:color w:val="0D0D0D" w:themeColor="text1" w:themeTint="F2"/>
+          <w:highlight w:val="cyan"/>
+        </w:rPr>
+      </w:pPr>
+    </w:p>
+    <w:p>
+      <w:pPr>
         <w:pStyle w:val="NormalWeb"/>
         <w:jc w:val="both"/>
       </w:pPr>
@@ -2786,8 +3180,13 @@
         <w:pStyle w:val="NormalWeb"/>
         <w:jc w:val="both"/>
       </w:pPr>
-      <w:r>
-        <w:lastRenderedPageBreak/>
+    </w:p>
+    <w:p>
+      <w:pPr>
+        <w:pStyle w:val="NormalWeb"/>
+        <w:jc w:val="both"/>
+      </w:pPr>
+      <w:r>
         <w:t>2.3.2 Non-Functional Requirements</w:t>
       </w:r>
       <w:r>
@@ -2889,12 +3288,14 @@
       <w:r>
         <w:t xml:space="preserve"> or </w:t>
       </w:r>
+      <w:proofErr w:type="spellStart"/>
       <w:r>
         <w:rPr>
           <w:rStyle w:val="Strong"/>
         </w:rPr>
         <w:t>LucidChart</w:t>
       </w:r>
+      <w:proofErr w:type="spellEnd"/>
       <w:r>
         <w:t>.</w:t>
       </w:r>
@@ -3116,6 +3517,7 @@
         <w:jc w:val="both"/>
       </w:pPr>
       <w:r>
+        <w:lastRenderedPageBreak/>
         <w:t>Ensure the wireframe matches the actors, roles</w:t>
       </w:r>
       <w:r>
@@ -3321,6 +3723,7 @@
       <w:r>
         <w:t xml:space="preserve">Use </w:t>
       </w:r>
+      <w:proofErr w:type="gramStart"/>
       <w:r>
         <w:rPr>
           <w:rStyle w:val="Strong"/>
@@ -3329,6 +3732,7 @@
         </w:rPr>
         <w:t>pull</w:t>
       </w:r>
+      <w:proofErr w:type="gramEnd"/>
       <w:r>
         <w:t xml:space="preserve"> to fetch and integrate changes from the remote repository into local copies, ensuring everyone stays updated.</w:t>
       </w:r>
@@ -3882,16 +4286,10 @@
           <w:szCs w:val="24"/>
           <w:highlight w:val="cyan"/>
         </w:rPr>
-        <w:t xml:space="preserve">Font: Times New Roman ; Size: 12; Justify the para [Ctrl + J]. </w:t>
-      </w:r>
-    </w:p>
-    <w:p>
-      <w:pPr>
-        <w:pStyle w:val="ListParagraph"/>
-        <w:numPr>
-          <w:ilvl w:val="0"/>
-          <w:numId w:val="46"/>
-        </w:numPr>
+        <w:t xml:space="preserve">Font: Times New </w:t>
+      </w:r>
+      <w:proofErr w:type="gramStart"/>
+      <w:r>
         <w:rPr>
           <w:rFonts w:ascii="Times New Roman" w:hAnsi="Times New Roman" w:cs="Times New Roman"/>
           <w:bCs/>
@@ -3900,7 +4298,9 @@
           <w:szCs w:val="24"/>
           <w:highlight w:val="cyan"/>
         </w:rPr>
-      </w:pPr>
+        <w:t>Roman ;</w:t>
+      </w:r>
+      <w:proofErr w:type="gramEnd"/>
       <w:r>
         <w:rPr>
           <w:rFonts w:ascii="Times New Roman" w:hAnsi="Times New Roman" w:cs="Times New Roman"/>
@@ -3910,9 +4310,16 @@
           <w:szCs w:val="24"/>
           <w:highlight w:val="cyan"/>
         </w:rPr>
-        <w:t>Delete th</w:t>
-      </w:r>
-      <w:r>
+        <w:t xml:space="preserve"> Size: 12; Justify the para [Ctrl + J]. </w:t>
+      </w:r>
+    </w:p>
+    <w:p>
+      <w:pPr>
+        <w:pStyle w:val="ListParagraph"/>
+        <w:numPr>
+          <w:ilvl w:val="0"/>
+          <w:numId w:val="46"/>
+        </w:numPr>
         <w:rPr>
           <w:rFonts w:ascii="Times New Roman" w:hAnsi="Times New Roman" w:cs="Times New Roman"/>
           <w:bCs/>
@@ -3921,8 +4328,7 @@
           <w:szCs w:val="24"/>
           <w:highlight w:val="cyan"/>
         </w:rPr>
-        <w:t>e</w:t>
-      </w:r>
+      </w:pPr>
       <w:r>
         <w:rPr>
           <w:rFonts w:ascii="Times New Roman" w:hAnsi="Times New Roman" w:cs="Times New Roman"/>
@@ -3932,7 +4338,7 @@
           <w:szCs w:val="24"/>
           <w:highlight w:val="cyan"/>
         </w:rPr>
-        <w:t xml:space="preserve"> highlighted part after completing this </w:t>
+        <w:t>Delete th</w:t>
       </w:r>
       <w:r>
         <w:rPr>
@@ -3943,7 +4349,7 @@
           <w:szCs w:val="24"/>
           <w:highlight w:val="cyan"/>
         </w:rPr>
-        <w:t xml:space="preserve">project </w:t>
+        <w:t>e</w:t>
       </w:r>
       <w:r>
         <w:rPr>
@@ -3954,16 +4360,9 @@
           <w:szCs w:val="24"/>
           <w:highlight w:val="cyan"/>
         </w:rPr>
-        <w:t>report.</w:t>
-      </w:r>
-    </w:p>
-    <w:p>
-      <w:pPr>
-        <w:pStyle w:val="ListParagraph"/>
-        <w:numPr>
-          <w:ilvl w:val="0"/>
-          <w:numId w:val="46"/>
-        </w:numPr>
+        <w:t xml:space="preserve"> highlighted part after completing this </w:t>
+      </w:r>
+      <w:r>
         <w:rPr>
           <w:rFonts w:ascii="Times New Roman" w:hAnsi="Times New Roman" w:cs="Times New Roman"/>
           <w:bCs/>
@@ -3972,7 +4371,8 @@
           <w:szCs w:val="24"/>
           <w:highlight w:val="cyan"/>
         </w:rPr>
-      </w:pPr>
+        <w:t xml:space="preserve">project </w:t>
+      </w:r>
       <w:r>
         <w:rPr>
           <w:rFonts w:ascii="Times New Roman" w:hAnsi="Times New Roman" w:cs="Times New Roman"/>
@@ -3982,9 +4382,16 @@
           <w:szCs w:val="24"/>
           <w:highlight w:val="cyan"/>
         </w:rPr>
-        <w:t>The completed report should be within the range of 40 to 50 pages</w:t>
-      </w:r>
-      <w:r>
+        <w:t>report.</w:t>
+      </w:r>
+    </w:p>
+    <w:p>
+      <w:pPr>
+        <w:pStyle w:val="ListParagraph"/>
+        <w:numPr>
+          <w:ilvl w:val="0"/>
+          <w:numId w:val="46"/>
+        </w:numPr>
         <w:rPr>
           <w:rFonts w:ascii="Times New Roman" w:hAnsi="Times New Roman" w:cs="Times New Roman"/>
           <w:bCs/>
@@ -3993,12 +4400,8 @@
           <w:szCs w:val="24"/>
           <w:highlight w:val="cyan"/>
         </w:rPr>
-        <w:t>.</w:t>
-      </w:r>
-    </w:p>
-    <w:p>
-      <w:pPr>
-        <w:pStyle w:val="ListParagraph"/>
+      </w:pPr>
+      <w:r>
         <w:rPr>
           <w:rFonts w:ascii="Times New Roman" w:hAnsi="Times New Roman" w:cs="Times New Roman"/>
           <w:bCs/>
@@ -4007,15 +4410,9 @@
           <w:szCs w:val="24"/>
           <w:highlight w:val="cyan"/>
         </w:rPr>
-      </w:pPr>
-    </w:p>
-    <w:p>
-      <w:pPr>
-        <w:pStyle w:val="ListParagraph"/>
-        <w:numPr>
-          <w:ilvl w:val="0"/>
-          <w:numId w:val="46"/>
-        </w:numPr>
+        <w:t>The completed report should be within the range of 40 to 50 pages</w:t>
+      </w:r>
+      <w:r>
         <w:rPr>
           <w:rFonts w:ascii="Times New Roman" w:hAnsi="Times New Roman" w:cs="Times New Roman"/>
           <w:bCs/>
@@ -4024,6 +4421,37 @@
           <w:szCs w:val="24"/>
           <w:highlight w:val="cyan"/>
         </w:rPr>
+        <w:t>.</w:t>
+      </w:r>
+    </w:p>
+    <w:p>
+      <w:pPr>
+        <w:pStyle w:val="ListParagraph"/>
+        <w:rPr>
+          <w:rFonts w:ascii="Times New Roman" w:hAnsi="Times New Roman" w:cs="Times New Roman"/>
+          <w:bCs/>
+          <w:color w:val="0D0D0D" w:themeColor="text1" w:themeTint="F2"/>
+          <w:sz w:val="24"/>
+          <w:szCs w:val="24"/>
+          <w:highlight w:val="cyan"/>
+        </w:rPr>
+      </w:pPr>
+    </w:p>
+    <w:p>
+      <w:pPr>
+        <w:pStyle w:val="ListParagraph"/>
+        <w:numPr>
+          <w:ilvl w:val="0"/>
+          <w:numId w:val="46"/>
+        </w:numPr>
+        <w:rPr>
+          <w:rFonts w:ascii="Times New Roman" w:hAnsi="Times New Roman" w:cs="Times New Roman"/>
+          <w:bCs/>
+          <w:color w:val="0D0D0D" w:themeColor="text1" w:themeTint="F2"/>
+          <w:sz w:val="24"/>
+          <w:szCs w:val="24"/>
+          <w:highlight w:val="cyan"/>
+        </w:rPr>
       </w:pPr>
       <w:r>
         <w:rPr>
@@ -4034,7 +4462,6 @@
           <w:szCs w:val="24"/>
           <w:highlight w:val="cyan"/>
         </w:rPr>
-        <w:lastRenderedPageBreak/>
         <w:t>Submission:</w:t>
       </w:r>
       <w:r>
@@ -4150,7 +4577,7 @@
 </file>
 
 <file path=word/endnotes.xml><?xml version="1.0" encoding="utf-8"?>
-<w:endnotes xmlns:wpc="http://schemas.microsoft.com/office/word/2010/wordprocessingCanvas" xmlns:cx="http://schemas.microsoft.com/office/drawing/2014/chartex" xmlns:cx1="http://schemas.microsoft.com/office/drawing/2015/9/8/chartex" xmlns:cx2="http://schemas.microsoft.com/office/drawing/2015/10/21/chartex" xmlns:cx3="http://schemas.microsoft.com/office/drawing/2016/5/9/chartex" xmlns:cx4="http://schemas.microsoft.com/office/drawing/2016/5/10/chartex" xmlns:cx5="http://schemas.microsoft.com/office/drawing/2016/5/11/chartex" xmlns:cx6="http://schemas.microsoft.com/office/drawing/2016/5/12/chartex" xmlns:cx7="http://schemas.microsoft.com/office/drawing/2016/5/13/chartex" xmlns:cx8="http://schemas.microsoft.com/office/drawing/2016/5/14/chartex" xmlns:mc="http://schemas.openxmlformats.org/markup-compatibility/2006" xmlns:aink="http://schemas.microsoft.com/office/drawing/2016/ink" xmlns:am3d="http://schemas.microsoft.com/office/drawing/2017/model3d" xmlns:o="urn:schemas-microsoft-com:office:office" xmlns:r="http://schemas.openxmlformats.org/officeDocument/2006/relationships" xmlns:m="http://schemas.openxmlformats.org/officeDocument/2006/math" xmlns:v="urn:schemas-microsoft-com:vml" xmlns:wp14="http://schemas.microsoft.com/office/word/2010/wordprocessingDrawing" xmlns:wp="http://schemas.openxmlformats.org/drawingml/2006/wordprocessingDrawing" xmlns:w10="urn:schemas-microsoft-com:office:word" xmlns:w="http://schemas.openxmlformats.org/wordprocessingml/2006/main" xmlns:w14="http://schemas.microsoft.com/office/word/2010/wordml" xmlns:w15="http://schemas.microsoft.com/office/word/2012/wordml" xmlns:w16cid="http://schemas.microsoft.com/office/word/2016/wordml/cid" xmlns:w16se="http://schemas.microsoft.com/office/word/2015/wordml/symex" xmlns:wpg="http://schemas.microsoft.com/office/word/2010/wordprocessingGroup" xmlns:wpi="http://schemas.microsoft.com/office/word/2010/wordprocessingInk" xmlns:wne="http://schemas.microsoft.com/office/word/2006/wordml" xmlns:wps="http://schemas.microsoft.com/office/word/2010/wordprocessingShape" mc:Ignorable="w14 w15 w16se w16cid wp14">
+<w:endnotes xmlns:wpc="http://schemas.microsoft.com/office/word/2010/wordprocessingCanvas" xmlns:cx="http://schemas.microsoft.com/office/drawing/2014/chartex" xmlns:cx1="http://schemas.microsoft.com/office/drawing/2015/9/8/chartex" xmlns:cx2="http://schemas.microsoft.com/office/drawing/2015/10/21/chartex" xmlns:cx3="http://schemas.microsoft.com/office/drawing/2016/5/9/chartex" xmlns:cx4="http://schemas.microsoft.com/office/drawing/2016/5/10/chartex" xmlns:cx5="http://schemas.microsoft.com/office/drawing/2016/5/11/chartex" xmlns:cx6="http://schemas.microsoft.com/office/drawing/2016/5/12/chartex" xmlns:cx7="http://schemas.microsoft.com/office/drawing/2016/5/13/chartex" xmlns:cx8="http://schemas.microsoft.com/office/drawing/2016/5/14/chartex" xmlns:mc="http://schemas.openxmlformats.org/markup-compatibility/2006" xmlns:aink="http://schemas.microsoft.com/office/drawing/2016/ink" xmlns:am3d="http://schemas.microsoft.com/office/drawing/2017/model3d" xmlns:o="urn:schemas-microsoft-com:office:office" xmlns:oel="http://schemas.microsoft.com/office/2019/extlst" xmlns:r="http://schemas.openxmlformats.org/officeDocument/2006/relationships" xmlns:m="http://schemas.openxmlformats.org/officeDocument/2006/math" xmlns:v="urn:schemas-microsoft-com:vml" xmlns:wp14="http://schemas.microsoft.com/office/word/2010/wordprocessingDrawing" xmlns:wp="http://schemas.openxmlformats.org/drawingml/2006/wordprocessingDrawing" xmlns:w10="urn:schemas-microsoft-com:office:word" xmlns:w="http://schemas.openxmlformats.org/wordprocessingml/2006/main" xmlns:w14="http://schemas.microsoft.com/office/word/2010/wordml" xmlns:w15="http://schemas.microsoft.com/office/word/2012/wordml" xmlns:w16cex="http://schemas.microsoft.com/office/word/2018/wordml/cex" xmlns:w16cid="http://schemas.microsoft.com/office/word/2016/wordml/cid" xmlns:w16="http://schemas.microsoft.com/office/word/2018/wordml" xmlns:w16du="http://schemas.microsoft.com/office/word/2023/wordml/word16du" xmlns:w16sdtdh="http://schemas.microsoft.com/office/word/2020/wordml/sdtdatahash" xmlns:w16sdtfl="http://schemas.microsoft.com/office/word/2024/wordml/sdtformatlock" xmlns:w16se="http://schemas.microsoft.com/office/word/2015/wordml/symex" xmlns:wpg="http://schemas.microsoft.com/office/word/2010/wordprocessingGroup" xmlns:wpi="http://schemas.microsoft.com/office/word/2010/wordprocessingInk" xmlns:wne="http://schemas.microsoft.com/office/word/2006/wordml" xmlns:wps="http://schemas.microsoft.com/office/word/2010/wordprocessingShape" mc:Ignorable="w14 w15 w16se w16cid w16 w16cex w16sdtdh w16sdtfl w16du wp14">
   <w:endnote w:type="separator" w:id="-1">
     <w:p>
       <w:pPr>
@@ -4175,7 +4602,7 @@
 </file>
 
 <file path=word/footer1.xml><?xml version="1.0" encoding="utf-8"?>
-<w:ftr xmlns:wpc="http://schemas.microsoft.com/office/word/2010/wordprocessingCanvas" xmlns:cx="http://schemas.microsoft.com/office/drawing/2014/chartex" xmlns:cx1="http://schemas.microsoft.com/office/drawing/2015/9/8/chartex" xmlns:cx2="http://schemas.microsoft.com/office/drawing/2015/10/21/chartex" xmlns:cx3="http://schemas.microsoft.com/office/drawing/2016/5/9/chartex" xmlns:cx4="http://schemas.microsoft.com/office/drawing/2016/5/10/chartex" xmlns:cx5="http://schemas.microsoft.com/office/drawing/2016/5/11/chartex" xmlns:cx6="http://schemas.microsoft.com/office/drawing/2016/5/12/chartex" xmlns:cx7="http://schemas.microsoft.com/office/drawing/2016/5/13/chartex" xmlns:cx8="http://schemas.microsoft.com/office/drawing/2016/5/14/chartex" xmlns:mc="http://schemas.openxmlformats.org/markup-compatibility/2006" xmlns:aink="http://schemas.microsoft.com/office/drawing/2016/ink" xmlns:am3d="http://schemas.microsoft.com/office/drawing/2017/model3d" xmlns:o="urn:schemas-microsoft-com:office:office" xmlns:r="http://schemas.openxmlformats.org/officeDocument/2006/relationships" xmlns:m="http://schemas.openxmlformats.org/officeDocument/2006/math" xmlns:v="urn:schemas-microsoft-com:vml" xmlns:wp14="http://schemas.microsoft.com/office/word/2010/wordprocessingDrawing" xmlns:wp="http://schemas.openxmlformats.org/drawingml/2006/wordprocessingDrawing" xmlns:w10="urn:schemas-microsoft-com:office:word" xmlns:w="http://schemas.openxmlformats.org/wordprocessingml/2006/main" xmlns:w14="http://schemas.microsoft.com/office/word/2010/wordml" xmlns:w15="http://schemas.microsoft.com/office/word/2012/wordml" xmlns:w16cid="http://schemas.microsoft.com/office/word/2016/wordml/cid" xmlns:w16se="http://schemas.microsoft.com/office/word/2015/wordml/symex" xmlns:wpg="http://schemas.microsoft.com/office/word/2010/wordprocessingGroup" xmlns:wpi="http://schemas.microsoft.com/office/word/2010/wordprocessingInk" xmlns:wne="http://schemas.microsoft.com/office/word/2006/wordml" xmlns:wps="http://schemas.microsoft.com/office/word/2010/wordprocessingShape" mc:Ignorable="w14 w15 w16se w16cid wp14">
+<w:ftr xmlns:wpc="http://schemas.microsoft.com/office/word/2010/wordprocessingCanvas" xmlns:cx="http://schemas.microsoft.com/office/drawing/2014/chartex" xmlns:cx1="http://schemas.microsoft.com/office/drawing/2015/9/8/chartex" xmlns:cx2="http://schemas.microsoft.com/office/drawing/2015/10/21/chartex" xmlns:cx3="http://schemas.microsoft.com/office/drawing/2016/5/9/chartex" xmlns:cx4="http://schemas.microsoft.com/office/drawing/2016/5/10/chartex" xmlns:cx5="http://schemas.microsoft.com/office/drawing/2016/5/11/chartex" xmlns:cx6="http://schemas.microsoft.com/office/drawing/2016/5/12/chartex" xmlns:cx7="http://schemas.microsoft.com/office/drawing/2016/5/13/chartex" xmlns:cx8="http://schemas.microsoft.com/office/drawing/2016/5/14/chartex" xmlns:mc="http://schemas.openxmlformats.org/markup-compatibility/2006" xmlns:aink="http://schemas.microsoft.com/office/drawing/2016/ink" xmlns:am3d="http://schemas.microsoft.com/office/drawing/2017/model3d" xmlns:o="urn:schemas-microsoft-com:office:office" xmlns:oel="http://schemas.microsoft.com/office/2019/extlst" xmlns:r="http://schemas.openxmlformats.org/officeDocument/2006/relationships" xmlns:m="http://schemas.openxmlformats.org/officeDocument/2006/math" xmlns:v="urn:schemas-microsoft-com:vml" xmlns:wp14="http://schemas.microsoft.com/office/word/2010/wordprocessingDrawing" xmlns:wp="http://schemas.openxmlformats.org/drawingml/2006/wordprocessingDrawing" xmlns:w10="urn:schemas-microsoft-com:office:word" xmlns:w="http://schemas.openxmlformats.org/wordprocessingml/2006/main" xmlns:w14="http://schemas.microsoft.com/office/word/2010/wordml" xmlns:w15="http://schemas.microsoft.com/office/word/2012/wordml" xmlns:w16cex="http://schemas.microsoft.com/office/word/2018/wordml/cex" xmlns:w16cid="http://schemas.microsoft.com/office/word/2016/wordml/cid" xmlns:w16="http://schemas.microsoft.com/office/word/2018/wordml" xmlns:w16du="http://schemas.microsoft.com/office/word/2023/wordml/word16du" xmlns:w16sdtdh="http://schemas.microsoft.com/office/word/2020/wordml/sdtdatahash" xmlns:w16sdtfl="http://schemas.microsoft.com/office/word/2024/wordml/sdtformatlock" xmlns:w16se="http://schemas.microsoft.com/office/word/2015/wordml/symex" xmlns:wpg="http://schemas.microsoft.com/office/word/2010/wordprocessingGroup" xmlns:wpi="http://schemas.microsoft.com/office/word/2010/wordprocessingInk" xmlns:wne="http://schemas.microsoft.com/office/word/2006/wordml" xmlns:wps="http://schemas.microsoft.com/office/word/2010/wordprocessingShape" mc:Ignorable="w14 w15 w16se w16cid w16 w16cex w16sdtdh w16sdtfl w16du wp14">
   <w:sdt>
     <w:sdtPr>
       <w:id w:val="-667026031"/>
@@ -4305,7 +4732,7 @@
 </file>
 
 <file path=word/footnotes.xml><?xml version="1.0" encoding="utf-8"?>
-<w:footnotes xmlns:wpc="http://schemas.microsoft.com/office/word/2010/wordprocessingCanvas" xmlns:cx="http://schemas.microsoft.com/office/drawing/2014/chartex" xmlns:cx1="http://schemas.microsoft.com/office/drawing/2015/9/8/chartex" xmlns:cx2="http://schemas.microsoft.com/office/drawing/2015/10/21/chartex" xmlns:cx3="http://schemas.microsoft.com/office/drawing/2016/5/9/chartex" xmlns:cx4="http://schemas.microsoft.com/office/drawing/2016/5/10/chartex" xmlns:cx5="http://schemas.microsoft.com/office/drawing/2016/5/11/chartex" xmlns:cx6="http://schemas.microsoft.com/office/drawing/2016/5/12/chartex" xmlns:cx7="http://schemas.microsoft.com/office/drawing/2016/5/13/chartex" xmlns:cx8="http://schemas.microsoft.com/office/drawing/2016/5/14/chartex" xmlns:mc="http://schemas.openxmlformats.org/markup-compatibility/2006" xmlns:aink="http://schemas.microsoft.com/office/drawing/2016/ink" xmlns:am3d="http://schemas.microsoft.com/office/drawing/2017/model3d" xmlns:o="urn:schemas-microsoft-com:office:office" xmlns:r="http://schemas.openxmlformats.org/officeDocument/2006/relationships" xmlns:m="http://schemas.openxmlformats.org/officeDocument/2006/math" xmlns:v="urn:schemas-microsoft-com:vml" xmlns:wp14="http://schemas.microsoft.com/office/word/2010/wordprocessingDrawing" xmlns:wp="http://schemas.openxmlformats.org/drawingml/2006/wordprocessingDrawing" xmlns:w10="urn:schemas-microsoft-com:office:word" xmlns:w="http://schemas.openxmlformats.org/wordprocessingml/2006/main" xmlns:w14="http://schemas.microsoft.com/office/word/2010/wordml" xmlns:w15="http://schemas.microsoft.com/office/word/2012/wordml" xmlns:w16cid="http://schemas.microsoft.com/office/word/2016/wordml/cid" xmlns:w16se="http://schemas.microsoft.com/office/word/2015/wordml/symex" xmlns:wpg="http://schemas.microsoft.com/office/word/2010/wordprocessingGroup" xmlns:wpi="http://schemas.microsoft.com/office/word/2010/wordprocessingInk" xmlns:wne="http://schemas.microsoft.com/office/word/2006/wordml" xmlns:wps="http://schemas.microsoft.com/office/word/2010/wordprocessingShape" mc:Ignorable="w14 w15 w16se w16cid wp14">
+<w:footnotes xmlns:wpc="http://schemas.microsoft.com/office/word/2010/wordprocessingCanvas" xmlns:cx="http://schemas.microsoft.com/office/drawing/2014/chartex" xmlns:cx1="http://schemas.microsoft.com/office/drawing/2015/9/8/chartex" xmlns:cx2="http://schemas.microsoft.com/office/drawing/2015/10/21/chartex" xmlns:cx3="http://schemas.microsoft.com/office/drawing/2016/5/9/chartex" xmlns:cx4="http://schemas.microsoft.com/office/drawing/2016/5/10/chartex" xmlns:cx5="http://schemas.microsoft.com/office/drawing/2016/5/11/chartex" xmlns:cx6="http://schemas.microsoft.com/office/drawing/2016/5/12/chartex" xmlns:cx7="http://schemas.microsoft.com/office/drawing/2016/5/13/chartex" xmlns:cx8="http://schemas.microsoft.com/office/drawing/2016/5/14/chartex" xmlns:mc="http://schemas.openxmlformats.org/markup-compatibility/2006" xmlns:aink="http://schemas.microsoft.com/office/drawing/2016/ink" xmlns:am3d="http://schemas.microsoft.com/office/drawing/2017/model3d" xmlns:o="urn:schemas-microsoft-com:office:office" xmlns:oel="http://schemas.microsoft.com/office/2019/extlst" xmlns:r="http://schemas.openxmlformats.org/officeDocument/2006/relationships" xmlns:m="http://schemas.openxmlformats.org/officeDocument/2006/math" xmlns:v="urn:schemas-microsoft-com:vml" xmlns:wp14="http://schemas.microsoft.com/office/word/2010/wordprocessingDrawing" xmlns:wp="http://schemas.openxmlformats.org/drawingml/2006/wordprocessingDrawing" xmlns:w10="urn:schemas-microsoft-com:office:word" xmlns:w="http://schemas.openxmlformats.org/wordprocessingml/2006/main" xmlns:w14="http://schemas.microsoft.com/office/word/2010/wordml" xmlns:w15="http://schemas.microsoft.com/office/word/2012/wordml" xmlns:w16cex="http://schemas.microsoft.com/office/word/2018/wordml/cex" xmlns:w16cid="http://schemas.microsoft.com/office/word/2016/wordml/cid" xmlns:w16="http://schemas.microsoft.com/office/word/2018/wordml" xmlns:w16du="http://schemas.microsoft.com/office/word/2023/wordml/word16du" xmlns:w16sdtdh="http://schemas.microsoft.com/office/word/2020/wordml/sdtdatahash" xmlns:w16sdtfl="http://schemas.microsoft.com/office/word/2024/wordml/sdtformatlock" xmlns:w16se="http://schemas.microsoft.com/office/word/2015/wordml/symex" xmlns:wpg="http://schemas.microsoft.com/office/word/2010/wordprocessingGroup" xmlns:wpi="http://schemas.microsoft.com/office/word/2010/wordprocessingInk" xmlns:wne="http://schemas.microsoft.com/office/word/2006/wordml" xmlns:wps="http://schemas.microsoft.com/office/word/2010/wordprocessingShape" mc:Ignorable="w14 w15 w16se w16cid w16 w16cex w16sdtdh w16sdtfl w16du wp14">
   <w:footnote w:type="separator" w:id="-1">
     <w:p>
       <w:pPr>
@@ -4330,7 +4757,7 @@
 </file>
 
 <file path=word/header1.xml><?xml version="1.0" encoding="utf-8"?>
-<w:hdr xmlns:wpc="http://schemas.microsoft.com/office/word/2010/wordprocessingCanvas" xmlns:cx="http://schemas.microsoft.com/office/drawing/2014/chartex" xmlns:cx1="http://schemas.microsoft.com/office/drawing/2015/9/8/chartex" xmlns:cx2="http://schemas.microsoft.com/office/drawing/2015/10/21/chartex" xmlns:cx3="http://schemas.microsoft.com/office/drawing/2016/5/9/chartex" xmlns:cx4="http://schemas.microsoft.com/office/drawing/2016/5/10/chartex" xmlns:cx5="http://schemas.microsoft.com/office/drawing/2016/5/11/chartex" xmlns:cx6="http://schemas.microsoft.com/office/drawing/2016/5/12/chartex" xmlns:cx7="http://schemas.microsoft.com/office/drawing/2016/5/13/chartex" xmlns:cx8="http://schemas.microsoft.com/office/drawing/2016/5/14/chartex" xmlns:mc="http://schemas.openxmlformats.org/markup-compatibility/2006" xmlns:aink="http://schemas.microsoft.com/office/drawing/2016/ink" xmlns:am3d="http://schemas.microsoft.com/office/drawing/2017/model3d" xmlns:o="urn:schemas-microsoft-com:office:office" xmlns:r="http://schemas.openxmlformats.org/officeDocument/2006/relationships" xmlns:m="http://schemas.openxmlformats.org/officeDocument/2006/math" xmlns:v="urn:schemas-microsoft-com:vml" xmlns:wp14="http://schemas.microsoft.com/office/word/2010/wordprocessingDrawing" xmlns:wp="http://schemas.openxmlformats.org/drawingml/2006/wordprocessingDrawing" xmlns:w10="urn:schemas-microsoft-com:office:word" xmlns:w="http://schemas.openxmlformats.org/wordprocessingml/2006/main" xmlns:w14="http://schemas.microsoft.com/office/word/2010/wordml" xmlns:w15="http://schemas.microsoft.com/office/word/2012/wordml" xmlns:w16cid="http://schemas.microsoft.com/office/word/2016/wordml/cid" xmlns:w16se="http://schemas.microsoft.com/office/word/2015/wordml/symex" xmlns:wpg="http://schemas.microsoft.com/office/word/2010/wordprocessingGroup" xmlns:wpi="http://schemas.microsoft.com/office/word/2010/wordprocessingInk" xmlns:wne="http://schemas.microsoft.com/office/word/2006/wordml" xmlns:wps="http://schemas.microsoft.com/office/word/2010/wordprocessingShape" mc:Ignorable="w14 w15 w16se w16cid wp14">
+<w:hdr xmlns:wpc="http://schemas.microsoft.com/office/word/2010/wordprocessingCanvas" xmlns:cx="http://schemas.microsoft.com/office/drawing/2014/chartex" xmlns:cx1="http://schemas.microsoft.com/office/drawing/2015/9/8/chartex" xmlns:cx2="http://schemas.microsoft.com/office/drawing/2015/10/21/chartex" xmlns:cx3="http://schemas.microsoft.com/office/drawing/2016/5/9/chartex" xmlns:cx4="http://schemas.microsoft.com/office/drawing/2016/5/10/chartex" xmlns:cx5="http://schemas.microsoft.com/office/drawing/2016/5/11/chartex" xmlns:cx6="http://schemas.microsoft.com/office/drawing/2016/5/12/chartex" xmlns:cx7="http://schemas.microsoft.com/office/drawing/2016/5/13/chartex" xmlns:cx8="http://schemas.microsoft.com/office/drawing/2016/5/14/chartex" xmlns:mc="http://schemas.openxmlformats.org/markup-compatibility/2006" xmlns:aink="http://schemas.microsoft.com/office/drawing/2016/ink" xmlns:am3d="http://schemas.microsoft.com/office/drawing/2017/model3d" xmlns:o="urn:schemas-microsoft-com:office:office" xmlns:oel="http://schemas.microsoft.com/office/2019/extlst" xmlns:r="http://schemas.openxmlformats.org/officeDocument/2006/relationships" xmlns:m="http://schemas.openxmlformats.org/officeDocument/2006/math" xmlns:v="urn:schemas-microsoft-com:vml" xmlns:wp14="http://schemas.microsoft.com/office/word/2010/wordprocessingDrawing" xmlns:wp="http://schemas.openxmlformats.org/drawingml/2006/wordprocessingDrawing" xmlns:w10="urn:schemas-microsoft-com:office:word" xmlns:w="http://schemas.openxmlformats.org/wordprocessingml/2006/main" xmlns:w14="http://schemas.microsoft.com/office/word/2010/wordml" xmlns:w15="http://schemas.microsoft.com/office/word/2012/wordml" xmlns:w16cex="http://schemas.microsoft.com/office/word/2018/wordml/cex" xmlns:w16cid="http://schemas.microsoft.com/office/word/2016/wordml/cid" xmlns:w16="http://schemas.microsoft.com/office/word/2018/wordml" xmlns:w16du="http://schemas.microsoft.com/office/word/2023/wordml/word16du" xmlns:w16sdtdh="http://schemas.microsoft.com/office/word/2020/wordml/sdtdatahash" xmlns:w16sdtfl="http://schemas.microsoft.com/office/word/2024/wordml/sdtformatlock" xmlns:w16se="http://schemas.microsoft.com/office/word/2015/wordml/symex" xmlns:wpg="http://schemas.microsoft.com/office/word/2010/wordprocessingGroup" xmlns:wpi="http://schemas.microsoft.com/office/word/2010/wordprocessingInk" xmlns:wne="http://schemas.microsoft.com/office/word/2006/wordml" xmlns:wps="http://schemas.microsoft.com/office/word/2010/wordprocessingShape" mc:Ignorable="w14 w15 w16se w16cid w16 w16cex w16sdtdh w16sdtfl w16du wp14">
   <w:p>
     <w:pPr>
       <w:pStyle w:val="Header"/>
@@ -4346,7 +4773,7 @@
 </file>
 
 <file path=word/numbering.xml><?xml version="1.0" encoding="utf-8"?>
-<w:numbering xmlns:wpc="http://schemas.microsoft.com/office/word/2010/wordprocessingCanvas" xmlns:cx="http://schemas.microsoft.com/office/drawing/2014/chartex" xmlns:cx1="http://schemas.microsoft.com/office/drawing/2015/9/8/chartex" xmlns:cx2="http://schemas.microsoft.com/office/drawing/2015/10/21/chartex" xmlns:cx3="http://schemas.microsoft.com/office/drawing/2016/5/9/chartex" xmlns:cx4="http://schemas.microsoft.com/office/drawing/2016/5/10/chartex" xmlns:cx5="http://schemas.microsoft.com/office/drawing/2016/5/11/chartex" xmlns:cx6="http://schemas.microsoft.com/office/drawing/2016/5/12/chartex" xmlns:cx7="http://schemas.microsoft.com/office/drawing/2016/5/13/chartex" xmlns:cx8="http://schemas.microsoft.com/office/drawing/2016/5/14/chartex" xmlns:mc="http://schemas.openxmlformats.org/markup-compatibility/2006" xmlns:aink="http://schemas.microsoft.com/office/drawing/2016/ink" xmlns:am3d="http://schemas.microsoft.com/office/drawing/2017/model3d" xmlns:o="urn:schemas-microsoft-com:office:office" xmlns:r="http://schemas.openxmlformats.org/officeDocument/2006/relationships" xmlns:m="http://schemas.openxmlformats.org/officeDocument/2006/math" xmlns:v="urn:schemas-microsoft-com:vml" xmlns:wp14="http://schemas.microsoft.com/office/word/2010/wordprocessingDrawing" xmlns:wp="http://schemas.openxmlformats.org/drawingml/2006/wordprocessingDrawing" xmlns:w10="urn:schemas-microsoft-com:office:word" xmlns:w="http://schemas.openxmlformats.org/wordprocessingml/2006/main" xmlns:w14="http://schemas.microsoft.com/office/word/2010/wordml" xmlns:w15="http://schemas.microsoft.com/office/word/2012/wordml" xmlns:w16cid="http://schemas.microsoft.com/office/word/2016/wordml/cid" xmlns:w16se="http://schemas.microsoft.com/office/word/2015/wordml/symex" xmlns:wpg="http://schemas.microsoft.com/office/word/2010/wordprocessingGroup" xmlns:wpi="http://schemas.microsoft.com/office/word/2010/wordprocessingInk" xmlns:wne="http://schemas.microsoft.com/office/word/2006/wordml" xmlns:wps="http://schemas.microsoft.com/office/word/2010/wordprocessingShape" mc:Ignorable="w14 w15 w16se w16cid wp14">
+<w:numbering xmlns:wpc="http://schemas.microsoft.com/office/word/2010/wordprocessingCanvas" xmlns:cx="http://schemas.microsoft.com/office/drawing/2014/chartex" xmlns:cx1="http://schemas.microsoft.com/office/drawing/2015/9/8/chartex" xmlns:cx2="http://schemas.microsoft.com/office/drawing/2015/10/21/chartex" xmlns:cx3="http://schemas.microsoft.com/office/drawing/2016/5/9/chartex" xmlns:cx4="http://schemas.microsoft.com/office/drawing/2016/5/10/chartex" xmlns:cx5="http://schemas.microsoft.com/office/drawing/2016/5/11/chartex" xmlns:cx6="http://schemas.microsoft.com/office/drawing/2016/5/12/chartex" xmlns:cx7="http://schemas.microsoft.com/office/drawing/2016/5/13/chartex" xmlns:cx8="http://schemas.microsoft.com/office/drawing/2016/5/14/chartex" xmlns:mc="http://schemas.openxmlformats.org/markup-compatibility/2006" xmlns:aink="http://schemas.microsoft.com/office/drawing/2016/ink" xmlns:am3d="http://schemas.microsoft.com/office/drawing/2017/model3d" xmlns:o="urn:schemas-microsoft-com:office:office" xmlns:oel="http://schemas.microsoft.com/office/2019/extlst" xmlns:r="http://schemas.openxmlformats.org/officeDocument/2006/relationships" xmlns:m="http://schemas.openxmlformats.org/officeDocument/2006/math" xmlns:v="urn:schemas-microsoft-com:vml" xmlns:wp14="http://schemas.microsoft.com/office/word/2010/wordprocessingDrawing" xmlns:wp="http://schemas.openxmlformats.org/drawingml/2006/wordprocessingDrawing" xmlns:w10="urn:schemas-microsoft-com:office:word" xmlns:w="http://schemas.openxmlformats.org/wordprocessingml/2006/main" xmlns:w14="http://schemas.microsoft.com/office/word/2010/wordml" xmlns:w15="http://schemas.microsoft.com/office/word/2012/wordml" xmlns:w16cex="http://schemas.microsoft.com/office/word/2018/wordml/cex" xmlns:w16cid="http://schemas.microsoft.com/office/word/2016/wordml/cid" xmlns:w16="http://schemas.microsoft.com/office/word/2018/wordml" xmlns:w16du="http://schemas.microsoft.com/office/word/2023/wordml/word16du" xmlns:w16sdtdh="http://schemas.microsoft.com/office/word/2020/wordml/sdtdatahash" xmlns:w16sdtfl="http://schemas.microsoft.com/office/word/2024/wordml/sdtformatlock" xmlns:w16se="http://schemas.microsoft.com/office/word/2015/wordml/symex" xmlns:wpg="http://schemas.microsoft.com/office/word/2010/wordprocessingGroup" xmlns:wpi="http://schemas.microsoft.com/office/word/2010/wordprocessingInk" xmlns:wne="http://schemas.microsoft.com/office/word/2006/wordml" xmlns:wps="http://schemas.microsoft.com/office/word/2010/wordprocessingShape" mc:Ignorable="w14 w15 w16se w16cid w16 w16cex w16sdtdh w16sdtfl w16du wp14">
   <w:abstractNum w:abstractNumId="0" w15:restartNumberingAfterBreak="0">
     <w:nsid w:val="FFFFFFFB"/>
     <w:multiLevelType w:val="multilevel"/>
@@ -5910,6 +6337,152 @@
     </w:lvl>
   </w:abstractNum>
   <w:abstractNum w:abstractNumId="14" w15:restartNumberingAfterBreak="0">
+    <w:nsid w:val="32AE07C5"/>
+    <w:multiLevelType w:val="multilevel"/>
+    <w:tmpl w:val="5CAA5940"/>
+    <w:lvl w:ilvl="0">
+      <w:start w:val="1"/>
+      <w:numFmt w:val="bullet"/>
+      <w:lvlText w:val=""/>
+      <w:lvlJc w:val="left"/>
+      <w:pPr>
+        <w:tabs>
+          <w:tab w:val="num" w:pos="720"/>
+        </w:tabs>
+        <w:ind w:left="720" w:hanging="360"/>
+      </w:pPr>
+      <w:rPr>
+        <w:rFonts w:ascii="Symbol" w:hAnsi="Symbol" w:hint="default"/>
+        <w:sz w:val="20"/>
+      </w:rPr>
+    </w:lvl>
+    <w:lvl w:ilvl="1">
+      <w:start w:val="1"/>
+      <w:numFmt w:val="decimal"/>
+      <w:lvlText w:val="%2."/>
+      <w:lvlJc w:val="left"/>
+      <w:pPr>
+        <w:ind w:left="1440" w:hanging="360"/>
+      </w:pPr>
+      <w:rPr>
+        <w:rFonts w:hint="default"/>
+        <w:b/>
+      </w:rPr>
+    </w:lvl>
+    <w:lvl w:ilvl="2" w:tentative="1">
+      <w:start w:val="1"/>
+      <w:numFmt w:val="bullet"/>
+      <w:lvlText w:val=""/>
+      <w:lvlJc w:val="left"/>
+      <w:pPr>
+        <w:tabs>
+          <w:tab w:val="num" w:pos="2160"/>
+        </w:tabs>
+        <w:ind w:left="2160" w:hanging="360"/>
+      </w:pPr>
+      <w:rPr>
+        <w:rFonts w:ascii="Wingdings" w:hAnsi="Wingdings" w:hint="default"/>
+        <w:sz w:val="20"/>
+      </w:rPr>
+    </w:lvl>
+    <w:lvl w:ilvl="3" w:tentative="1">
+      <w:start w:val="1"/>
+      <w:numFmt w:val="bullet"/>
+      <w:lvlText w:val=""/>
+      <w:lvlJc w:val="left"/>
+      <w:pPr>
+        <w:tabs>
+          <w:tab w:val="num" w:pos="2880"/>
+        </w:tabs>
+        <w:ind w:left="2880" w:hanging="360"/>
+      </w:pPr>
+      <w:rPr>
+        <w:rFonts w:ascii="Wingdings" w:hAnsi="Wingdings" w:hint="default"/>
+        <w:sz w:val="20"/>
+      </w:rPr>
+    </w:lvl>
+    <w:lvl w:ilvl="4" w:tentative="1">
+      <w:start w:val="1"/>
+      <w:numFmt w:val="bullet"/>
+      <w:lvlText w:val=""/>
+      <w:lvlJc w:val="left"/>
+      <w:pPr>
+        <w:tabs>
+          <w:tab w:val="num" w:pos="3600"/>
+        </w:tabs>
+        <w:ind w:left="3600" w:hanging="360"/>
+      </w:pPr>
+      <w:rPr>
+        <w:rFonts w:ascii="Wingdings" w:hAnsi="Wingdings" w:hint="default"/>
+        <w:sz w:val="20"/>
+      </w:rPr>
+    </w:lvl>
+    <w:lvl w:ilvl="5" w:tentative="1">
+      <w:start w:val="1"/>
+      <w:numFmt w:val="bullet"/>
+      <w:lvlText w:val=""/>
+      <w:lvlJc w:val="left"/>
+      <w:pPr>
+        <w:tabs>
+          <w:tab w:val="num" w:pos="4320"/>
+        </w:tabs>
+        <w:ind w:left="4320" w:hanging="360"/>
+      </w:pPr>
+      <w:rPr>
+        <w:rFonts w:ascii="Wingdings" w:hAnsi="Wingdings" w:hint="default"/>
+        <w:sz w:val="20"/>
+      </w:rPr>
+    </w:lvl>
+    <w:lvl w:ilvl="6" w:tentative="1">
+      <w:start w:val="1"/>
+      <w:numFmt w:val="bullet"/>
+      <w:lvlText w:val=""/>
+      <w:lvlJc w:val="left"/>
+      <w:pPr>
+        <w:tabs>
+          <w:tab w:val="num" w:pos="5040"/>
+        </w:tabs>
+        <w:ind w:left="5040" w:hanging="360"/>
+      </w:pPr>
+      <w:rPr>
+        <w:rFonts w:ascii="Wingdings" w:hAnsi="Wingdings" w:hint="default"/>
+        <w:sz w:val="20"/>
+      </w:rPr>
+    </w:lvl>
+    <w:lvl w:ilvl="7" w:tentative="1">
+      <w:start w:val="1"/>
+      <w:numFmt w:val="bullet"/>
+      <w:lvlText w:val=""/>
+      <w:lvlJc w:val="left"/>
+      <w:pPr>
+        <w:tabs>
+          <w:tab w:val="num" w:pos="5760"/>
+        </w:tabs>
+        <w:ind w:left="5760" w:hanging="360"/>
+      </w:pPr>
+      <w:rPr>
+        <w:rFonts w:ascii="Wingdings" w:hAnsi="Wingdings" w:hint="default"/>
+        <w:sz w:val="20"/>
+      </w:rPr>
+    </w:lvl>
+    <w:lvl w:ilvl="8" w:tentative="1">
+      <w:start w:val="1"/>
+      <w:numFmt w:val="bullet"/>
+      <w:lvlText w:val=""/>
+      <w:lvlJc w:val="left"/>
+      <w:pPr>
+        <w:tabs>
+          <w:tab w:val="num" w:pos="6480"/>
+        </w:tabs>
+        <w:ind w:left="6480" w:hanging="360"/>
+      </w:pPr>
+      <w:rPr>
+        <w:rFonts w:ascii="Wingdings" w:hAnsi="Wingdings" w:hint="default"/>
+        <w:sz w:val="20"/>
+      </w:rPr>
+    </w:lvl>
+  </w:abstractNum>
+  <w:abstractNum w:abstractNumId="15" w15:restartNumberingAfterBreak="0">
     <w:nsid w:val="33113FAE"/>
     <w:multiLevelType w:val="multilevel"/>
     <w:tmpl w:val="5FDAB988"/>
@@ -6025,7 +6598,7 @@
       </w:rPr>
     </w:lvl>
   </w:abstractNum>
-  <w:abstractNum w:abstractNumId="15" w15:restartNumberingAfterBreak="0">
+  <w:abstractNum w:abstractNumId="16" w15:restartNumberingAfterBreak="0">
     <w:nsid w:val="39873310"/>
     <w:multiLevelType w:val="hybridMultilevel"/>
     <w:tmpl w:val="3BA0BB52"/>
@@ -6138,7 +6711,7 @@
       </w:rPr>
     </w:lvl>
   </w:abstractNum>
-  <w:abstractNum w:abstractNumId="16" w15:restartNumberingAfterBreak="0">
+  <w:abstractNum w:abstractNumId="17" w15:restartNumberingAfterBreak="0">
     <w:nsid w:val="41587CC5"/>
     <w:multiLevelType w:val="multilevel"/>
     <w:tmpl w:val="BD725286"/>
@@ -6264,7 +6837,7 @@
       </w:rPr>
     </w:lvl>
   </w:abstractNum>
-  <w:abstractNum w:abstractNumId="17" w15:restartNumberingAfterBreak="0">
+  <w:abstractNum w:abstractNumId="18" w15:restartNumberingAfterBreak="0">
     <w:nsid w:val="41BE5C78"/>
     <w:multiLevelType w:val="hybridMultilevel"/>
     <w:tmpl w:val="68C02714"/>
@@ -6377,7 +6950,97 @@
       </w:rPr>
     </w:lvl>
   </w:abstractNum>
-  <w:abstractNum w:abstractNumId="18" w15:restartNumberingAfterBreak="0">
+  <w:abstractNum w:abstractNumId="19" w15:restartNumberingAfterBreak="0">
+    <w:nsid w:val="445126B6"/>
+    <w:multiLevelType w:val="hybridMultilevel"/>
+    <w:tmpl w:val="F2AE86C0"/>
+    <w:lvl w:ilvl="0" w:tplc="A5984E9A">
+      <w:start w:val="1"/>
+      <w:numFmt w:val="decimal"/>
+      <w:lvlText w:val="%1."/>
+      <w:lvlJc w:val="left"/>
+      <w:pPr>
+        <w:ind w:left="720" w:hanging="360"/>
+      </w:pPr>
+      <w:rPr>
+        <w:rFonts w:hint="default"/>
+        <w:b/>
+      </w:rPr>
+    </w:lvl>
+    <w:lvl w:ilvl="1" w:tplc="04090019" w:tentative="1">
+      <w:start w:val="1"/>
+      <w:numFmt w:val="lowerLetter"/>
+      <w:lvlText w:val="%2."/>
+      <w:lvlJc w:val="left"/>
+      <w:pPr>
+        <w:ind w:left="1440" w:hanging="360"/>
+      </w:pPr>
+    </w:lvl>
+    <w:lvl w:ilvl="2" w:tplc="0409001B" w:tentative="1">
+      <w:start w:val="1"/>
+      <w:numFmt w:val="lowerRoman"/>
+      <w:lvlText w:val="%3."/>
+      <w:lvlJc w:val="right"/>
+      <w:pPr>
+        <w:ind w:left="2160" w:hanging="180"/>
+      </w:pPr>
+    </w:lvl>
+    <w:lvl w:ilvl="3" w:tplc="0409000F" w:tentative="1">
+      <w:start w:val="1"/>
+      <w:numFmt w:val="decimal"/>
+      <w:lvlText w:val="%4."/>
+      <w:lvlJc w:val="left"/>
+      <w:pPr>
+        <w:ind w:left="2880" w:hanging="360"/>
+      </w:pPr>
+    </w:lvl>
+    <w:lvl w:ilvl="4" w:tplc="04090019" w:tentative="1">
+      <w:start w:val="1"/>
+      <w:numFmt w:val="lowerLetter"/>
+      <w:lvlText w:val="%5."/>
+      <w:lvlJc w:val="left"/>
+      <w:pPr>
+        <w:ind w:left="3600" w:hanging="360"/>
+      </w:pPr>
+    </w:lvl>
+    <w:lvl w:ilvl="5" w:tplc="0409001B" w:tentative="1">
+      <w:start w:val="1"/>
+      <w:numFmt w:val="lowerRoman"/>
+      <w:lvlText w:val="%6."/>
+      <w:lvlJc w:val="right"/>
+      <w:pPr>
+        <w:ind w:left="4320" w:hanging="180"/>
+      </w:pPr>
+    </w:lvl>
+    <w:lvl w:ilvl="6" w:tplc="0409000F" w:tentative="1">
+      <w:start w:val="1"/>
+      <w:numFmt w:val="decimal"/>
+      <w:lvlText w:val="%7."/>
+      <w:lvlJc w:val="left"/>
+      <w:pPr>
+        <w:ind w:left="5040" w:hanging="360"/>
+      </w:pPr>
+    </w:lvl>
+    <w:lvl w:ilvl="7" w:tplc="04090019" w:tentative="1">
+      <w:start w:val="1"/>
+      <w:numFmt w:val="lowerLetter"/>
+      <w:lvlText w:val="%8."/>
+      <w:lvlJc w:val="left"/>
+      <w:pPr>
+        <w:ind w:left="5760" w:hanging="360"/>
+      </w:pPr>
+    </w:lvl>
+    <w:lvl w:ilvl="8" w:tplc="0409001B" w:tentative="1">
+      <w:start w:val="1"/>
+      <w:numFmt w:val="lowerRoman"/>
+      <w:lvlText w:val="%9."/>
+      <w:lvlJc w:val="right"/>
+      <w:pPr>
+        <w:ind w:left="6480" w:hanging="180"/>
+      </w:pPr>
+    </w:lvl>
+  </w:abstractNum>
+  <w:abstractNum w:abstractNumId="20" w15:restartNumberingAfterBreak="0">
     <w:nsid w:val="45E5157D"/>
     <w:multiLevelType w:val="hybridMultilevel"/>
     <w:tmpl w:val="4014C62E"/>
@@ -6490,7 +7153,7 @@
       </w:rPr>
     </w:lvl>
   </w:abstractNum>
-  <w:abstractNum w:abstractNumId="19" w15:restartNumberingAfterBreak="0">
+  <w:abstractNum w:abstractNumId="21" w15:restartNumberingAfterBreak="0">
     <w:nsid w:val="4680569E"/>
     <w:multiLevelType w:val="hybridMultilevel"/>
     <w:tmpl w:val="6960DFDC"/>
@@ -6603,7 +7266,7 @@
       </w:rPr>
     </w:lvl>
   </w:abstractNum>
-  <w:abstractNum w:abstractNumId="20" w15:restartNumberingAfterBreak="0">
+  <w:abstractNum w:abstractNumId="22" w15:restartNumberingAfterBreak="0">
     <w:nsid w:val="48610357"/>
     <w:multiLevelType w:val="hybridMultilevel"/>
     <w:tmpl w:val="9EDA8C10"/>
@@ -6716,7 +7379,7 @@
       </w:rPr>
     </w:lvl>
   </w:abstractNum>
-  <w:abstractNum w:abstractNumId="21" w15:restartNumberingAfterBreak="0">
+  <w:abstractNum w:abstractNumId="23" w15:restartNumberingAfterBreak="0">
     <w:nsid w:val="49213227"/>
     <w:multiLevelType w:val="hybridMultilevel"/>
     <w:tmpl w:val="A0F8F516"/>
@@ -6829,7 +7492,7 @@
       </w:rPr>
     </w:lvl>
   </w:abstractNum>
-  <w:abstractNum w:abstractNumId="22" w15:restartNumberingAfterBreak="0">
+  <w:abstractNum w:abstractNumId="24" w15:restartNumberingAfterBreak="0">
     <w:nsid w:val="4DC834EC"/>
     <w:multiLevelType w:val="hybridMultilevel"/>
     <w:tmpl w:val="6180CD3A"/>
@@ -6942,7 +7605,7 @@
       </w:rPr>
     </w:lvl>
   </w:abstractNum>
-  <w:abstractNum w:abstractNumId="23" w15:restartNumberingAfterBreak="0">
+  <w:abstractNum w:abstractNumId="25" w15:restartNumberingAfterBreak="0">
     <w:nsid w:val="4E316E91"/>
     <w:multiLevelType w:val="multilevel"/>
     <w:tmpl w:val="15FA89E6"/>
@@ -7055,7 +7718,7 @@
       </w:rPr>
     </w:lvl>
   </w:abstractNum>
-  <w:abstractNum w:abstractNumId="24" w15:restartNumberingAfterBreak="0">
+  <w:abstractNum w:abstractNumId="26" w15:restartNumberingAfterBreak="0">
     <w:nsid w:val="55BD7809"/>
     <w:multiLevelType w:val="hybridMultilevel"/>
     <w:tmpl w:val="9EDE56CE"/>
@@ -7168,7 +7831,7 @@
       </w:rPr>
     </w:lvl>
   </w:abstractNum>
-  <w:abstractNum w:abstractNumId="25" w15:restartNumberingAfterBreak="0">
+  <w:abstractNum w:abstractNumId="27" w15:restartNumberingAfterBreak="0">
     <w:nsid w:val="55F60E61"/>
     <w:multiLevelType w:val="multilevel"/>
     <w:tmpl w:val="8976E178"/>
@@ -7281,7 +7944,7 @@
       </w:rPr>
     </w:lvl>
   </w:abstractNum>
-  <w:abstractNum w:abstractNumId="26" w15:restartNumberingAfterBreak="0">
+  <w:abstractNum w:abstractNumId="28" w15:restartNumberingAfterBreak="0">
     <w:nsid w:val="582A1673"/>
     <w:multiLevelType w:val="hybridMultilevel"/>
     <w:tmpl w:val="EB747422"/>
@@ -7394,7 +8057,7 @@
       </w:rPr>
     </w:lvl>
   </w:abstractNum>
-  <w:abstractNum w:abstractNumId="27" w15:restartNumberingAfterBreak="0">
+  <w:abstractNum w:abstractNumId="29" w15:restartNumberingAfterBreak="0">
     <w:nsid w:val="5ABF19B2"/>
     <w:multiLevelType w:val="hybridMultilevel"/>
     <w:tmpl w:val="0E90F8A6"/>
@@ -7507,7 +8170,7 @@
       </w:rPr>
     </w:lvl>
   </w:abstractNum>
-  <w:abstractNum w:abstractNumId="28" w15:restartNumberingAfterBreak="0">
+  <w:abstractNum w:abstractNumId="30" w15:restartNumberingAfterBreak="0">
     <w:nsid w:val="5DB94500"/>
     <w:multiLevelType w:val="hybridMultilevel"/>
     <w:tmpl w:val="960CC8CC"/>
@@ -7620,7 +8283,7 @@
       </w:rPr>
     </w:lvl>
   </w:abstractNum>
-  <w:abstractNum w:abstractNumId="29" w15:restartNumberingAfterBreak="0">
+  <w:abstractNum w:abstractNumId="31" w15:restartNumberingAfterBreak="0">
     <w:nsid w:val="606F3C6F"/>
     <w:multiLevelType w:val="hybridMultilevel"/>
     <w:tmpl w:val="3B6622AE"/>
@@ -7733,7 +8396,7 @@
       </w:rPr>
     </w:lvl>
   </w:abstractNum>
-  <w:abstractNum w:abstractNumId="30" w15:restartNumberingAfterBreak="0">
+  <w:abstractNum w:abstractNumId="32" w15:restartNumberingAfterBreak="0">
     <w:nsid w:val="61984664"/>
     <w:multiLevelType w:val="hybridMultilevel"/>
     <w:tmpl w:val="7DC08F1A"/>
@@ -7846,7 +8509,7 @@
       </w:rPr>
     </w:lvl>
   </w:abstractNum>
-  <w:abstractNum w:abstractNumId="31" w15:restartNumberingAfterBreak="0">
+  <w:abstractNum w:abstractNumId="33" w15:restartNumberingAfterBreak="0">
     <w:nsid w:val="66941B4A"/>
     <w:multiLevelType w:val="hybridMultilevel"/>
     <w:tmpl w:val="363C122E"/>
@@ -7959,7 +8622,7 @@
       </w:rPr>
     </w:lvl>
   </w:abstractNum>
-  <w:abstractNum w:abstractNumId="32" w15:restartNumberingAfterBreak="0">
+  <w:abstractNum w:abstractNumId="34" w15:restartNumberingAfterBreak="0">
     <w:nsid w:val="6CE25E90"/>
     <w:multiLevelType w:val="hybridMultilevel"/>
     <w:tmpl w:val="D22A351C"/>
@@ -8072,7 +8735,7 @@
       </w:rPr>
     </w:lvl>
   </w:abstractNum>
-  <w:abstractNum w:abstractNumId="33" w15:restartNumberingAfterBreak="0">
+  <w:abstractNum w:abstractNumId="35" w15:restartNumberingAfterBreak="0">
     <w:nsid w:val="6D2861C6"/>
     <w:multiLevelType w:val="hybridMultilevel"/>
     <w:tmpl w:val="477007F6"/>
@@ -8185,7 +8848,7 @@
       </w:rPr>
     </w:lvl>
   </w:abstractNum>
-  <w:abstractNum w:abstractNumId="34" w15:restartNumberingAfterBreak="0">
+  <w:abstractNum w:abstractNumId="36" w15:restartNumberingAfterBreak="0">
     <w:nsid w:val="70C44C3C"/>
     <w:multiLevelType w:val="multilevel"/>
     <w:tmpl w:val="CA42C960"/>
@@ -8298,7 +8961,7 @@
       </w:rPr>
     </w:lvl>
   </w:abstractNum>
-  <w:abstractNum w:abstractNumId="35" w15:restartNumberingAfterBreak="0">
+  <w:abstractNum w:abstractNumId="37" w15:restartNumberingAfterBreak="0">
     <w:nsid w:val="75B31818"/>
     <w:multiLevelType w:val="hybridMultilevel"/>
     <w:tmpl w:val="F704E0C6"/>
@@ -8411,7 +9074,7 @@
       </w:rPr>
     </w:lvl>
   </w:abstractNum>
-  <w:abstractNum w:abstractNumId="36" w15:restartNumberingAfterBreak="0">
+  <w:abstractNum w:abstractNumId="38" w15:restartNumberingAfterBreak="0">
     <w:nsid w:val="7982359C"/>
     <w:multiLevelType w:val="hybridMultilevel"/>
     <w:tmpl w:val="A4140630"/>
@@ -8524,7 +9187,7 @@
       </w:rPr>
     </w:lvl>
   </w:abstractNum>
-  <w:abstractNum w:abstractNumId="37" w15:restartNumberingAfterBreak="0">
+  <w:abstractNum w:abstractNumId="39" w15:restartNumberingAfterBreak="0">
     <w:nsid w:val="7BFF385D"/>
     <w:multiLevelType w:val="hybridMultilevel"/>
     <w:tmpl w:val="7E5AA64A"/>
@@ -8637,7 +9300,7 @@
       </w:rPr>
     </w:lvl>
   </w:abstractNum>
-  <w:abstractNum w:abstractNumId="38" w15:restartNumberingAfterBreak="0">
+  <w:abstractNum w:abstractNumId="40" w15:restartNumberingAfterBreak="0">
     <w:nsid w:val="7CE5397F"/>
     <w:multiLevelType w:val="hybridMultilevel"/>
     <w:tmpl w:val="EBF6C5FE"/>
@@ -8750,76 +9413,76 @@
       </w:rPr>
     </w:lvl>
   </w:abstractNum>
-  <w:num w:numId="1">
-    <w:abstractNumId w:val="16"/>
+  <w:num w:numId="1" w16cid:durableId="1339310732">
+    <w:abstractNumId w:val="17"/>
   </w:num>
-  <w:num w:numId="2">
+  <w:num w:numId="2" w16cid:durableId="218246000">
     <w:abstractNumId w:val="13"/>
   </w:num>
-  <w:num w:numId="3">
-    <w:abstractNumId w:val="22"/>
+  <w:num w:numId="3" w16cid:durableId="983386077">
+    <w:abstractNumId w:val="24"/>
   </w:num>
-  <w:num w:numId="4">
-    <w:abstractNumId w:val="32"/>
+  <w:num w:numId="4" w16cid:durableId="692804784">
+    <w:abstractNumId w:val="34"/>
   </w:num>
-  <w:num w:numId="5">
+  <w:num w:numId="5" w16cid:durableId="4138971">
     <w:abstractNumId w:val="7"/>
   </w:num>
-  <w:num w:numId="6">
+  <w:num w:numId="6" w16cid:durableId="722171390">
     <w:abstractNumId w:val="4"/>
   </w:num>
-  <w:num w:numId="7">
-    <w:abstractNumId w:val="36"/>
+  <w:num w:numId="7" w16cid:durableId="122308096">
+    <w:abstractNumId w:val="38"/>
   </w:num>
-  <w:num w:numId="8">
-    <w:abstractNumId w:val="14"/>
+  <w:num w:numId="8" w16cid:durableId="369458117">
+    <w:abstractNumId w:val="15"/>
   </w:num>
-  <w:num w:numId="9">
-    <w:abstractNumId w:val="33"/>
-  </w:num>
-  <w:num w:numId="10">
+  <w:num w:numId="9" w16cid:durableId="1644384199">
     <w:abstractNumId w:val="35"/>
   </w:num>
-  <w:num w:numId="11">
-    <w:abstractNumId w:val="23"/>
+  <w:num w:numId="10" w16cid:durableId="107356423">
+    <w:abstractNumId w:val="37"/>
   </w:num>
-  <w:num w:numId="12">
-    <w:abstractNumId w:val="18"/>
+  <w:num w:numId="11" w16cid:durableId="1054350814">
+    <w:abstractNumId w:val="25"/>
   </w:num>
-  <w:num w:numId="13">
+  <w:num w:numId="12" w16cid:durableId="1858082683">
+    <w:abstractNumId w:val="20"/>
+  </w:num>
+  <w:num w:numId="13" w16cid:durableId="1224289543">
     <w:abstractNumId w:val="0"/>
   </w:num>
-  <w:num w:numId="14">
+  <w:num w:numId="14" w16cid:durableId="180046357">
     <w:abstractNumId w:val="2"/>
   </w:num>
-  <w:num w:numId="15">
+  <w:num w:numId="15" w16cid:durableId="2066677766">
     <w:abstractNumId w:val="0"/>
     <w:lvlOverride w:ilvl="0">
       <w:startOverride w:val="1"/>
     </w:lvlOverride>
   </w:num>
-  <w:num w:numId="16">
+  <w:num w:numId="16" w16cid:durableId="636641708">
     <w:abstractNumId w:val="5"/>
   </w:num>
-  <w:num w:numId="17">
+  <w:num w:numId="17" w16cid:durableId="1624186434">
     <w:abstractNumId w:val="12"/>
   </w:num>
-  <w:num w:numId="18">
-    <w:abstractNumId w:val="24"/>
+  <w:num w:numId="18" w16cid:durableId="1442068349">
+    <w:abstractNumId w:val="26"/>
   </w:num>
-  <w:num w:numId="19">
+  <w:num w:numId="19" w16cid:durableId="2116553352">
     <w:abstractNumId w:val="10"/>
   </w:num>
-  <w:num w:numId="20">
-    <w:abstractNumId w:val="27"/>
+  <w:num w:numId="20" w16cid:durableId="1881748383">
+    <w:abstractNumId w:val="29"/>
   </w:num>
-  <w:num w:numId="21">
+  <w:num w:numId="21" w16cid:durableId="39864357">
     <w:abstractNumId w:val="1"/>
   </w:num>
-  <w:num w:numId="22">
+  <w:num w:numId="22" w16cid:durableId="203715917">
     <w:abstractNumId w:val="11"/>
   </w:num>
-  <w:num w:numId="23">
+  <w:num w:numId="23" w16cid:durableId="1434352837">
     <w:abstractNumId w:val="0"/>
     <w:lvlOverride w:ilvl="0">
       <w:startOverride w:val="3"/>
@@ -8828,40 +9491,40 @@
       <w:startOverride w:val="2"/>
     </w:lvlOverride>
   </w:num>
-  <w:num w:numId="24">
+  <w:num w:numId="24" w16cid:durableId="196356280">
     <w:abstractNumId w:val="9"/>
   </w:num>
-  <w:num w:numId="25">
-    <w:abstractNumId w:val="28"/>
+  <w:num w:numId="25" w16cid:durableId="1255749012">
+    <w:abstractNumId w:val="30"/>
   </w:num>
-  <w:num w:numId="26">
-    <w:abstractNumId w:val="15"/>
+  <w:num w:numId="26" w16cid:durableId="1003122445">
+    <w:abstractNumId w:val="16"/>
   </w:num>
-  <w:num w:numId="27">
-    <w:abstractNumId w:val="19"/>
+  <w:num w:numId="27" w16cid:durableId="1844052940">
+    <w:abstractNumId w:val="21"/>
   </w:num>
-  <w:num w:numId="28">
+  <w:num w:numId="28" w16cid:durableId="2101363430">
     <w:abstractNumId w:val="6"/>
   </w:num>
-  <w:num w:numId="29">
-    <w:abstractNumId w:val="29"/>
+  <w:num w:numId="29" w16cid:durableId="1960260979">
+    <w:abstractNumId w:val="31"/>
   </w:num>
-  <w:num w:numId="30">
+  <w:num w:numId="30" w16cid:durableId="1124809770">
     <w:abstractNumId w:val="3"/>
   </w:num>
-  <w:num w:numId="31">
-    <w:abstractNumId w:val="20"/>
+  <w:num w:numId="31" w16cid:durableId="1337995966">
+    <w:abstractNumId w:val="22"/>
   </w:num>
-  <w:num w:numId="32">
-    <w:abstractNumId w:val="37"/>
+  <w:num w:numId="32" w16cid:durableId="1018770273">
+    <w:abstractNumId w:val="39"/>
   </w:num>
-  <w:num w:numId="33">
-    <w:abstractNumId w:val="31"/>
+  <w:num w:numId="33" w16cid:durableId="1722090778">
+    <w:abstractNumId w:val="33"/>
   </w:num>
-  <w:num w:numId="34">
-    <w:abstractNumId w:val="17"/>
+  <w:num w:numId="34" w16cid:durableId="1243830394">
+    <w:abstractNumId w:val="18"/>
   </w:num>
-  <w:num w:numId="35">
+  <w:num w:numId="35" w16cid:durableId="1823890099">
     <w:abstractNumId w:val="0"/>
     <w:lvlOverride w:ilvl="0">
       <w:startOverride w:val="3"/>
@@ -8870,19 +9533,19 @@
       <w:startOverride w:val="2"/>
     </w:lvlOverride>
   </w:num>
-  <w:num w:numId="36">
+  <w:num w:numId="36" w16cid:durableId="1166869426">
     <w:abstractNumId w:val="0"/>
     <w:lvlOverride w:ilvl="0">
       <w:startOverride w:val="4"/>
     </w:lvlOverride>
   </w:num>
-  <w:num w:numId="37">
+  <w:num w:numId="37" w16cid:durableId="1780565">
     <w:abstractNumId w:val="0"/>
     <w:lvlOverride w:ilvl="0">
       <w:startOverride w:val="4"/>
     </w:lvlOverride>
   </w:num>
-  <w:num w:numId="38">
+  <w:num w:numId="38" w16cid:durableId="1573613664">
     <w:abstractNumId w:val="0"/>
     <w:lvlOverride w:ilvl="0">
       <w:startOverride w:val="5"/>
@@ -8891,38 +9554,44 @@
       <w:startOverride w:val="2"/>
     </w:lvlOverride>
   </w:num>
-  <w:num w:numId="39">
+  <w:num w:numId="39" w16cid:durableId="1794472049">
     <w:abstractNumId w:val="0"/>
     <w:lvlOverride w:ilvl="0">
       <w:startOverride w:val="4"/>
     </w:lvlOverride>
   </w:num>
-  <w:num w:numId="40">
-    <w:abstractNumId w:val="34"/>
+  <w:num w:numId="40" w16cid:durableId="1834300649">
+    <w:abstractNumId w:val="36"/>
   </w:num>
-  <w:num w:numId="41">
-    <w:abstractNumId w:val="25"/>
+  <w:num w:numId="41" w16cid:durableId="1165390547">
+    <w:abstractNumId w:val="27"/>
   </w:num>
-  <w:num w:numId="42">
-    <w:abstractNumId w:val="38"/>
+  <w:num w:numId="42" w16cid:durableId="1243444607">
+    <w:abstractNumId w:val="40"/>
   </w:num>
-  <w:num w:numId="43">
-    <w:abstractNumId w:val="30"/>
+  <w:num w:numId="43" w16cid:durableId="896666750">
+    <w:abstractNumId w:val="32"/>
   </w:num>
-  <w:num w:numId="44">
-    <w:abstractNumId w:val="26"/>
+  <w:num w:numId="44" w16cid:durableId="661394888">
+    <w:abstractNumId w:val="28"/>
   </w:num>
-  <w:num w:numId="45">
-    <w:abstractNumId w:val="21"/>
+  <w:num w:numId="45" w16cid:durableId="2106144052">
+    <w:abstractNumId w:val="23"/>
   </w:num>
-  <w:num w:numId="46">
+  <w:num w:numId="46" w16cid:durableId="1673756472">
     <w:abstractNumId w:val="8"/>
+  </w:num>
+  <w:num w:numId="47" w16cid:durableId="1093360570">
+    <w:abstractNumId w:val="14"/>
+  </w:num>
+  <w:num w:numId="48" w16cid:durableId="1581062116">
+    <w:abstractNumId w:val="19"/>
   </w:num>
 </w:numbering>
 </file>
 
 <file path=word/styles.xml><?xml version="1.0" encoding="utf-8"?>
-<w:styles xmlns:mc="http://schemas.openxmlformats.org/markup-compatibility/2006" xmlns:r="http://schemas.openxmlformats.org/officeDocument/2006/relationships" xmlns:w="http://schemas.openxmlformats.org/wordprocessingml/2006/main" xmlns:w14="http://schemas.microsoft.com/office/word/2010/wordml" xmlns:w15="http://schemas.microsoft.com/office/word/2012/wordml" xmlns:w16cid="http://schemas.microsoft.com/office/word/2016/wordml/cid" xmlns:w16se="http://schemas.microsoft.com/office/word/2015/wordml/symex" mc:Ignorable="w14 w15 w16se w16cid">
+<w:styles xmlns:mc="http://schemas.openxmlformats.org/markup-compatibility/2006" xmlns:r="http://schemas.openxmlformats.org/officeDocument/2006/relationships" xmlns:w="http://schemas.openxmlformats.org/wordprocessingml/2006/main" xmlns:w14="http://schemas.microsoft.com/office/word/2010/wordml" xmlns:w15="http://schemas.microsoft.com/office/word/2012/wordml" xmlns:w16cex="http://schemas.microsoft.com/office/word/2018/wordml/cex" xmlns:w16cid="http://schemas.microsoft.com/office/word/2016/wordml/cid" xmlns:w16="http://schemas.microsoft.com/office/word/2018/wordml" xmlns:w16du="http://schemas.microsoft.com/office/word/2023/wordml/word16du" xmlns:w16sdtdh="http://schemas.microsoft.com/office/word/2020/wordml/sdtdatahash" xmlns:w16sdtfl="http://schemas.microsoft.com/office/word/2024/wordml/sdtformatlock" xmlns:w16se="http://schemas.microsoft.com/office/word/2015/wordml/symex" mc:Ignorable="w14 w15 w16se w16cid w16 w16cex w16sdtdh w16sdtfl w16du">
   <w:docDefaults>
     <w:rPrDefault>
       <w:rPr>
@@ -8938,7 +9607,7 @@
       </w:pPr>
     </w:pPrDefault>
   </w:docDefaults>
-  <w:latentStyles w:defLockedState="0" w:defUIPriority="99" w:defSemiHidden="0" w:defUnhideWhenUsed="0" w:defQFormat="0" w:count="375">
+  <w:latentStyles w:defLockedState="0" w:defUIPriority="99" w:defSemiHidden="0" w:defUnhideWhenUsed="0" w:defQFormat="0" w:count="376">
     <w:lsdException w:name="Normal" w:uiPriority="0" w:qFormat="1"/>
     <w:lsdException w:name="heading 1" w:uiPriority="0" w:qFormat="1"/>
     <w:lsdException w:name="heading 2" w:semiHidden="1" w:uiPriority="0" w:unhideWhenUsed="1" w:qFormat="1"/>
@@ -9314,6 +9983,7 @@
     <w:lsdException w:name="Smart Hyperlink" w:semiHidden="1" w:unhideWhenUsed="1"/>
     <w:lsdException w:name="Hashtag" w:semiHidden="1" w:unhideWhenUsed="1"/>
     <w:lsdException w:name="Unresolved Mention" w:semiHidden="1" w:unhideWhenUsed="1"/>
+    <w:lsdException w:name="Smart Link" w:semiHidden="1" w:unhideWhenUsed="1"/>
   </w:latentStyles>
   <w:style w:type="paragraph" w:default="1" w:styleId="Normal">
     <w:name w:val="Normal"/>
@@ -10001,6 +10671,20 @@
       <w:u w:val="single"/>
     </w:rPr>
   </w:style>
+  <w:style w:type="paragraph" w:customStyle="1" w:styleId="font-claude-response-body">
+    <w:name w:val="font-claude-response-body"/>
+    <w:basedOn w:val="Normal"/>
+    <w:rsid w:val="00FB14CB"/>
+    <w:pPr>
+      <w:spacing w:before="100" w:beforeAutospacing="1" w:after="100" w:afterAutospacing="1" w:line="240" w:lineRule="auto"/>
+    </w:pPr>
+    <w:rPr>
+      <w:rFonts w:ascii="Times New Roman" w:eastAsia="Times New Roman" w:hAnsi="Times New Roman" w:cs="Times New Roman"/>
+      <w:sz w:val="24"/>
+      <w:szCs w:val="24"/>
+      <w:lang w:eastAsia="en-US"/>
+    </w:rPr>
+  </w:style>
 </w:styles>
 </file>
 
@@ -10317,6 +11001,15 @@
 </file>
 
 <file path=customXml/item1.xml><?xml version="1.0" encoding="utf-8"?>
+<?mso-contentType ?>
+<FormTemplates xmlns="http://schemas.microsoft.com/sharepoint/v3/contenttype/forms">
+  <Display>DocumentLibraryForm</Display>
+  <Edit>DocumentLibraryForm</Edit>
+  <New>DocumentLibraryForm</New>
+</FormTemplates>
+</file>
+
+<file path=customXml/item2.xml><?xml version="1.0" encoding="utf-8"?>
 <ct:contentTypeSchema xmlns:ct="http://schemas.microsoft.com/office/2006/metadata/contentType" xmlns:ma="http://schemas.microsoft.com/office/2006/metadata/properties/metaAttributes" ct:_="" ma:_="" ma:contentTypeName="Document" ma:contentTypeID="0x0101000130A8883D509741AAD9698FAF47E5F3" ma:contentTypeVersion="3" ma:contentTypeDescription="Create a new document." ma:contentTypeScope="" ma:versionID="ff89cdacd3a61eed31ca6cf071b8b226">
   <xsd:schema xmlns:xsd="http://www.w3.org/2001/XMLSchema" xmlns:xs="http://www.w3.org/2001/XMLSchema" xmlns:p="http://schemas.microsoft.com/office/2006/metadata/properties" xmlns:ns2="9c9eb58d-2f4c-499b-ab9c-47c1d5de8bf8" targetNamespace="http://schemas.microsoft.com/office/2006/metadata/properties" ma:root="true" ma:fieldsID="c7d838d636f2945413649be92e4efa58" ns2:_="">
     <xsd:import namespace="9c9eb58d-2f4c-499b-ab9c-47c1d5de8bf8"/>
@@ -10454,15 +11147,6 @@
 </ct:contentTypeSchema>
 </file>
 
-<file path=customXml/item2.xml><?xml version="1.0" encoding="utf-8"?>
-<?mso-contentType ?>
-<FormTemplates xmlns="http://schemas.microsoft.com/sharepoint/v3/contenttype/forms">
-  <Display>DocumentLibraryForm</Display>
-  <Edit>DocumentLibraryForm</Edit>
-  <New>DocumentLibraryForm</New>
-</FormTemplates>
-</file>
-
 <file path=customXml/item3.xml><?xml version="1.0" encoding="utf-8"?>
 <p:properties xmlns:p="http://schemas.microsoft.com/office/2006/metadata/properties" xmlns:xsi="http://www.w3.org/2001/XMLSchema-instance" xmlns:pc="http://schemas.microsoft.com/office/infopath/2007/PartnerControls">
   <documentManagement/>
@@ -10470,6 +11154,14 @@
 </file>
 
 <file path=customXml/itemProps1.xml><?xml version="1.0" encoding="utf-8"?>
+<ds:datastoreItem xmlns:ds="http://schemas.openxmlformats.org/officeDocument/2006/customXml" ds:itemID="{A135D9E7-1404-42E6-8FA3-EFBD12F05B34}">
+  <ds:schemaRefs>
+    <ds:schemaRef ds:uri="http://schemas.microsoft.com/sharepoint/v3/contenttype/forms"/>
+  </ds:schemaRefs>
+</ds:datastoreItem>
+</file>
+
+<file path=customXml/itemProps2.xml><?xml version="1.0" encoding="utf-8"?>
 <ds:datastoreItem xmlns:ds="http://schemas.openxmlformats.org/officeDocument/2006/customXml" ds:itemID="{0434414E-15C3-4A9C-92D7-BEEEE9D04DCA}">
   <ds:schemaRefs>
     <ds:schemaRef ds:uri="http://schemas.microsoft.com/office/2006/metadata/contentType"/>
@@ -10487,14 +11179,6 @@
 </ds:datastoreItem>
 </file>
 
-<file path=customXml/itemProps2.xml><?xml version="1.0" encoding="utf-8"?>
-<ds:datastoreItem xmlns:ds="http://schemas.openxmlformats.org/officeDocument/2006/customXml" ds:itemID="{A135D9E7-1404-42E6-8FA3-EFBD12F05B34}">
-  <ds:schemaRefs>
-    <ds:schemaRef ds:uri="http://schemas.microsoft.com/sharepoint/v3/contenttype/forms"/>
-  </ds:schemaRefs>
-</ds:datastoreItem>
-</file>
-
 <file path=customXml/itemProps3.xml><?xml version="1.0" encoding="utf-8"?>
 <ds:datastoreItem xmlns:ds="http://schemas.openxmlformats.org/officeDocument/2006/customXml" ds:itemID="{5A8653E7-73B2-4237-9113-6302E7D224CB}">
   <ds:schemaRefs>

</xml_diff>